<commit_message>
avance con la memoria
</commit_message>
<xml_diff>
--- a/Memoria/Memoria.docx
+++ b/Memoria/Memoria.docx
@@ -33,7 +33,7 @@
                     <pic:cNvPicPr/>
                   </pic:nvPicPr>
                   <pic:blipFill>
-                    <a:blip r:embed="rId7" cstate="print"/>
+                    <a:blip r:embed="rId8" cstate="print"/>
                     <a:stretch>
                       <a:fillRect/>
                     </a:stretch>
@@ -263,46 +263,6 @@
     <w:p>
       <w:pPr>
         <w:pStyle w:val="Textoindependiente"/>
-        <w:rPr>
-          <w:sz w:val="40"/>
-        </w:rPr>
-      </w:pPr>
-    </w:p>
-    <w:p>
-      <w:pPr>
-        <w:pStyle w:val="Textoindependiente"/>
-        <w:rPr>
-          <w:sz w:val="40"/>
-        </w:rPr>
-      </w:pPr>
-    </w:p>
-    <w:p>
-      <w:pPr>
-        <w:pStyle w:val="Textoindependiente"/>
-        <w:rPr>
-          <w:sz w:val="40"/>
-        </w:rPr>
-      </w:pPr>
-    </w:p>
-    <w:p>
-      <w:pPr>
-        <w:pStyle w:val="Textoindependiente"/>
-        <w:rPr>
-          <w:sz w:val="40"/>
-        </w:rPr>
-      </w:pPr>
-    </w:p>
-    <w:p>
-      <w:pPr>
-        <w:pStyle w:val="Textoindependiente"/>
-        <w:rPr>
-          <w:sz w:val="40"/>
-        </w:rPr>
-      </w:pPr>
-    </w:p>
-    <w:p>
-      <w:pPr>
-        <w:pStyle w:val="Textoindependiente"/>
         <w:spacing w:before="457"/>
         <w:rPr>
           <w:sz w:val="40"/>
@@ -418,7 +378,6 @@
           <w:noProof/>
           <w:sz w:val="20"/>
         </w:rPr>
-        <w:lastRenderedPageBreak/>
         <w:drawing>
           <wp:inline distT="0" distB="0" distL="0" distR="0" wp14:anchorId="48D22A31" wp14:editId="7E548581">
             <wp:extent cx="2673431" cy="1036129"/>
@@ -435,7 +394,7 @@
                     <pic:cNvPicPr/>
                   </pic:nvPicPr>
                   <pic:blipFill>
-                    <a:blip r:embed="rId7" cstate="print"/>
+                    <a:blip r:embed="rId8" cstate="print"/>
                     <a:stretch>
                       <a:fillRect/>
                     </a:stretch>
@@ -665,46 +624,6 @@
     <w:p>
       <w:pPr>
         <w:pStyle w:val="Textoindependiente"/>
-        <w:rPr>
-          <w:sz w:val="40"/>
-        </w:rPr>
-      </w:pPr>
-    </w:p>
-    <w:p>
-      <w:pPr>
-        <w:pStyle w:val="Textoindependiente"/>
-        <w:rPr>
-          <w:sz w:val="40"/>
-        </w:rPr>
-      </w:pPr>
-    </w:p>
-    <w:p>
-      <w:pPr>
-        <w:pStyle w:val="Textoindependiente"/>
-        <w:rPr>
-          <w:sz w:val="40"/>
-        </w:rPr>
-      </w:pPr>
-    </w:p>
-    <w:p>
-      <w:pPr>
-        <w:pStyle w:val="Textoindependiente"/>
-        <w:rPr>
-          <w:sz w:val="40"/>
-        </w:rPr>
-      </w:pPr>
-    </w:p>
-    <w:p>
-      <w:pPr>
-        <w:pStyle w:val="Textoindependiente"/>
-        <w:rPr>
-          <w:sz w:val="40"/>
-        </w:rPr>
-      </w:pPr>
-    </w:p>
-    <w:p>
-      <w:pPr>
-        <w:pStyle w:val="Textoindependiente"/>
         <w:spacing w:before="457"/>
         <w:rPr>
           <w:sz w:val="40"/>
@@ -902,12 +821,11 @@
         <w:t>6</w:t>
       </w:r>
     </w:p>
-    <w:p/>
     <w:p>
       <w:pPr>
         <w:sectPr>
-          <w:headerReference w:type="default" r:id="rId8"/>
-          <w:footerReference w:type="default" r:id="rId9"/>
+          <w:headerReference w:type="default" r:id="rId9"/>
+          <w:footerReference w:type="default" r:id="rId10"/>
           <w:pgSz w:w="11906" w:h="16838"/>
           <w:pgMar w:top="601" w:right="1134" w:bottom="278" w:left="851" w:header="709" w:footer="709" w:gutter="0"/>
           <w:pgNumType w:fmt="lowerRoman"/>
@@ -926,21 +844,17 @@
         <w:spacing w:before="240" w:line="300" w:lineRule="exact"/>
         <w:jc w:val="both"/>
         <w:rPr>
-          <w:rFonts w:ascii="Calibri" w:eastAsiaTheme="minorEastAsia" w:hAnsi="Calibri" w:cs="Calibri"/>
+          <w:rFonts w:ascii="Calibri" w:hAnsi="Calibri" w:cs="Calibri"/>
           <w:b/>
-          <w:color w:val="5A5A5A" w:themeColor="text1" w:themeTint="A5"/>
           <w:sz w:val="24"/>
-          <w:szCs w:val="22"/>
           <w:lang w:val="es-ES_tradnl" w:eastAsia="es-ES"/>
         </w:rPr>
       </w:pPr>
       <w:r>
         <w:rPr>
-          <w:rFonts w:ascii="Calibri" w:eastAsiaTheme="minorEastAsia" w:hAnsi="Calibri" w:cs="Calibri"/>
+          <w:rFonts w:ascii="Calibri" w:hAnsi="Calibri" w:cs="Calibri"/>
           <w:b/>
-          <w:color w:val="5A5A5A" w:themeColor="text1" w:themeTint="A5"/>
           <w:sz w:val="24"/>
-          <w:szCs w:val="22"/>
           <w:lang w:val="es-ES_tradnl" w:eastAsia="es-ES"/>
         </w:rPr>
         <w:lastRenderedPageBreak/>
@@ -956,8 +870,6 @@
           <w:rFonts w:ascii="Calibri" w:eastAsia="Arial MT" w:hAnsi="Calibri" w:cs="Calibri"/>
           <w:color w:val="auto"/>
           <w:spacing w:val="0"/>
-          <w:sz w:val="22"/>
-          <w:szCs w:val="22"/>
         </w:rPr>
       </w:pPr>
       <w:r>
@@ -965,8 +877,6 @@
           <w:rFonts w:ascii="Calibri" w:eastAsia="Arial MT" w:hAnsi="Calibri" w:cs="Calibri"/>
           <w:color w:val="auto"/>
           <w:spacing w:val="0"/>
-          <w:sz w:val="22"/>
-          <w:szCs w:val="22"/>
         </w:rPr>
         <w:t xml:space="preserve">Este trabajo presenta el diseño y desarrollo de un videojuego de carreras de coches en Unity que integra generación procedural de circuitos y técnicas de aprendizaje por refuerzo para la inteligencia artificial. El sistema de generación procedural permite crear pistas de forma automática mediante un algoritmo por fases: una primera fase de generación aleatoria controlada por reglas de variedad y un sistema de ocupación espacial por </w:t>
       </w:r>
@@ -976,8 +886,6 @@
           <w:rFonts w:ascii="Calibri" w:eastAsia="Arial MT" w:hAnsi="Calibri" w:cs="Calibri"/>
           <w:color w:val="auto"/>
           <w:spacing w:val="0"/>
-          <w:sz w:val="22"/>
-          <w:szCs w:val="22"/>
         </w:rPr>
         <w:t>grid</w:t>
       </w:r>
@@ -987,8 +895,6 @@
           <w:rFonts w:ascii="Calibri" w:eastAsia="Arial MT" w:hAnsi="Calibri" w:cs="Calibri"/>
           <w:color w:val="auto"/>
           <w:spacing w:val="0"/>
-          <w:sz w:val="22"/>
-          <w:szCs w:val="22"/>
         </w:rPr>
         <w:t xml:space="preserve">, y una segunda fase de cierre del circuito que garantiza que la pista forme un bucle válido. De este modo se asegura que cada circuito sea diferente, evitando la repetitividad y aumentando la </w:t>
       </w:r>
@@ -998,8 +904,6 @@
           <w:rFonts w:ascii="Calibri" w:eastAsia="Arial MT" w:hAnsi="Calibri" w:cs="Calibri"/>
           <w:color w:val="auto"/>
           <w:spacing w:val="0"/>
-          <w:sz w:val="22"/>
-          <w:szCs w:val="22"/>
         </w:rPr>
         <w:t>rejugabilidad</w:t>
       </w:r>
@@ -1009,8 +913,6 @@
           <w:rFonts w:ascii="Calibri" w:eastAsia="Arial MT" w:hAnsi="Calibri" w:cs="Calibri"/>
           <w:color w:val="auto"/>
           <w:spacing w:val="0"/>
-          <w:sz w:val="22"/>
-          <w:szCs w:val="22"/>
         </w:rPr>
         <w:t xml:space="preserve"> y la sensación de novedad en cada partida.</w:t>
       </w:r>
@@ -1024,8 +926,6 @@
           <w:rFonts w:ascii="Calibri" w:eastAsia="Arial MT" w:hAnsi="Calibri" w:cs="Calibri"/>
           <w:color w:val="auto"/>
           <w:spacing w:val="0"/>
-          <w:sz w:val="22"/>
-          <w:szCs w:val="22"/>
         </w:rPr>
       </w:pPr>
       <w:r>
@@ -1033,8 +933,6 @@
           <w:rFonts w:ascii="Calibri" w:eastAsia="Arial MT" w:hAnsi="Calibri" w:cs="Calibri"/>
           <w:color w:val="auto"/>
           <w:spacing w:val="0"/>
-          <w:sz w:val="22"/>
-          <w:szCs w:val="22"/>
         </w:rPr>
         <w:t>Los vehículos controlados por inteligencia artificial han sido entrenados mediante la librería ML-</w:t>
       </w:r>
@@ -1044,8 +942,6 @@
           <w:rFonts w:ascii="Calibri" w:eastAsia="Arial MT" w:hAnsi="Calibri" w:cs="Calibri"/>
           <w:color w:val="auto"/>
           <w:spacing w:val="0"/>
-          <w:sz w:val="22"/>
-          <w:szCs w:val="22"/>
         </w:rPr>
         <w:t>Agents</w:t>
       </w:r>
@@ -1055,8 +951,6 @@
           <w:rFonts w:ascii="Calibri" w:eastAsia="Arial MT" w:hAnsi="Calibri" w:cs="Calibri"/>
           <w:color w:val="auto"/>
           <w:spacing w:val="0"/>
-          <w:sz w:val="22"/>
-          <w:szCs w:val="22"/>
         </w:rPr>
         <w:t xml:space="preserve"> de Unity, utilizando el algoritmo de aprendizaje por refuerzo para aprender a recorrer correctamente los circuitos generados dinámicamente. Gracias a este enfoque, los agentes son capaces de adaptarse a configuraciones de pista no vistas previamente, manteniendo un comportamiento competitivo. El entrenamiento se llevó a cabo sobre un conjunto de circuitos guardados, rotando entre ellos de forma automática para favorecer la generalización del agente.</w:t>
       </w:r>
@@ -1074,8 +968,6 @@
           <w:rFonts w:ascii="Calibri" w:eastAsia="Arial MT" w:hAnsi="Calibri" w:cs="Calibri"/>
           <w:color w:val="auto"/>
           <w:spacing w:val="0"/>
-          <w:sz w:val="22"/>
-          <w:szCs w:val="22"/>
         </w:rPr>
       </w:pPr>
       <w:r>
@@ -1083,8 +975,6 @@
           <w:rFonts w:ascii="Calibri" w:eastAsia="Arial MT" w:hAnsi="Calibri" w:cs="Calibri"/>
           <w:color w:val="auto"/>
           <w:spacing w:val="0"/>
-          <w:sz w:val="22"/>
-          <w:szCs w:val="22"/>
         </w:rPr>
         <w:t xml:space="preserve">Además, el videojuego un sistema de </w:t>
       </w:r>
@@ -1094,8 +984,6 @@
           <w:rFonts w:ascii="Calibri" w:eastAsia="Arial MT" w:hAnsi="Calibri" w:cs="Calibri"/>
           <w:color w:val="auto"/>
           <w:spacing w:val="0"/>
-          <w:sz w:val="22"/>
-          <w:szCs w:val="22"/>
         </w:rPr>
         <w:t>checkpoints</w:t>
       </w:r>
@@ -1105,8 +993,6 @@
           <w:rFonts w:ascii="Calibri" w:eastAsia="Arial MT" w:hAnsi="Calibri" w:cs="Calibri"/>
           <w:color w:val="auto"/>
           <w:spacing w:val="0"/>
-          <w:sz w:val="22"/>
-          <w:szCs w:val="22"/>
         </w:rPr>
         <w:t xml:space="preserve"> que guía al agente a lo largo del circuito, ofreciendo recompensas parciales que orientan el aprendizaje. El resultado es un sistema flexible que combina generación procedural y aprendizaje automático para mejorar la experiencia de juego y fomentar la motivación y el desafío continuo del jugador.</w:t>
       </w:r>
@@ -1127,11 +1013,9 @@
       </w:pPr>
       <w:r>
         <w:rPr>
-          <w:rFonts w:ascii="Calibri" w:eastAsiaTheme="minorEastAsia" w:hAnsi="Calibri" w:cs="Calibri"/>
+          <w:rFonts w:ascii="Calibri" w:hAnsi="Calibri" w:cs="Calibri"/>
           <w:b/>
-          <w:color w:val="5A5A5A" w:themeColor="text1" w:themeTint="A5"/>
           <w:sz w:val="24"/>
-          <w:szCs w:val="22"/>
           <w:lang w:val="es-ES_tradnl" w:eastAsia="es-ES"/>
         </w:rPr>
         <w:t>Descriptores</w:t>
@@ -1264,76 +1148,11 @@
     <w:p/>
     <w:p/>
     <w:p/>
-    <w:p/>
-    <w:p/>
-    <w:p/>
-    <w:p/>
-    <w:p/>
-    <w:p/>
-    <w:p/>
-    <w:p/>
-    <w:p/>
-    <w:p/>
-    <w:p/>
-    <w:p/>
-    <w:p/>
-    <w:p/>
-    <w:p/>
-    <w:p/>
-    <w:p/>
-    <w:p/>
-    <w:p/>
-    <w:p/>
-    <w:p/>
-    <w:p/>
-    <w:p/>
-    <w:p/>
-    <w:p/>
-    <w:p/>
-    <w:p/>
-    <w:p/>
-    <w:p/>
-    <w:p/>
-    <w:p/>
-    <w:p/>
-    <w:p/>
-    <w:p/>
-    <w:p/>
-    <w:p/>
-    <w:p/>
-    <w:p/>
-    <w:p/>
-    <w:p/>
-    <w:p/>
-    <w:p/>
-    <w:p/>
-    <w:p/>
-    <w:p/>
-    <w:p/>
-    <w:p/>
-    <w:p/>
-    <w:p/>
-    <w:p/>
-    <w:p/>
-    <w:p/>
-    <w:p/>
-    <w:p/>
-    <w:p/>
-    <w:p/>
-    <w:p/>
-    <w:p/>
-    <w:p/>
-    <w:p/>
-    <w:p/>
-    <w:p/>
-    <w:p/>
-    <w:p/>
-    <w:p/>
     <w:p>
       <w:pPr>
         <w:sectPr>
-          <w:headerReference w:type="default" r:id="rId10"/>
-          <w:footerReference w:type="default" r:id="rId11"/>
+          <w:headerReference w:type="default" r:id="rId11"/>
+          <w:footerReference w:type="default" r:id="rId12"/>
           <w:pgSz w:w="11906" w:h="16838"/>
           <w:pgMar w:top="1985" w:right="1418" w:bottom="1418" w:left="1418" w:header="708" w:footer="708" w:gutter="0"/>
           <w:pgNumType w:fmt="lowerRoman" w:start="1"/>
@@ -1342,55 +1161,621 @@
         </w:sectPr>
       </w:pPr>
     </w:p>
-    <w:p/>
-    <w:p/>
-    <w:p/>
-    <w:p/>
-    <w:p/>
-    <w:p/>
-    <w:p/>
-    <w:p/>
-    <w:p/>
-    <w:p/>
-    <w:p/>
-    <w:p/>
-    <w:p/>
-    <w:p/>
-    <w:p/>
-    <w:p/>
-    <w:p/>
-    <w:p/>
-    <w:p/>
-    <w:p/>
-    <w:p/>
-    <w:p/>
-    <w:p/>
-    <w:p/>
-    <w:p/>
-    <w:p/>
-    <w:p/>
-    <w:p/>
-    <w:p/>
-    <w:p/>
-    <w:p/>
-    <w:p/>
-    <w:p/>
-    <w:p/>
-    <w:p/>
-    <w:p/>
-    <w:p/>
-    <w:p/>
-    <w:p/>
-    <w:p/>
-    <w:p/>
-    <w:p/>
-    <w:p/>
-    <w:p/>
-    <w:p/>
-    <w:p/>
-    <w:p/>
-    <w:p/>
-    <w:p/>
+    <w:p>
+      <w:pPr>
+        <w:pStyle w:val="Ttulo1"/>
+        <w:numPr>
+          <w:ilvl w:val="0"/>
+          <w:numId w:val="2"/>
+        </w:numPr>
+        <w:jc w:val="right"/>
+        <w:rPr>
+          <w:rFonts w:ascii="Calibri" w:hAnsi="Calibri" w:cs="Calibri"/>
+          <w:color w:val="auto"/>
+          <w:sz w:val="32"/>
+          <w:szCs w:val="32"/>
+        </w:rPr>
+      </w:pPr>
+      <w:r>
+        <w:rPr>
+          <w:rFonts w:ascii="Calibri" w:hAnsi="Calibri" w:cs="Calibri"/>
+          <w:color w:val="auto"/>
+          <w:sz w:val="32"/>
+          <w:szCs w:val="32"/>
+        </w:rPr>
+        <w:lastRenderedPageBreak/>
+        <w:t>INTRODUCCION</w:t>
+      </w:r>
+    </w:p>
+    <w:p>
+      <w:r>
+        <w:t xml:space="preserve">Esta memoria presenta de forma detallada el trabajo realizado para el desarrollo del proyecto fin de grado, el cual ha permitido aplicar gran parte del conocimiento adquirido durante cuatro años de aprendizaje en la Universidad. El proyecto desarrollado consiste en un videojuego de carreras en tres dimensiones con generación procedural de circuitos e inteligencia artificial, construido sobre el motor Unity y el </w:t>
+      </w:r>
+      <w:proofErr w:type="spellStart"/>
+      <w:r>
+        <w:t>framework</w:t>
+      </w:r>
+      <w:proofErr w:type="spellEnd"/>
+      <w:r>
+        <w:t xml:space="preserve"> de aprendizaje por refuerzo ML-</w:t>
+      </w:r>
+      <w:proofErr w:type="spellStart"/>
+      <w:r>
+        <w:t>Agents</w:t>
+      </w:r>
+      <w:proofErr w:type="spellEnd"/>
+      <w:r>
+        <w:t xml:space="preserve"> de Unity Technologies.</w:t>
+      </w:r>
+    </w:p>
+    <w:p>
+      <w:r>
+        <w:t xml:space="preserve">El núcleo del proyecto es un agente autónomo capaz de aprender a conducir un vehículo a lo largo de circuitos generados de forma aleatoria, sin intervención humana durante el entrenamiento. Para ello, se ha diseñado e implementado un sistema completo que abarca desde la generación dinámica de los circuitos hasta el entrenamiento del agente mediante técnicas de aprendizaje por refuerzo profundo, pasando por la física del vehículo, la gestión de </w:t>
+      </w:r>
+      <w:proofErr w:type="spellStart"/>
+      <w:r>
+        <w:t>checkpoints</w:t>
+      </w:r>
+      <w:proofErr w:type="spellEnd"/>
+      <w:r>
+        <w:t xml:space="preserve"> y la lógica de carrera.</w:t>
+      </w:r>
+    </w:p>
+    <w:p>
+      <w:r>
+        <w:t>Para facilitar la comprensión de este documento, se ha decidido dividirlo en una serie de capítulos que siguen la estructura definida en la normativa de trabajos fin de grado de la universidad. Estos capítulos, excluyendo el presente, serían los siguientes:</w:t>
+      </w:r>
+    </w:p>
+    <w:p>
+      <w:pPr>
+        <w:pStyle w:val="Prrafodelista"/>
+        <w:numPr>
+          <w:ilvl w:val="0"/>
+          <w:numId w:val="51"/>
+        </w:numPr>
+      </w:pPr>
+      <w:r>
+        <w:t>Objetivos y alcance: En este capítulo se expondrá el motivo por el cual se ha elegido desarrollar este proyecto, así como los objetivos concretos que se pretenden alcanzar con su realización. Se delimitará también el alcance del trabajo, detallando qué funcionalidades y sistemas forman parte del proyecto y cuáles quedan fuera de él.</w:t>
+      </w:r>
+    </w:p>
+    <w:p>
+      <w:pPr>
+        <w:pStyle w:val="Prrafodelista"/>
+        <w:numPr>
+          <w:ilvl w:val="0"/>
+          <w:numId w:val="51"/>
+        </w:numPr>
+      </w:pPr>
+      <w:r>
+        <w:t>Estado del arte: En este capítulo se ofrecerá una visión general del contexto en el que se enmarca el proyecto, analizando los antecedentes más relevantes en el campo de la inteligencia artificial aplicada a los videojuegos y la generación procedural de contenido. Se estudiarán trabajos académicos y títulos comerciales que han servido de referencia e inspiración, evaluando el estado actual de estas tecnologías y las oportunidades que justifican el enfoque adoptado en este trabajo.</w:t>
+      </w:r>
+    </w:p>
+    <w:p>
+      <w:pPr>
+        <w:pStyle w:val="Prrafodelista"/>
+        <w:numPr>
+          <w:ilvl w:val="0"/>
+          <w:numId w:val="51"/>
+        </w:numPr>
+      </w:pPr>
+      <w:r>
+        <w:t>Planificación y presupuesto: A la hora de desarrollar cualquier proyecto informático es importante contar con una planificación de las tareas a realizar para garantizar su correcta finalización. En este apartado se detallarán todas las tareas llevadas a cabo durante el desarrollo, indicando su duración y fechas de inicio y fin mediante un diagrama de Gantt. Asimismo, se incluirá una estimación del presupuesto necesario para la realización del proyecto, desglosando los costes asociados a los recursos humanos, las herramientas utilizadas y otros gastos derivados del desarrollo.</w:t>
+      </w:r>
+    </w:p>
+    <w:p>
+      <w:pPr>
+        <w:pStyle w:val="Prrafodelista"/>
+        <w:numPr>
+          <w:ilvl w:val="0"/>
+          <w:numId w:val="51"/>
+        </w:numPr>
+      </w:pPr>
+      <w:r>
+        <w:t xml:space="preserve">Memoria técnica: Este capítulo recogerá toda la información técnica generada durante el transcurso del proyecto. Se explicarán los requisitos funcionales y no funcionales que el sistema debe cumplir para considerarse exitoso, las herramientas y tecnologías utilizadas, y la terminología específica empleada. Para finalizar, se describirá en detalle el diseño e implementación del videojuego, incluyendo el generador procedural de circuitos, el sistema de </w:t>
+      </w:r>
+      <w:proofErr w:type="spellStart"/>
+      <w:r>
+        <w:t>checkpoints</w:t>
+      </w:r>
+      <w:proofErr w:type="spellEnd"/>
+      <w:r>
+        <w:t>, la física del vehículo, el entrenamiento del agente mediante aprendizaje por refuerzo y la gestión de la lógica de carrera.</w:t>
+      </w:r>
+    </w:p>
+    <w:p>
+      <w:pPr>
+        <w:pStyle w:val="Prrafodelista"/>
+        <w:numPr>
+          <w:ilvl w:val="0"/>
+          <w:numId w:val="51"/>
+        </w:numPr>
+      </w:pPr>
+      <w:r>
+        <w:t>Resultados: En este capítulo se presentarán y analizarán los resultados obtenidos durante el entrenamiento del agente y las pruebas realizadas sobre el sistema. Se evaluará el comportamiento del agente en distintos circuitos, su capacidad de generalización y el rendimiento global del videojuego desarrollado.</w:t>
+      </w:r>
+    </w:p>
+    <w:p>
+      <w:pPr>
+        <w:pStyle w:val="Prrafodelista"/>
+        <w:numPr>
+          <w:ilvl w:val="0"/>
+          <w:numId w:val="51"/>
+        </w:numPr>
+      </w:pPr>
+      <w:r>
+        <w:lastRenderedPageBreak/>
+        <w:t>Valoración ética: Todo proyecto o trabajo informático tiene una serie de implicaciones derivadas de su desarrollo y publicación. Por ello, es imprescindible evaluar dichas implicaciones desde un punto de vista no solo legal, sino también ético, prestando especial atención al uso de inteligencia artificial y a las posibles repercusiones del producto desarrollado.</w:t>
+      </w:r>
+    </w:p>
+    <w:p>
+      <w:pPr>
+        <w:pStyle w:val="Prrafodelista"/>
+        <w:numPr>
+          <w:ilvl w:val="0"/>
+          <w:numId w:val="51"/>
+        </w:numPr>
+      </w:pPr>
+      <w:r>
+        <w:t>Conclusiones y trabajo futuro: En este último capítulo se expondrán las conclusiones obtenidas una vez concluido el desarrollo del proyecto, valorando en qué medida se han alcanzado los objetivos planteados inicialmente. Adicionalmente, se incluirá un apartado dedicado a las posibles líneas de trabajo futuro, describiendo mejoras y funcionalidades que podrían incorporarse en versiones posteriores del sistema.</w:t>
+      </w:r>
+    </w:p>
+    <w:p>
+      <w:pPr>
+        <w:pStyle w:val="Prrafodelista"/>
+        <w:numPr>
+          <w:ilvl w:val="0"/>
+          <w:numId w:val="51"/>
+        </w:numPr>
+      </w:pPr>
+      <w:r>
+        <w:t>Bibliografía: Este apartado recogerá todas las fuentes de información consultadas a lo largo del trabajo fin de grado, ya sean referencias académicas, documentación técnica o recursos web utilizados tanto para el desarrollo del proyecto como para la elaboración de esta memoria.</w:t>
+      </w:r>
+    </w:p>
+    <w:p>
+      <w:r>
+        <w:br w:type="page"/>
+      </w:r>
+    </w:p>
+    <w:p>
+      <w:pPr>
+        <w:pStyle w:val="Ttulo1"/>
+        <w:numPr>
+          <w:ilvl w:val="0"/>
+          <w:numId w:val="2"/>
+        </w:numPr>
+        <w:jc w:val="right"/>
+        <w:rPr>
+          <w:rFonts w:ascii="Calibri" w:hAnsi="Calibri" w:cs="Calibri"/>
+          <w:color w:val="auto"/>
+          <w:sz w:val="32"/>
+          <w:szCs w:val="32"/>
+        </w:rPr>
+      </w:pPr>
+      <w:r>
+        <w:rPr>
+          <w:rFonts w:ascii="Calibri" w:hAnsi="Calibri" w:cs="Calibri"/>
+          <w:color w:val="auto"/>
+          <w:sz w:val="32"/>
+          <w:szCs w:val="32"/>
+        </w:rPr>
+        <w:lastRenderedPageBreak/>
+        <w:t>OBJETIVOS Y ALCANCE</w:t>
+      </w:r>
+      <w:bookmarkStart w:id="0" w:name="_Toc166857601"/>
+      <w:bookmarkStart w:id="1" w:name="_Toc166858264"/>
+      <w:bookmarkStart w:id="2" w:name="_Toc166858343"/>
+    </w:p>
+    <w:bookmarkEnd w:id="0"/>
+    <w:bookmarkEnd w:id="1"/>
+    <w:bookmarkEnd w:id="2"/>
+    <w:p>
+      <w:pPr>
+        <w:ind w:left="360"/>
+      </w:pPr>
+    </w:p>
+    <w:p/>
+    <w:p/>
+    <w:p/>
+    <w:p/>
+    <w:p/>
+    <w:p/>
+    <w:p/>
+    <w:p/>
+    <w:p/>
+    <w:p/>
+    <w:p/>
+    <w:p/>
+    <w:p/>
+    <w:p/>
+    <w:p/>
+    <w:p/>
+    <w:p/>
+    <w:p/>
+    <w:p/>
+    <w:p/>
+    <w:p/>
+    <w:p/>
+    <w:p/>
+    <w:p/>
+    <w:p/>
+    <w:p>
+      <w:r>
+        <w:br w:type="page"/>
+      </w:r>
+    </w:p>
+    <w:p>
+      <w:pPr>
+        <w:pStyle w:val="Ttulo1"/>
+        <w:numPr>
+          <w:ilvl w:val="0"/>
+          <w:numId w:val="55"/>
+        </w:numPr>
+        <w:jc w:val="right"/>
+        <w:rPr>
+          <w:rFonts w:ascii="Calibri" w:hAnsi="Calibri" w:cs="Calibri"/>
+          <w:color w:val="auto"/>
+          <w:sz w:val="32"/>
+          <w:szCs w:val="32"/>
+        </w:rPr>
+      </w:pPr>
+      <w:r>
+        <w:rPr>
+          <w:rFonts w:ascii="Calibri" w:hAnsi="Calibri" w:cs="Calibri"/>
+          <w:color w:val="auto"/>
+          <w:sz w:val="32"/>
+          <w:szCs w:val="32"/>
+        </w:rPr>
+        <w:lastRenderedPageBreak/>
+        <w:t>Estado del arte</w:t>
+      </w:r>
+    </w:p>
+    <w:p/>
+    <w:p/>
+    <w:p/>
+    <w:p/>
+    <w:p/>
+    <w:p/>
+    <w:p/>
+    <w:p/>
+    <w:p/>
+    <w:p/>
+    <w:p/>
+    <w:p/>
+    <w:p/>
+    <w:p/>
+    <w:p/>
+    <w:p/>
+    <w:p/>
+    <w:p/>
+    <w:p/>
+    <w:p/>
+    <w:p/>
+    <w:p/>
+    <w:p/>
+    <w:p/>
+    <w:p/>
+    <w:p/>
+    <w:p/>
+    <w:p>
+      <w:r>
+        <w:br w:type="page"/>
+      </w:r>
+    </w:p>
+    <w:p>
+      <w:pPr>
+        <w:pStyle w:val="Ttulo1"/>
+        <w:numPr>
+          <w:ilvl w:val="0"/>
+          <w:numId w:val="55"/>
+        </w:numPr>
+        <w:jc w:val="right"/>
+        <w:rPr>
+          <w:rFonts w:ascii="Calibri" w:hAnsi="Calibri" w:cs="Calibri"/>
+          <w:color w:val="auto"/>
+          <w:sz w:val="32"/>
+          <w:szCs w:val="32"/>
+        </w:rPr>
+      </w:pPr>
+      <w:r>
+        <w:rPr>
+          <w:rFonts w:ascii="Calibri" w:hAnsi="Calibri" w:cs="Calibri"/>
+          <w:color w:val="auto"/>
+          <w:sz w:val="32"/>
+          <w:szCs w:val="32"/>
+        </w:rPr>
+        <w:lastRenderedPageBreak/>
+        <w:t>Planificación y presupuesto</w:t>
+      </w:r>
+    </w:p>
+    <w:p/>
+    <w:p/>
+    <w:p/>
+    <w:p/>
+    <w:p/>
+    <w:p/>
+    <w:p/>
+    <w:p/>
+    <w:p/>
+    <w:p/>
+    <w:p/>
+    <w:p/>
+    <w:p/>
+    <w:p/>
+    <w:p/>
+    <w:p/>
+    <w:p/>
+    <w:p/>
+    <w:p/>
+    <w:p/>
+    <w:p/>
+    <w:p/>
+    <w:p/>
+    <w:p/>
+    <w:p/>
+    <w:p/>
+    <w:p/>
+    <w:p>
+      <w:r>
+        <w:br w:type="page"/>
+      </w:r>
+    </w:p>
+    <w:p>
+      <w:pPr>
+        <w:pStyle w:val="Ttulo1"/>
+        <w:numPr>
+          <w:ilvl w:val="0"/>
+          <w:numId w:val="55"/>
+        </w:numPr>
+        <w:jc w:val="right"/>
+        <w:rPr>
+          <w:rFonts w:ascii="Calibri" w:hAnsi="Calibri" w:cs="Calibri"/>
+          <w:color w:val="auto"/>
+          <w:sz w:val="32"/>
+          <w:szCs w:val="32"/>
+        </w:rPr>
+      </w:pPr>
+      <w:r>
+        <w:rPr>
+          <w:rFonts w:ascii="Calibri" w:hAnsi="Calibri" w:cs="Calibri"/>
+          <w:color w:val="auto"/>
+          <w:sz w:val="32"/>
+          <w:szCs w:val="32"/>
+        </w:rPr>
+        <w:lastRenderedPageBreak/>
+        <w:t>Memoria técnica</w:t>
+      </w:r>
+    </w:p>
+    <w:p/>
+    <w:p/>
+    <w:p/>
+    <w:p/>
+    <w:p/>
+    <w:p/>
+    <w:p/>
+    <w:p/>
+    <w:p/>
+    <w:p/>
+    <w:p/>
+    <w:p/>
+    <w:p/>
+    <w:p/>
+    <w:p/>
+    <w:p/>
+    <w:p/>
+    <w:p/>
+    <w:p/>
+    <w:p/>
+    <w:p/>
+    <w:p/>
+    <w:p/>
+    <w:p/>
+    <w:p/>
+    <w:p/>
+    <w:p/>
+    <w:p>
+      <w:r>
+        <w:br w:type="page"/>
+      </w:r>
+    </w:p>
+    <w:p>
+      <w:pPr>
+        <w:pStyle w:val="Ttulo1"/>
+        <w:numPr>
+          <w:ilvl w:val="0"/>
+          <w:numId w:val="55"/>
+        </w:numPr>
+        <w:jc w:val="right"/>
+        <w:rPr>
+          <w:rFonts w:ascii="Calibri" w:hAnsi="Calibri" w:cs="Calibri"/>
+          <w:color w:val="auto"/>
+          <w:sz w:val="32"/>
+          <w:szCs w:val="32"/>
+        </w:rPr>
+      </w:pPr>
+      <w:r>
+        <w:rPr>
+          <w:rFonts w:ascii="Calibri" w:hAnsi="Calibri" w:cs="Calibri"/>
+          <w:color w:val="auto"/>
+          <w:sz w:val="32"/>
+          <w:szCs w:val="32"/>
+        </w:rPr>
+        <w:lastRenderedPageBreak/>
+        <w:t>Resultados</w:t>
+      </w:r>
+    </w:p>
+    <w:p/>
+    <w:p/>
+    <w:p/>
+    <w:p/>
+    <w:p/>
+    <w:p/>
+    <w:p/>
+    <w:p/>
+    <w:p/>
+    <w:p/>
+    <w:p/>
+    <w:p/>
+    <w:p/>
+    <w:p/>
+    <w:p/>
+    <w:p/>
+    <w:p/>
+    <w:p/>
+    <w:p/>
+    <w:p/>
+    <w:p/>
+    <w:p/>
+    <w:p/>
+    <w:p/>
+    <w:p/>
+    <w:p/>
+    <w:p/>
+    <w:p>
+      <w:r>
+        <w:br w:type="page"/>
+      </w:r>
+    </w:p>
+    <w:p>
+      <w:pPr>
+        <w:pStyle w:val="Ttulo1"/>
+        <w:numPr>
+          <w:ilvl w:val="0"/>
+          <w:numId w:val="55"/>
+        </w:numPr>
+        <w:jc w:val="right"/>
+        <w:rPr>
+          <w:rFonts w:ascii="Calibri" w:hAnsi="Calibri" w:cs="Calibri"/>
+          <w:color w:val="auto"/>
+          <w:sz w:val="32"/>
+          <w:szCs w:val="32"/>
+        </w:rPr>
+      </w:pPr>
+      <w:r>
+        <w:rPr>
+          <w:rFonts w:ascii="Calibri" w:hAnsi="Calibri" w:cs="Calibri"/>
+          <w:color w:val="auto"/>
+          <w:sz w:val="32"/>
+          <w:szCs w:val="32"/>
+        </w:rPr>
+        <w:lastRenderedPageBreak/>
+        <w:t>Valoración ética</w:t>
+      </w:r>
+    </w:p>
+    <w:p/>
+    <w:p/>
+    <w:p/>
+    <w:p/>
+    <w:p/>
+    <w:p/>
+    <w:p/>
+    <w:p/>
+    <w:p/>
+    <w:p/>
+    <w:p/>
+    <w:p/>
+    <w:p/>
+    <w:p/>
+    <w:p/>
+    <w:p/>
+    <w:p/>
+    <w:p/>
+    <w:p/>
+    <w:p/>
+    <w:p/>
+    <w:p/>
+    <w:p/>
+    <w:p/>
+    <w:p/>
+    <w:p/>
+    <w:p>
+      <w:r>
+        <w:br w:type="page"/>
+      </w:r>
+    </w:p>
+    <w:p>
+      <w:pPr>
+        <w:pStyle w:val="Ttulo1"/>
+        <w:numPr>
+          <w:ilvl w:val="0"/>
+          <w:numId w:val="55"/>
+        </w:numPr>
+        <w:jc w:val="right"/>
+        <w:rPr>
+          <w:rFonts w:ascii="Calibri" w:hAnsi="Calibri" w:cs="Calibri"/>
+          <w:color w:val="auto"/>
+          <w:sz w:val="32"/>
+          <w:szCs w:val="32"/>
+        </w:rPr>
+      </w:pPr>
+      <w:r>
+        <w:rPr>
+          <w:rFonts w:ascii="Calibri" w:hAnsi="Calibri" w:cs="Calibri"/>
+          <w:color w:val="auto"/>
+          <w:sz w:val="32"/>
+          <w:szCs w:val="32"/>
+        </w:rPr>
+        <w:lastRenderedPageBreak/>
+        <w:t>Conclusiones y trabajo futuro</w:t>
+      </w:r>
+    </w:p>
+    <w:p/>
+    <w:p/>
+    <w:p/>
+    <w:p/>
+    <w:p/>
+    <w:p/>
+    <w:p/>
+    <w:p/>
+    <w:p/>
+    <w:p/>
+    <w:p/>
+    <w:p/>
+    <w:p/>
+    <w:p/>
+    <w:p/>
+    <w:p/>
+    <w:p/>
+    <w:p/>
+    <w:p/>
+    <w:p/>
+    <w:p/>
+    <w:p/>
+    <w:p/>
+    <w:p/>
+    <w:p/>
+    <w:p/>
+    <w:p/>
+    <w:p>
+      <w:r>
+        <w:br w:type="page"/>
+      </w:r>
+    </w:p>
+    <w:p>
+      <w:pPr>
+        <w:pStyle w:val="Ttulo1"/>
+        <w:numPr>
+          <w:ilvl w:val="0"/>
+          <w:numId w:val="55"/>
+        </w:numPr>
+        <w:jc w:val="right"/>
+        <w:rPr>
+          <w:rFonts w:ascii="Calibri" w:hAnsi="Calibri" w:cs="Calibri"/>
+          <w:color w:val="auto"/>
+          <w:sz w:val="32"/>
+          <w:szCs w:val="32"/>
+        </w:rPr>
+      </w:pPr>
+      <w:r>
+        <w:rPr>
+          <w:rFonts w:ascii="Calibri" w:hAnsi="Calibri" w:cs="Calibri"/>
+          <w:color w:val="auto"/>
+          <w:sz w:val="32"/>
+          <w:szCs w:val="32"/>
+        </w:rPr>
+        <w:lastRenderedPageBreak/>
+        <w:t>BIBLIOGRAFIA</w:t>
+      </w:r>
+    </w:p>
     <w:p/>
     <w:p/>
     <w:p/>
@@ -1567,22 +1952,1225 @@
 </w:hdr>
 </file>
 
+<file path=word/numbering.xml><?xml version="1.0" encoding="utf-8"?>
+<w:numbering xmlns:wpc="http://schemas.microsoft.com/office/word/2010/wordprocessingCanvas" xmlns:cx="http://schemas.microsoft.com/office/drawing/2014/chartex" xmlns:cx1="http://schemas.microsoft.com/office/drawing/2015/9/8/chartex" xmlns:cx2="http://schemas.microsoft.com/office/drawing/2015/10/21/chartex" xmlns:cx3="http://schemas.microsoft.com/office/drawing/2016/5/9/chartex" xmlns:cx4="http://schemas.microsoft.com/office/drawing/2016/5/10/chartex" xmlns:cx5="http://schemas.microsoft.com/office/drawing/2016/5/11/chartex" xmlns:cx6="http://schemas.microsoft.com/office/drawing/2016/5/12/chartex" xmlns:cx7="http://schemas.microsoft.com/office/drawing/2016/5/13/chartex" xmlns:cx8="http://schemas.microsoft.com/office/drawing/2016/5/14/chartex" xmlns:mc="http://schemas.openxmlformats.org/markup-compatibility/2006" xmlns:aink="http://schemas.microsoft.com/office/drawing/2016/ink" xmlns:am3d="http://schemas.microsoft.com/office/drawing/2017/model3d" xmlns:o="urn:schemas-microsoft-com:office:office" xmlns:oel="http://schemas.microsoft.com/office/2019/extlst" xmlns:r="http://schemas.openxmlformats.org/officeDocument/2006/relationships" xmlns:m="http://schemas.openxmlformats.org/officeDocument/2006/math" xmlns:v="urn:schemas-microsoft-com:vml" xmlns:wp14="http://schemas.microsoft.com/office/word/2010/wordprocessingDrawing" xmlns:wp="http://schemas.openxmlformats.org/drawingml/2006/wordprocessingDrawing" xmlns:w10="urn:schemas-microsoft-com:office:word" xmlns:w="http://schemas.openxmlformats.org/wordprocessingml/2006/main" xmlns:w14="http://schemas.microsoft.com/office/word/2010/wordml" xmlns:w15="http://schemas.microsoft.com/office/word/2012/wordml" xmlns:w16cex="http://schemas.microsoft.com/office/word/2018/wordml/cex" xmlns:w16cid="http://schemas.microsoft.com/office/word/2016/wordml/cid" xmlns:w16="http://schemas.microsoft.com/office/word/2018/wordml" xmlns:w16du="http://schemas.microsoft.com/office/word/2023/wordml/word16du" xmlns:w16sdtdh="http://schemas.microsoft.com/office/word/2020/wordml/sdtdatahash" xmlns:w16se="http://schemas.microsoft.com/office/word/2015/wordml/symex" xmlns:wpg="http://schemas.microsoft.com/office/word/2010/wordprocessingGroup" xmlns:wpi="http://schemas.microsoft.com/office/word/2010/wordprocessingInk" xmlns:wne="http://schemas.microsoft.com/office/word/2006/wordml" xmlns:wps="http://schemas.microsoft.com/office/word/2010/wordprocessingShape" mc:Ignorable="w14 w15 w16se w16cid w16 w16cex w16sdtdh w16du wp14">
+  <w:abstractNum w:abstractNumId="0" w15:restartNumberingAfterBreak="0">
+    <w:nsid w:val="0D4429D3"/>
+    <w:multiLevelType w:val="multilevel"/>
+    <w:tmpl w:val="9E801392"/>
+    <w:lvl w:ilvl="0">
+      <w:start w:val="1"/>
+      <w:numFmt w:val="decimal"/>
+      <w:lvlText w:val="%1."/>
+      <w:lvlJc w:val="left"/>
+      <w:pPr>
+        <w:ind w:left="720" w:hanging="360"/>
+      </w:pPr>
+    </w:lvl>
+    <w:lvl w:ilvl="1">
+      <w:start w:val="1"/>
+      <w:numFmt w:val="decimal"/>
+      <w:isLgl/>
+      <w:lvlText w:val="%1.%2"/>
+      <w:lvlJc w:val="left"/>
+      <w:pPr>
+        <w:ind w:left="735" w:hanging="375"/>
+      </w:pPr>
+      <w:rPr>
+        <w:rFonts w:hint="default"/>
+      </w:rPr>
+    </w:lvl>
+    <w:lvl w:ilvl="2">
+      <w:start w:val="1"/>
+      <w:numFmt w:val="decimal"/>
+      <w:isLgl/>
+      <w:lvlText w:val="%1.%2.%3"/>
+      <w:lvlJc w:val="left"/>
+      <w:pPr>
+        <w:ind w:left="1080" w:hanging="720"/>
+      </w:pPr>
+      <w:rPr>
+        <w:rFonts w:hint="default"/>
+      </w:rPr>
+    </w:lvl>
+    <w:lvl w:ilvl="3">
+      <w:start w:val="1"/>
+      <w:numFmt w:val="decimal"/>
+      <w:isLgl/>
+      <w:lvlText w:val="%1.%2.%3.%4"/>
+      <w:lvlJc w:val="left"/>
+      <w:pPr>
+        <w:ind w:left="1440" w:hanging="1080"/>
+      </w:pPr>
+      <w:rPr>
+        <w:rFonts w:hint="default"/>
+      </w:rPr>
+    </w:lvl>
+    <w:lvl w:ilvl="4">
+      <w:start w:val="1"/>
+      <w:numFmt w:val="decimal"/>
+      <w:isLgl/>
+      <w:lvlText w:val="%1.%2.%3.%4.%5"/>
+      <w:lvlJc w:val="left"/>
+      <w:pPr>
+        <w:ind w:left="1440" w:hanging="1080"/>
+      </w:pPr>
+      <w:rPr>
+        <w:rFonts w:hint="default"/>
+      </w:rPr>
+    </w:lvl>
+    <w:lvl w:ilvl="5">
+      <w:start w:val="1"/>
+      <w:numFmt w:val="decimal"/>
+      <w:isLgl/>
+      <w:lvlText w:val="%1.%2.%3.%4.%5.%6"/>
+      <w:lvlJc w:val="left"/>
+      <w:pPr>
+        <w:ind w:left="1800" w:hanging="1440"/>
+      </w:pPr>
+      <w:rPr>
+        <w:rFonts w:hint="default"/>
+      </w:rPr>
+    </w:lvl>
+    <w:lvl w:ilvl="6">
+      <w:start w:val="1"/>
+      <w:numFmt w:val="decimal"/>
+      <w:isLgl/>
+      <w:lvlText w:val="%1.%2.%3.%4.%5.%6.%7"/>
+      <w:lvlJc w:val="left"/>
+      <w:pPr>
+        <w:ind w:left="1800" w:hanging="1440"/>
+      </w:pPr>
+      <w:rPr>
+        <w:rFonts w:hint="default"/>
+      </w:rPr>
+    </w:lvl>
+    <w:lvl w:ilvl="7">
+      <w:start w:val="1"/>
+      <w:numFmt w:val="decimal"/>
+      <w:isLgl/>
+      <w:lvlText w:val="%1.%2.%3.%4.%5.%6.%7.%8"/>
+      <w:lvlJc w:val="left"/>
+      <w:pPr>
+        <w:ind w:left="2160" w:hanging="1800"/>
+      </w:pPr>
+      <w:rPr>
+        <w:rFonts w:hint="default"/>
+      </w:rPr>
+    </w:lvl>
+    <w:lvl w:ilvl="8">
+      <w:start w:val="1"/>
+      <w:numFmt w:val="decimal"/>
+      <w:isLgl/>
+      <w:lvlText w:val="%1.%2.%3.%4.%5.%6.%7.%8.%9"/>
+      <w:lvlJc w:val="left"/>
+      <w:pPr>
+        <w:ind w:left="2520" w:hanging="2160"/>
+      </w:pPr>
+      <w:rPr>
+        <w:rFonts w:hint="default"/>
+      </w:rPr>
+    </w:lvl>
+  </w:abstractNum>
+  <w:abstractNum w:abstractNumId="1" w15:restartNumberingAfterBreak="0">
+    <w:nsid w:val="1482775B"/>
+    <w:multiLevelType w:val="multilevel"/>
+    <w:tmpl w:val="0EBA3C40"/>
+    <w:lvl w:ilvl="0">
+      <w:start w:val="1"/>
+      <w:numFmt w:val="decimal"/>
+      <w:pStyle w:val="Ttulo1"/>
+      <w:lvlText w:val="%1"/>
+      <w:lvlJc w:val="left"/>
+      <w:pPr>
+        <w:ind w:left="432" w:hanging="432"/>
+      </w:pPr>
+    </w:lvl>
+    <w:lvl w:ilvl="1">
+      <w:start w:val="1"/>
+      <w:numFmt w:val="decimal"/>
+      <w:pStyle w:val="Ttulo2"/>
+      <w:lvlText w:val="%1.%2"/>
+      <w:lvlJc w:val="left"/>
+      <w:pPr>
+        <w:ind w:left="576" w:hanging="576"/>
+      </w:pPr>
+    </w:lvl>
+    <w:lvl w:ilvl="2">
+      <w:start w:val="1"/>
+      <w:numFmt w:val="decimal"/>
+      <w:pStyle w:val="Ttulo3"/>
+      <w:lvlText w:val="%1.%2.%3"/>
+      <w:lvlJc w:val="left"/>
+      <w:pPr>
+        <w:ind w:left="720" w:hanging="720"/>
+      </w:pPr>
+    </w:lvl>
+    <w:lvl w:ilvl="3">
+      <w:start w:val="1"/>
+      <w:numFmt w:val="decimal"/>
+      <w:pStyle w:val="Ttulo4"/>
+      <w:lvlText w:val="%1.%2.%3.%4"/>
+      <w:lvlJc w:val="left"/>
+      <w:pPr>
+        <w:ind w:left="864" w:hanging="864"/>
+      </w:pPr>
+    </w:lvl>
+    <w:lvl w:ilvl="4">
+      <w:start w:val="1"/>
+      <w:numFmt w:val="decimal"/>
+      <w:pStyle w:val="Ttulo5"/>
+      <w:lvlText w:val="%1.%2.%3.%4.%5"/>
+      <w:lvlJc w:val="left"/>
+      <w:pPr>
+        <w:ind w:left="1008" w:hanging="1008"/>
+      </w:pPr>
+    </w:lvl>
+    <w:lvl w:ilvl="5">
+      <w:start w:val="1"/>
+      <w:numFmt w:val="decimal"/>
+      <w:pStyle w:val="Ttulo6"/>
+      <w:lvlText w:val="%1.%2.%3.%4.%5.%6"/>
+      <w:lvlJc w:val="left"/>
+      <w:pPr>
+        <w:ind w:left="1152" w:hanging="1152"/>
+      </w:pPr>
+    </w:lvl>
+    <w:lvl w:ilvl="6">
+      <w:start w:val="1"/>
+      <w:numFmt w:val="decimal"/>
+      <w:pStyle w:val="Ttulo7"/>
+      <w:lvlText w:val="%1.%2.%3.%4.%5.%6.%7"/>
+      <w:lvlJc w:val="left"/>
+      <w:pPr>
+        <w:ind w:left="1296" w:hanging="1296"/>
+      </w:pPr>
+    </w:lvl>
+    <w:lvl w:ilvl="7">
+      <w:start w:val="1"/>
+      <w:numFmt w:val="decimal"/>
+      <w:pStyle w:val="Ttulo8"/>
+      <w:lvlText w:val="%1.%2.%3.%4.%5.%6.%7.%8"/>
+      <w:lvlJc w:val="left"/>
+      <w:pPr>
+        <w:ind w:left="1440" w:hanging="1440"/>
+      </w:pPr>
+    </w:lvl>
+    <w:lvl w:ilvl="8">
+      <w:start w:val="1"/>
+      <w:numFmt w:val="decimal"/>
+      <w:pStyle w:val="Ttulo9"/>
+      <w:lvlText w:val="%1.%2.%3.%4.%5.%6.%7.%8.%9"/>
+      <w:lvlJc w:val="left"/>
+      <w:pPr>
+        <w:ind w:left="1584" w:hanging="1584"/>
+      </w:pPr>
+    </w:lvl>
+  </w:abstractNum>
+  <w:abstractNum w:abstractNumId="2" w15:restartNumberingAfterBreak="0">
+    <w:nsid w:val="1B1F3AE9"/>
+    <w:multiLevelType w:val="hybridMultilevel"/>
+    <w:tmpl w:val="D10E9598"/>
+    <w:lvl w:ilvl="0" w:tplc="0C0A000F">
+      <w:start w:val="2"/>
+      <w:numFmt w:val="decimal"/>
+      <w:lvlText w:val="%1."/>
+      <w:lvlJc w:val="left"/>
+      <w:pPr>
+        <w:ind w:left="720" w:hanging="360"/>
+      </w:pPr>
+      <w:rPr>
+        <w:rFonts w:hint="default"/>
+      </w:rPr>
+    </w:lvl>
+    <w:lvl w:ilvl="1" w:tplc="0C0A0019" w:tentative="1">
+      <w:start w:val="1"/>
+      <w:numFmt w:val="lowerLetter"/>
+      <w:lvlText w:val="%2."/>
+      <w:lvlJc w:val="left"/>
+      <w:pPr>
+        <w:ind w:left="1440" w:hanging="360"/>
+      </w:pPr>
+    </w:lvl>
+    <w:lvl w:ilvl="2" w:tplc="0C0A001B" w:tentative="1">
+      <w:start w:val="1"/>
+      <w:numFmt w:val="lowerRoman"/>
+      <w:lvlText w:val="%3."/>
+      <w:lvlJc w:val="right"/>
+      <w:pPr>
+        <w:ind w:left="2160" w:hanging="180"/>
+      </w:pPr>
+    </w:lvl>
+    <w:lvl w:ilvl="3" w:tplc="0C0A000F" w:tentative="1">
+      <w:start w:val="1"/>
+      <w:numFmt w:val="decimal"/>
+      <w:lvlText w:val="%4."/>
+      <w:lvlJc w:val="left"/>
+      <w:pPr>
+        <w:ind w:left="2880" w:hanging="360"/>
+      </w:pPr>
+    </w:lvl>
+    <w:lvl w:ilvl="4" w:tplc="0C0A0019" w:tentative="1">
+      <w:start w:val="1"/>
+      <w:numFmt w:val="lowerLetter"/>
+      <w:lvlText w:val="%5."/>
+      <w:lvlJc w:val="left"/>
+      <w:pPr>
+        <w:ind w:left="3600" w:hanging="360"/>
+      </w:pPr>
+    </w:lvl>
+    <w:lvl w:ilvl="5" w:tplc="0C0A001B" w:tentative="1">
+      <w:start w:val="1"/>
+      <w:numFmt w:val="lowerRoman"/>
+      <w:lvlText w:val="%6."/>
+      <w:lvlJc w:val="right"/>
+      <w:pPr>
+        <w:ind w:left="4320" w:hanging="180"/>
+      </w:pPr>
+    </w:lvl>
+    <w:lvl w:ilvl="6" w:tplc="0C0A000F" w:tentative="1">
+      <w:start w:val="1"/>
+      <w:numFmt w:val="decimal"/>
+      <w:lvlText w:val="%7."/>
+      <w:lvlJc w:val="left"/>
+      <w:pPr>
+        <w:ind w:left="5040" w:hanging="360"/>
+      </w:pPr>
+    </w:lvl>
+    <w:lvl w:ilvl="7" w:tplc="0C0A0019" w:tentative="1">
+      <w:start w:val="1"/>
+      <w:numFmt w:val="lowerLetter"/>
+      <w:lvlText w:val="%8."/>
+      <w:lvlJc w:val="left"/>
+      <w:pPr>
+        <w:ind w:left="5760" w:hanging="360"/>
+      </w:pPr>
+    </w:lvl>
+    <w:lvl w:ilvl="8" w:tplc="0C0A001B" w:tentative="1">
+      <w:start w:val="1"/>
+      <w:numFmt w:val="lowerRoman"/>
+      <w:lvlText w:val="%9."/>
+      <w:lvlJc w:val="right"/>
+      <w:pPr>
+        <w:ind w:left="6480" w:hanging="180"/>
+      </w:pPr>
+    </w:lvl>
+  </w:abstractNum>
+  <w:abstractNum w:abstractNumId="3" w15:restartNumberingAfterBreak="0">
+    <w:nsid w:val="35814743"/>
+    <w:multiLevelType w:val="multilevel"/>
+    <w:tmpl w:val="0C0A001F"/>
+    <w:lvl w:ilvl="0">
+      <w:start w:val="1"/>
+      <w:numFmt w:val="decimal"/>
+      <w:lvlText w:val="%1."/>
+      <w:lvlJc w:val="left"/>
+      <w:pPr>
+        <w:ind w:left="720" w:hanging="360"/>
+      </w:pPr>
+    </w:lvl>
+    <w:lvl w:ilvl="1">
+      <w:start w:val="1"/>
+      <w:numFmt w:val="decimal"/>
+      <w:lvlText w:val="%1.%2."/>
+      <w:lvlJc w:val="left"/>
+      <w:pPr>
+        <w:ind w:left="1152" w:hanging="432"/>
+      </w:pPr>
+    </w:lvl>
+    <w:lvl w:ilvl="2">
+      <w:start w:val="1"/>
+      <w:numFmt w:val="decimal"/>
+      <w:lvlText w:val="%1.%2.%3."/>
+      <w:lvlJc w:val="left"/>
+      <w:pPr>
+        <w:ind w:left="1584" w:hanging="504"/>
+      </w:pPr>
+    </w:lvl>
+    <w:lvl w:ilvl="3">
+      <w:start w:val="1"/>
+      <w:numFmt w:val="decimal"/>
+      <w:lvlText w:val="%1.%2.%3.%4."/>
+      <w:lvlJc w:val="left"/>
+      <w:pPr>
+        <w:ind w:left="2088" w:hanging="648"/>
+      </w:pPr>
+    </w:lvl>
+    <w:lvl w:ilvl="4">
+      <w:start w:val="1"/>
+      <w:numFmt w:val="decimal"/>
+      <w:lvlText w:val="%1.%2.%3.%4.%5."/>
+      <w:lvlJc w:val="left"/>
+      <w:pPr>
+        <w:ind w:left="2592" w:hanging="792"/>
+      </w:pPr>
+    </w:lvl>
+    <w:lvl w:ilvl="5">
+      <w:start w:val="1"/>
+      <w:numFmt w:val="decimal"/>
+      <w:lvlText w:val="%1.%2.%3.%4.%5.%6."/>
+      <w:lvlJc w:val="left"/>
+      <w:pPr>
+        <w:ind w:left="3096" w:hanging="936"/>
+      </w:pPr>
+    </w:lvl>
+    <w:lvl w:ilvl="6">
+      <w:start w:val="1"/>
+      <w:numFmt w:val="decimal"/>
+      <w:lvlText w:val="%1.%2.%3.%4.%5.%6.%7."/>
+      <w:lvlJc w:val="left"/>
+      <w:pPr>
+        <w:ind w:left="3600" w:hanging="1080"/>
+      </w:pPr>
+    </w:lvl>
+    <w:lvl w:ilvl="7">
+      <w:start w:val="1"/>
+      <w:numFmt w:val="decimal"/>
+      <w:lvlText w:val="%1.%2.%3.%4.%5.%6.%7.%8."/>
+      <w:lvlJc w:val="left"/>
+      <w:pPr>
+        <w:ind w:left="4104" w:hanging="1224"/>
+      </w:pPr>
+    </w:lvl>
+    <w:lvl w:ilvl="8">
+      <w:start w:val="1"/>
+      <w:numFmt w:val="decimal"/>
+      <w:lvlText w:val="%1.%2.%3.%4.%5.%6.%7.%8.%9."/>
+      <w:lvlJc w:val="left"/>
+      <w:pPr>
+        <w:ind w:left="4680" w:hanging="1440"/>
+      </w:pPr>
+    </w:lvl>
+  </w:abstractNum>
+  <w:abstractNum w:abstractNumId="4" w15:restartNumberingAfterBreak="0">
+    <w:nsid w:val="36A34642"/>
+    <w:multiLevelType w:val="hybridMultilevel"/>
+    <w:tmpl w:val="48600288"/>
+    <w:lvl w:ilvl="0" w:tplc="0C0A000F">
+      <w:start w:val="1"/>
+      <w:numFmt w:val="decimal"/>
+      <w:lvlText w:val="%1."/>
+      <w:lvlJc w:val="left"/>
+      <w:pPr>
+        <w:ind w:left="720" w:hanging="360"/>
+      </w:pPr>
+    </w:lvl>
+    <w:lvl w:ilvl="1" w:tplc="0C0A0019" w:tentative="1">
+      <w:start w:val="1"/>
+      <w:numFmt w:val="lowerLetter"/>
+      <w:lvlText w:val="%2."/>
+      <w:lvlJc w:val="left"/>
+      <w:pPr>
+        <w:ind w:left="1440" w:hanging="360"/>
+      </w:pPr>
+    </w:lvl>
+    <w:lvl w:ilvl="2" w:tplc="0C0A001B" w:tentative="1">
+      <w:start w:val="1"/>
+      <w:numFmt w:val="lowerRoman"/>
+      <w:lvlText w:val="%3."/>
+      <w:lvlJc w:val="right"/>
+      <w:pPr>
+        <w:ind w:left="2160" w:hanging="180"/>
+      </w:pPr>
+    </w:lvl>
+    <w:lvl w:ilvl="3" w:tplc="0C0A000F" w:tentative="1">
+      <w:start w:val="1"/>
+      <w:numFmt w:val="decimal"/>
+      <w:lvlText w:val="%4."/>
+      <w:lvlJc w:val="left"/>
+      <w:pPr>
+        <w:ind w:left="2880" w:hanging="360"/>
+      </w:pPr>
+    </w:lvl>
+    <w:lvl w:ilvl="4" w:tplc="0C0A0019" w:tentative="1">
+      <w:start w:val="1"/>
+      <w:numFmt w:val="lowerLetter"/>
+      <w:lvlText w:val="%5."/>
+      <w:lvlJc w:val="left"/>
+      <w:pPr>
+        <w:ind w:left="3600" w:hanging="360"/>
+      </w:pPr>
+    </w:lvl>
+    <w:lvl w:ilvl="5" w:tplc="0C0A001B" w:tentative="1">
+      <w:start w:val="1"/>
+      <w:numFmt w:val="lowerRoman"/>
+      <w:lvlText w:val="%6."/>
+      <w:lvlJc w:val="right"/>
+      <w:pPr>
+        <w:ind w:left="4320" w:hanging="180"/>
+      </w:pPr>
+    </w:lvl>
+    <w:lvl w:ilvl="6" w:tplc="0C0A000F" w:tentative="1">
+      <w:start w:val="1"/>
+      <w:numFmt w:val="decimal"/>
+      <w:lvlText w:val="%7."/>
+      <w:lvlJc w:val="left"/>
+      <w:pPr>
+        <w:ind w:left="5040" w:hanging="360"/>
+      </w:pPr>
+    </w:lvl>
+    <w:lvl w:ilvl="7" w:tplc="0C0A0019" w:tentative="1">
+      <w:start w:val="1"/>
+      <w:numFmt w:val="lowerLetter"/>
+      <w:lvlText w:val="%8."/>
+      <w:lvlJc w:val="left"/>
+      <w:pPr>
+        <w:ind w:left="5760" w:hanging="360"/>
+      </w:pPr>
+    </w:lvl>
+    <w:lvl w:ilvl="8" w:tplc="0C0A001B" w:tentative="1">
+      <w:start w:val="1"/>
+      <w:numFmt w:val="lowerRoman"/>
+      <w:lvlText w:val="%9."/>
+      <w:lvlJc w:val="right"/>
+      <w:pPr>
+        <w:ind w:left="6480" w:hanging="180"/>
+      </w:pPr>
+    </w:lvl>
+  </w:abstractNum>
+  <w:abstractNum w:abstractNumId="5" w15:restartNumberingAfterBreak="0">
+    <w:nsid w:val="455E60FF"/>
+    <w:multiLevelType w:val="hybridMultilevel"/>
+    <w:tmpl w:val="5E648752"/>
+    <w:lvl w:ilvl="0" w:tplc="0C0A000F">
+      <w:start w:val="1"/>
+      <w:numFmt w:val="decimal"/>
+      <w:lvlText w:val="%1."/>
+      <w:lvlJc w:val="left"/>
+      <w:pPr>
+        <w:ind w:left="720" w:hanging="360"/>
+      </w:pPr>
+      <w:rPr>
+        <w:rFonts w:hint="default"/>
+      </w:rPr>
+    </w:lvl>
+    <w:lvl w:ilvl="1" w:tplc="0C0A0019" w:tentative="1">
+      <w:start w:val="1"/>
+      <w:numFmt w:val="lowerLetter"/>
+      <w:lvlText w:val="%2."/>
+      <w:lvlJc w:val="left"/>
+      <w:pPr>
+        <w:ind w:left="1440" w:hanging="360"/>
+      </w:pPr>
+    </w:lvl>
+    <w:lvl w:ilvl="2" w:tplc="0C0A001B" w:tentative="1">
+      <w:start w:val="1"/>
+      <w:numFmt w:val="lowerRoman"/>
+      <w:lvlText w:val="%3."/>
+      <w:lvlJc w:val="right"/>
+      <w:pPr>
+        <w:ind w:left="2160" w:hanging="180"/>
+      </w:pPr>
+    </w:lvl>
+    <w:lvl w:ilvl="3" w:tplc="0C0A000F" w:tentative="1">
+      <w:start w:val="1"/>
+      <w:numFmt w:val="decimal"/>
+      <w:lvlText w:val="%4."/>
+      <w:lvlJc w:val="left"/>
+      <w:pPr>
+        <w:ind w:left="2880" w:hanging="360"/>
+      </w:pPr>
+    </w:lvl>
+    <w:lvl w:ilvl="4" w:tplc="0C0A0019" w:tentative="1">
+      <w:start w:val="1"/>
+      <w:numFmt w:val="lowerLetter"/>
+      <w:lvlText w:val="%5."/>
+      <w:lvlJc w:val="left"/>
+      <w:pPr>
+        <w:ind w:left="3600" w:hanging="360"/>
+      </w:pPr>
+    </w:lvl>
+    <w:lvl w:ilvl="5" w:tplc="0C0A001B" w:tentative="1">
+      <w:start w:val="1"/>
+      <w:numFmt w:val="lowerRoman"/>
+      <w:lvlText w:val="%6."/>
+      <w:lvlJc w:val="right"/>
+      <w:pPr>
+        <w:ind w:left="4320" w:hanging="180"/>
+      </w:pPr>
+    </w:lvl>
+    <w:lvl w:ilvl="6" w:tplc="0C0A000F" w:tentative="1">
+      <w:start w:val="1"/>
+      <w:numFmt w:val="decimal"/>
+      <w:lvlText w:val="%7."/>
+      <w:lvlJc w:val="left"/>
+      <w:pPr>
+        <w:ind w:left="5040" w:hanging="360"/>
+      </w:pPr>
+    </w:lvl>
+    <w:lvl w:ilvl="7" w:tplc="0C0A0019" w:tentative="1">
+      <w:start w:val="1"/>
+      <w:numFmt w:val="lowerLetter"/>
+      <w:lvlText w:val="%8."/>
+      <w:lvlJc w:val="left"/>
+      <w:pPr>
+        <w:ind w:left="5760" w:hanging="360"/>
+      </w:pPr>
+    </w:lvl>
+    <w:lvl w:ilvl="8" w:tplc="0C0A001B" w:tentative="1">
+      <w:start w:val="1"/>
+      <w:numFmt w:val="lowerRoman"/>
+      <w:lvlText w:val="%9."/>
+      <w:lvlJc w:val="right"/>
+      <w:pPr>
+        <w:ind w:left="6480" w:hanging="180"/>
+      </w:pPr>
+    </w:lvl>
+  </w:abstractNum>
+  <w:abstractNum w:abstractNumId="6" w15:restartNumberingAfterBreak="0">
+    <w:nsid w:val="5E2A3319"/>
+    <w:multiLevelType w:val="hybridMultilevel"/>
+    <w:tmpl w:val="7E20F3A4"/>
+    <w:lvl w:ilvl="0" w:tplc="0C0A000F">
+      <w:start w:val="1"/>
+      <w:numFmt w:val="decimal"/>
+      <w:lvlText w:val="%1."/>
+      <w:lvlJc w:val="left"/>
+      <w:pPr>
+        <w:ind w:left="720" w:hanging="360"/>
+      </w:pPr>
+      <w:rPr>
+        <w:rFonts w:hint="default"/>
+      </w:rPr>
+    </w:lvl>
+    <w:lvl w:ilvl="1" w:tplc="0C0A0019" w:tentative="1">
+      <w:start w:val="1"/>
+      <w:numFmt w:val="lowerLetter"/>
+      <w:lvlText w:val="%2."/>
+      <w:lvlJc w:val="left"/>
+      <w:pPr>
+        <w:ind w:left="1440" w:hanging="360"/>
+      </w:pPr>
+    </w:lvl>
+    <w:lvl w:ilvl="2" w:tplc="0C0A001B" w:tentative="1">
+      <w:start w:val="1"/>
+      <w:numFmt w:val="lowerRoman"/>
+      <w:lvlText w:val="%3."/>
+      <w:lvlJc w:val="right"/>
+      <w:pPr>
+        <w:ind w:left="2160" w:hanging="180"/>
+      </w:pPr>
+    </w:lvl>
+    <w:lvl w:ilvl="3" w:tplc="0C0A000F" w:tentative="1">
+      <w:start w:val="1"/>
+      <w:numFmt w:val="decimal"/>
+      <w:lvlText w:val="%4."/>
+      <w:lvlJc w:val="left"/>
+      <w:pPr>
+        <w:ind w:left="2880" w:hanging="360"/>
+      </w:pPr>
+    </w:lvl>
+    <w:lvl w:ilvl="4" w:tplc="0C0A0019" w:tentative="1">
+      <w:start w:val="1"/>
+      <w:numFmt w:val="lowerLetter"/>
+      <w:lvlText w:val="%5."/>
+      <w:lvlJc w:val="left"/>
+      <w:pPr>
+        <w:ind w:left="3600" w:hanging="360"/>
+      </w:pPr>
+    </w:lvl>
+    <w:lvl w:ilvl="5" w:tplc="0C0A001B" w:tentative="1">
+      <w:start w:val="1"/>
+      <w:numFmt w:val="lowerRoman"/>
+      <w:lvlText w:val="%6."/>
+      <w:lvlJc w:val="right"/>
+      <w:pPr>
+        <w:ind w:left="4320" w:hanging="180"/>
+      </w:pPr>
+    </w:lvl>
+    <w:lvl w:ilvl="6" w:tplc="0C0A000F" w:tentative="1">
+      <w:start w:val="1"/>
+      <w:numFmt w:val="decimal"/>
+      <w:lvlText w:val="%7."/>
+      <w:lvlJc w:val="left"/>
+      <w:pPr>
+        <w:ind w:left="5040" w:hanging="360"/>
+      </w:pPr>
+    </w:lvl>
+    <w:lvl w:ilvl="7" w:tplc="0C0A0019" w:tentative="1">
+      <w:start w:val="1"/>
+      <w:numFmt w:val="lowerLetter"/>
+      <w:lvlText w:val="%8."/>
+      <w:lvlJc w:val="left"/>
+      <w:pPr>
+        <w:ind w:left="5760" w:hanging="360"/>
+      </w:pPr>
+    </w:lvl>
+    <w:lvl w:ilvl="8" w:tplc="0C0A001B" w:tentative="1">
+      <w:start w:val="1"/>
+      <w:numFmt w:val="lowerRoman"/>
+      <w:lvlText w:val="%9."/>
+      <w:lvlJc w:val="right"/>
+      <w:pPr>
+        <w:ind w:left="6480" w:hanging="180"/>
+      </w:pPr>
+    </w:lvl>
+  </w:abstractNum>
+  <w:abstractNum w:abstractNumId="7" w15:restartNumberingAfterBreak="0">
+    <w:nsid w:val="65246E26"/>
+    <w:multiLevelType w:val="hybridMultilevel"/>
+    <w:tmpl w:val="F3E4FD30"/>
+    <w:lvl w:ilvl="0" w:tplc="0C0A0001">
+      <w:start w:val="1"/>
+      <w:numFmt w:val="bullet"/>
+      <w:lvlText w:val=""/>
+      <w:lvlJc w:val="left"/>
+      <w:pPr>
+        <w:ind w:left="720" w:hanging="360"/>
+      </w:pPr>
+      <w:rPr>
+        <w:rFonts w:ascii="Symbol" w:hAnsi="Symbol" w:hint="default"/>
+      </w:rPr>
+    </w:lvl>
+    <w:lvl w:ilvl="1" w:tplc="0C0A0003" w:tentative="1">
+      <w:start w:val="1"/>
+      <w:numFmt w:val="bullet"/>
+      <w:lvlText w:val="o"/>
+      <w:lvlJc w:val="left"/>
+      <w:pPr>
+        <w:ind w:left="1440" w:hanging="360"/>
+      </w:pPr>
+      <w:rPr>
+        <w:rFonts w:ascii="Courier New" w:hAnsi="Courier New" w:cs="Courier New" w:hint="default"/>
+      </w:rPr>
+    </w:lvl>
+    <w:lvl w:ilvl="2" w:tplc="0C0A0005" w:tentative="1">
+      <w:start w:val="1"/>
+      <w:numFmt w:val="bullet"/>
+      <w:lvlText w:val=""/>
+      <w:lvlJc w:val="left"/>
+      <w:pPr>
+        <w:ind w:left="2160" w:hanging="360"/>
+      </w:pPr>
+      <w:rPr>
+        <w:rFonts w:ascii="Wingdings" w:hAnsi="Wingdings" w:hint="default"/>
+      </w:rPr>
+    </w:lvl>
+    <w:lvl w:ilvl="3" w:tplc="0C0A0001" w:tentative="1">
+      <w:start w:val="1"/>
+      <w:numFmt w:val="bullet"/>
+      <w:lvlText w:val=""/>
+      <w:lvlJc w:val="left"/>
+      <w:pPr>
+        <w:ind w:left="2880" w:hanging="360"/>
+      </w:pPr>
+      <w:rPr>
+        <w:rFonts w:ascii="Symbol" w:hAnsi="Symbol" w:hint="default"/>
+      </w:rPr>
+    </w:lvl>
+    <w:lvl w:ilvl="4" w:tplc="0C0A0003" w:tentative="1">
+      <w:start w:val="1"/>
+      <w:numFmt w:val="bullet"/>
+      <w:lvlText w:val="o"/>
+      <w:lvlJc w:val="left"/>
+      <w:pPr>
+        <w:ind w:left="3600" w:hanging="360"/>
+      </w:pPr>
+      <w:rPr>
+        <w:rFonts w:ascii="Courier New" w:hAnsi="Courier New" w:cs="Courier New" w:hint="default"/>
+      </w:rPr>
+    </w:lvl>
+    <w:lvl w:ilvl="5" w:tplc="0C0A0005" w:tentative="1">
+      <w:start w:val="1"/>
+      <w:numFmt w:val="bullet"/>
+      <w:lvlText w:val=""/>
+      <w:lvlJc w:val="left"/>
+      <w:pPr>
+        <w:ind w:left="4320" w:hanging="360"/>
+      </w:pPr>
+      <w:rPr>
+        <w:rFonts w:ascii="Wingdings" w:hAnsi="Wingdings" w:hint="default"/>
+      </w:rPr>
+    </w:lvl>
+    <w:lvl w:ilvl="6" w:tplc="0C0A0001" w:tentative="1">
+      <w:start w:val="1"/>
+      <w:numFmt w:val="bullet"/>
+      <w:lvlText w:val=""/>
+      <w:lvlJc w:val="left"/>
+      <w:pPr>
+        <w:ind w:left="5040" w:hanging="360"/>
+      </w:pPr>
+      <w:rPr>
+        <w:rFonts w:ascii="Symbol" w:hAnsi="Symbol" w:hint="default"/>
+      </w:rPr>
+    </w:lvl>
+    <w:lvl w:ilvl="7" w:tplc="0C0A0003" w:tentative="1">
+      <w:start w:val="1"/>
+      <w:numFmt w:val="bullet"/>
+      <w:lvlText w:val="o"/>
+      <w:lvlJc w:val="left"/>
+      <w:pPr>
+        <w:ind w:left="5760" w:hanging="360"/>
+      </w:pPr>
+      <w:rPr>
+        <w:rFonts w:ascii="Courier New" w:hAnsi="Courier New" w:cs="Courier New" w:hint="default"/>
+      </w:rPr>
+    </w:lvl>
+    <w:lvl w:ilvl="8" w:tplc="0C0A0005" w:tentative="1">
+      <w:start w:val="1"/>
+      <w:numFmt w:val="bullet"/>
+      <w:lvlText w:val=""/>
+      <w:lvlJc w:val="left"/>
+      <w:pPr>
+        <w:ind w:left="6480" w:hanging="360"/>
+      </w:pPr>
+      <w:rPr>
+        <w:rFonts w:ascii="Wingdings" w:hAnsi="Wingdings" w:hint="default"/>
+      </w:rPr>
+    </w:lvl>
+  </w:abstractNum>
+  <w:abstractNum w:abstractNumId="8" w15:restartNumberingAfterBreak="0">
+    <w:nsid w:val="6C3E4EDE"/>
+    <w:multiLevelType w:val="multilevel"/>
+    <w:tmpl w:val="0C0A001F"/>
+    <w:lvl w:ilvl="0">
+      <w:start w:val="1"/>
+      <w:numFmt w:val="decimal"/>
+      <w:lvlText w:val="%1."/>
+      <w:lvlJc w:val="left"/>
+      <w:pPr>
+        <w:ind w:left="360" w:hanging="360"/>
+      </w:pPr>
+    </w:lvl>
+    <w:lvl w:ilvl="1">
+      <w:start w:val="1"/>
+      <w:numFmt w:val="decimal"/>
+      <w:lvlText w:val="%1.%2."/>
+      <w:lvlJc w:val="left"/>
+      <w:pPr>
+        <w:ind w:left="792" w:hanging="432"/>
+      </w:pPr>
+    </w:lvl>
+    <w:lvl w:ilvl="2">
+      <w:start w:val="1"/>
+      <w:numFmt w:val="decimal"/>
+      <w:lvlText w:val="%1.%2.%3."/>
+      <w:lvlJc w:val="left"/>
+      <w:pPr>
+        <w:ind w:left="1224" w:hanging="504"/>
+      </w:pPr>
+    </w:lvl>
+    <w:lvl w:ilvl="3">
+      <w:start w:val="1"/>
+      <w:numFmt w:val="decimal"/>
+      <w:lvlText w:val="%1.%2.%3.%4."/>
+      <w:lvlJc w:val="left"/>
+      <w:pPr>
+        <w:ind w:left="1728" w:hanging="648"/>
+      </w:pPr>
+    </w:lvl>
+    <w:lvl w:ilvl="4">
+      <w:start w:val="1"/>
+      <w:numFmt w:val="decimal"/>
+      <w:lvlText w:val="%1.%2.%3.%4.%5."/>
+      <w:lvlJc w:val="left"/>
+      <w:pPr>
+        <w:ind w:left="2232" w:hanging="792"/>
+      </w:pPr>
+    </w:lvl>
+    <w:lvl w:ilvl="5">
+      <w:start w:val="1"/>
+      <w:numFmt w:val="decimal"/>
+      <w:lvlText w:val="%1.%2.%3.%4.%5.%6."/>
+      <w:lvlJc w:val="left"/>
+      <w:pPr>
+        <w:ind w:left="2736" w:hanging="936"/>
+      </w:pPr>
+    </w:lvl>
+    <w:lvl w:ilvl="6">
+      <w:start w:val="1"/>
+      <w:numFmt w:val="decimal"/>
+      <w:lvlText w:val="%1.%2.%3.%4.%5.%6.%7."/>
+      <w:lvlJc w:val="left"/>
+      <w:pPr>
+        <w:ind w:left="3240" w:hanging="1080"/>
+      </w:pPr>
+    </w:lvl>
+    <w:lvl w:ilvl="7">
+      <w:start w:val="1"/>
+      <w:numFmt w:val="decimal"/>
+      <w:lvlText w:val="%1.%2.%3.%4.%5.%6.%7.%8."/>
+      <w:lvlJc w:val="left"/>
+      <w:pPr>
+        <w:ind w:left="3744" w:hanging="1224"/>
+      </w:pPr>
+    </w:lvl>
+    <w:lvl w:ilvl="8">
+      <w:start w:val="1"/>
+      <w:numFmt w:val="decimal"/>
+      <w:lvlText w:val="%1.%2.%3.%4.%5.%6.%7.%8.%9."/>
+      <w:lvlJc w:val="left"/>
+      <w:pPr>
+        <w:ind w:left="4320" w:hanging="1440"/>
+      </w:pPr>
+    </w:lvl>
+  </w:abstractNum>
+  <w:abstractNum w:abstractNumId="9" w15:restartNumberingAfterBreak="0">
+    <w:nsid w:val="73A13C94"/>
+    <w:multiLevelType w:val="multilevel"/>
+    <w:tmpl w:val="0C0A001F"/>
+    <w:lvl w:ilvl="0">
+      <w:start w:val="1"/>
+      <w:numFmt w:val="decimal"/>
+      <w:lvlText w:val="%1."/>
+      <w:lvlJc w:val="left"/>
+      <w:pPr>
+        <w:ind w:left="360" w:hanging="360"/>
+      </w:pPr>
+    </w:lvl>
+    <w:lvl w:ilvl="1">
+      <w:start w:val="1"/>
+      <w:numFmt w:val="decimal"/>
+      <w:lvlText w:val="%1.%2."/>
+      <w:lvlJc w:val="left"/>
+      <w:pPr>
+        <w:ind w:left="792" w:hanging="432"/>
+      </w:pPr>
+    </w:lvl>
+    <w:lvl w:ilvl="2">
+      <w:start w:val="1"/>
+      <w:numFmt w:val="decimal"/>
+      <w:lvlText w:val="%1.%2.%3."/>
+      <w:lvlJc w:val="left"/>
+      <w:pPr>
+        <w:ind w:left="1224" w:hanging="504"/>
+      </w:pPr>
+    </w:lvl>
+    <w:lvl w:ilvl="3">
+      <w:start w:val="1"/>
+      <w:numFmt w:val="decimal"/>
+      <w:lvlText w:val="%1.%2.%3.%4."/>
+      <w:lvlJc w:val="left"/>
+      <w:pPr>
+        <w:ind w:left="1728" w:hanging="648"/>
+      </w:pPr>
+    </w:lvl>
+    <w:lvl w:ilvl="4">
+      <w:start w:val="1"/>
+      <w:numFmt w:val="decimal"/>
+      <w:lvlText w:val="%1.%2.%3.%4.%5."/>
+      <w:lvlJc w:val="left"/>
+      <w:pPr>
+        <w:ind w:left="2232" w:hanging="792"/>
+      </w:pPr>
+    </w:lvl>
+    <w:lvl w:ilvl="5">
+      <w:start w:val="1"/>
+      <w:numFmt w:val="decimal"/>
+      <w:lvlText w:val="%1.%2.%3.%4.%5.%6."/>
+      <w:lvlJc w:val="left"/>
+      <w:pPr>
+        <w:ind w:left="2736" w:hanging="936"/>
+      </w:pPr>
+    </w:lvl>
+    <w:lvl w:ilvl="6">
+      <w:start w:val="1"/>
+      <w:numFmt w:val="decimal"/>
+      <w:lvlText w:val="%1.%2.%3.%4.%5.%6.%7."/>
+      <w:lvlJc w:val="left"/>
+      <w:pPr>
+        <w:ind w:left="3240" w:hanging="1080"/>
+      </w:pPr>
+    </w:lvl>
+    <w:lvl w:ilvl="7">
+      <w:start w:val="1"/>
+      <w:numFmt w:val="decimal"/>
+      <w:lvlText w:val="%1.%2.%3.%4.%5.%6.%7.%8."/>
+      <w:lvlJc w:val="left"/>
+      <w:pPr>
+        <w:ind w:left="3744" w:hanging="1224"/>
+      </w:pPr>
+    </w:lvl>
+    <w:lvl w:ilvl="8">
+      <w:start w:val="1"/>
+      <w:numFmt w:val="decimal"/>
+      <w:lvlText w:val="%1.%2.%3.%4.%5.%6.%7.%8.%9."/>
+      <w:lvlJc w:val="left"/>
+      <w:pPr>
+        <w:ind w:left="4320" w:hanging="1440"/>
+      </w:pPr>
+    </w:lvl>
+  </w:abstractNum>
+  <w:abstractNum w:abstractNumId="10" w15:restartNumberingAfterBreak="0">
+    <w:nsid w:val="7DF8610F"/>
+    <w:multiLevelType w:val="hybridMultilevel"/>
+    <w:tmpl w:val="87C41088"/>
+    <w:lvl w:ilvl="0" w:tplc="82CEBB42">
+      <w:start w:val="2"/>
+      <w:numFmt w:val="decimal"/>
+      <w:lvlText w:val="%1"/>
+      <w:lvlJc w:val="left"/>
+      <w:pPr>
+        <w:ind w:left="720" w:hanging="360"/>
+      </w:pPr>
+      <w:rPr>
+        <w:rFonts w:hint="default"/>
+      </w:rPr>
+    </w:lvl>
+    <w:lvl w:ilvl="1" w:tplc="0C0A0019" w:tentative="1">
+      <w:start w:val="1"/>
+      <w:numFmt w:val="lowerLetter"/>
+      <w:lvlText w:val="%2."/>
+      <w:lvlJc w:val="left"/>
+      <w:pPr>
+        <w:ind w:left="1440" w:hanging="360"/>
+      </w:pPr>
+    </w:lvl>
+    <w:lvl w:ilvl="2" w:tplc="0C0A001B" w:tentative="1">
+      <w:start w:val="1"/>
+      <w:numFmt w:val="lowerRoman"/>
+      <w:lvlText w:val="%3."/>
+      <w:lvlJc w:val="right"/>
+      <w:pPr>
+        <w:ind w:left="2160" w:hanging="180"/>
+      </w:pPr>
+    </w:lvl>
+    <w:lvl w:ilvl="3" w:tplc="0C0A000F" w:tentative="1">
+      <w:start w:val="1"/>
+      <w:numFmt w:val="decimal"/>
+      <w:lvlText w:val="%4."/>
+      <w:lvlJc w:val="left"/>
+      <w:pPr>
+        <w:ind w:left="2880" w:hanging="360"/>
+      </w:pPr>
+    </w:lvl>
+    <w:lvl w:ilvl="4" w:tplc="0C0A0019" w:tentative="1">
+      <w:start w:val="1"/>
+      <w:numFmt w:val="lowerLetter"/>
+      <w:lvlText w:val="%5."/>
+      <w:lvlJc w:val="left"/>
+      <w:pPr>
+        <w:ind w:left="3600" w:hanging="360"/>
+      </w:pPr>
+    </w:lvl>
+    <w:lvl w:ilvl="5" w:tplc="0C0A001B" w:tentative="1">
+      <w:start w:val="1"/>
+      <w:numFmt w:val="lowerRoman"/>
+      <w:lvlText w:val="%6."/>
+      <w:lvlJc w:val="right"/>
+      <w:pPr>
+        <w:ind w:left="4320" w:hanging="180"/>
+      </w:pPr>
+    </w:lvl>
+    <w:lvl w:ilvl="6" w:tplc="0C0A000F" w:tentative="1">
+      <w:start w:val="1"/>
+      <w:numFmt w:val="decimal"/>
+      <w:lvlText w:val="%7."/>
+      <w:lvlJc w:val="left"/>
+      <w:pPr>
+        <w:ind w:left="5040" w:hanging="360"/>
+      </w:pPr>
+    </w:lvl>
+    <w:lvl w:ilvl="7" w:tplc="0C0A0019" w:tentative="1">
+      <w:start w:val="1"/>
+      <w:numFmt w:val="lowerLetter"/>
+      <w:lvlText w:val="%8."/>
+      <w:lvlJc w:val="left"/>
+      <w:pPr>
+        <w:ind w:left="5760" w:hanging="360"/>
+      </w:pPr>
+    </w:lvl>
+    <w:lvl w:ilvl="8" w:tplc="0C0A001B" w:tentative="1">
+      <w:start w:val="1"/>
+      <w:numFmt w:val="lowerRoman"/>
+      <w:lvlText w:val="%9."/>
+      <w:lvlJc w:val="right"/>
+      <w:pPr>
+        <w:ind w:left="6480" w:hanging="180"/>
+      </w:pPr>
+    </w:lvl>
+  </w:abstractNum>
+  <w:num w:numId="1" w16cid:durableId="2034067891">
+    <w:abstractNumId w:val="4"/>
+  </w:num>
+  <w:num w:numId="2" w16cid:durableId="858394404">
+    <w:abstractNumId w:val="0"/>
+  </w:num>
+  <w:num w:numId="3" w16cid:durableId="2143302085">
+    <w:abstractNumId w:val="1"/>
+  </w:num>
+  <w:num w:numId="4" w16cid:durableId="328797445">
+    <w:abstractNumId w:val="1"/>
+  </w:num>
+  <w:num w:numId="5" w16cid:durableId="937130264">
+    <w:abstractNumId w:val="1"/>
+  </w:num>
+  <w:num w:numId="6" w16cid:durableId="1637222232">
+    <w:abstractNumId w:val="1"/>
+  </w:num>
+  <w:num w:numId="7" w16cid:durableId="1852185790">
+    <w:abstractNumId w:val="1"/>
+  </w:num>
+  <w:num w:numId="8" w16cid:durableId="1591701034">
+    <w:abstractNumId w:val="1"/>
+  </w:num>
+  <w:num w:numId="9" w16cid:durableId="457725252">
+    <w:abstractNumId w:val="1"/>
+  </w:num>
+  <w:num w:numId="10" w16cid:durableId="1301227990">
+    <w:abstractNumId w:val="1"/>
+  </w:num>
+  <w:num w:numId="11" w16cid:durableId="644045631">
+    <w:abstractNumId w:val="1"/>
+  </w:num>
+  <w:num w:numId="12" w16cid:durableId="1269432323">
+    <w:abstractNumId w:val="1"/>
+  </w:num>
+  <w:num w:numId="13" w16cid:durableId="220822917">
+    <w:abstractNumId w:val="1"/>
+  </w:num>
+  <w:num w:numId="14" w16cid:durableId="1184049671">
+    <w:abstractNumId w:val="1"/>
+  </w:num>
+  <w:num w:numId="15" w16cid:durableId="1686859818">
+    <w:abstractNumId w:val="1"/>
+  </w:num>
+  <w:num w:numId="16" w16cid:durableId="1239636193">
+    <w:abstractNumId w:val="1"/>
+  </w:num>
+  <w:num w:numId="17" w16cid:durableId="1152873571">
+    <w:abstractNumId w:val="1"/>
+  </w:num>
+  <w:num w:numId="18" w16cid:durableId="377894900">
+    <w:abstractNumId w:val="1"/>
+  </w:num>
+  <w:num w:numId="19" w16cid:durableId="939145795">
+    <w:abstractNumId w:val="1"/>
+  </w:num>
+  <w:num w:numId="20" w16cid:durableId="1872379092">
+    <w:abstractNumId w:val="1"/>
+  </w:num>
+  <w:num w:numId="21" w16cid:durableId="1992517146">
+    <w:abstractNumId w:val="1"/>
+  </w:num>
+  <w:num w:numId="22" w16cid:durableId="1004436757">
+    <w:abstractNumId w:val="1"/>
+  </w:num>
+  <w:num w:numId="23" w16cid:durableId="606427502">
+    <w:abstractNumId w:val="1"/>
+  </w:num>
+  <w:num w:numId="24" w16cid:durableId="1063530813">
+    <w:abstractNumId w:val="1"/>
+  </w:num>
+  <w:num w:numId="25" w16cid:durableId="1017465530">
+    <w:abstractNumId w:val="1"/>
+  </w:num>
+  <w:num w:numId="26" w16cid:durableId="1836647609">
+    <w:abstractNumId w:val="1"/>
+  </w:num>
+  <w:num w:numId="27" w16cid:durableId="676275574">
+    <w:abstractNumId w:val="1"/>
+  </w:num>
+  <w:num w:numId="28" w16cid:durableId="1388644420">
+    <w:abstractNumId w:val="1"/>
+  </w:num>
+  <w:num w:numId="29" w16cid:durableId="1468666964">
+    <w:abstractNumId w:val="1"/>
+  </w:num>
+  <w:num w:numId="30" w16cid:durableId="430515839">
+    <w:abstractNumId w:val="1"/>
+  </w:num>
+  <w:num w:numId="31" w16cid:durableId="1098604387">
+    <w:abstractNumId w:val="1"/>
+  </w:num>
+  <w:num w:numId="32" w16cid:durableId="541598745">
+    <w:abstractNumId w:val="1"/>
+  </w:num>
+  <w:num w:numId="33" w16cid:durableId="874734616">
+    <w:abstractNumId w:val="1"/>
+  </w:num>
+  <w:num w:numId="34" w16cid:durableId="1169561325">
+    <w:abstractNumId w:val="1"/>
+  </w:num>
+  <w:num w:numId="35" w16cid:durableId="1464343843">
+    <w:abstractNumId w:val="1"/>
+  </w:num>
+  <w:num w:numId="36" w16cid:durableId="1703438837">
+    <w:abstractNumId w:val="1"/>
+  </w:num>
+  <w:num w:numId="37" w16cid:durableId="284773268">
+    <w:abstractNumId w:val="1"/>
+  </w:num>
+  <w:num w:numId="38" w16cid:durableId="1216504695">
+    <w:abstractNumId w:val="1"/>
+  </w:num>
+  <w:num w:numId="39" w16cid:durableId="302665675">
+    <w:abstractNumId w:val="1"/>
+  </w:num>
+  <w:num w:numId="40" w16cid:durableId="1155995593">
+    <w:abstractNumId w:val="1"/>
+  </w:num>
+  <w:num w:numId="41" w16cid:durableId="1653024233">
+    <w:abstractNumId w:val="1"/>
+  </w:num>
+  <w:num w:numId="42" w16cid:durableId="809714061">
+    <w:abstractNumId w:val="1"/>
+  </w:num>
+  <w:num w:numId="43" w16cid:durableId="1730569668">
+    <w:abstractNumId w:val="1"/>
+  </w:num>
+  <w:num w:numId="44" w16cid:durableId="777868264">
+    <w:abstractNumId w:val="1"/>
+  </w:num>
+  <w:num w:numId="45" w16cid:durableId="1174029237">
+    <w:abstractNumId w:val="1"/>
+  </w:num>
+  <w:num w:numId="46" w16cid:durableId="314379998">
+    <w:abstractNumId w:val="1"/>
+  </w:num>
+  <w:num w:numId="47" w16cid:durableId="1686789047">
+    <w:abstractNumId w:val="1"/>
+  </w:num>
+  <w:num w:numId="48" w16cid:durableId="967053150">
+    <w:abstractNumId w:val="1"/>
+  </w:num>
+  <w:num w:numId="49" w16cid:durableId="1592664610">
+    <w:abstractNumId w:val="1"/>
+  </w:num>
+  <w:num w:numId="50" w16cid:durableId="1715084563">
+    <w:abstractNumId w:val="1"/>
+  </w:num>
+  <w:num w:numId="51" w16cid:durableId="483468886">
+    <w:abstractNumId w:val="7"/>
+  </w:num>
+  <w:num w:numId="52" w16cid:durableId="1842312576">
+    <w:abstractNumId w:val="9"/>
+  </w:num>
+  <w:num w:numId="53" w16cid:durableId="1965307783">
+    <w:abstractNumId w:val="8"/>
+  </w:num>
+  <w:num w:numId="54" w16cid:durableId="1224367675">
+    <w:abstractNumId w:val="3"/>
+  </w:num>
+  <w:num w:numId="55" w16cid:durableId="1249845438">
+    <w:abstractNumId w:val="6"/>
+  </w:num>
+  <w:num w:numId="56" w16cid:durableId="294992634">
+    <w:abstractNumId w:val="10"/>
+  </w:num>
+  <w:num w:numId="57" w16cid:durableId="456988854">
+    <w:abstractNumId w:val="5"/>
+  </w:num>
+  <w:num w:numId="58" w16cid:durableId="280889026">
+    <w:abstractNumId w:val="2"/>
+  </w:num>
+</w:numbering>
+</file>
+
 <file path=word/styles.xml><?xml version="1.0" encoding="utf-8"?>
 <w:styles xmlns:mc="http://schemas.openxmlformats.org/markup-compatibility/2006" xmlns:r="http://schemas.openxmlformats.org/officeDocument/2006/relationships" xmlns:w="http://schemas.openxmlformats.org/wordprocessingml/2006/main" xmlns:w14="http://schemas.microsoft.com/office/word/2010/wordml" xmlns:w15="http://schemas.microsoft.com/office/word/2012/wordml" xmlns:w16cex="http://schemas.microsoft.com/office/word/2018/wordml/cex" xmlns:w16cid="http://schemas.microsoft.com/office/word/2016/wordml/cid" xmlns:w16="http://schemas.microsoft.com/office/word/2018/wordml" xmlns:w16du="http://schemas.microsoft.com/office/word/2023/wordml/word16du" xmlns:w16sdtdh="http://schemas.microsoft.com/office/word/2020/wordml/sdtdatahash" xmlns:w16se="http://schemas.microsoft.com/office/word/2015/wordml/symex" mc:Ignorable="w14 w15 w16se w16cid w16 w16cex w16sdtdh w16du">
   <w:docDefaults>
     <w:rPrDefault>
       <w:rPr>
-        <w:rFonts w:asciiTheme="minorHAnsi" w:eastAsiaTheme="minorHAnsi" w:hAnsiTheme="minorHAnsi" w:cstheme="minorBidi"/>
-        <w:kern w:val="2"/>
-        <w:sz w:val="24"/>
-        <w:szCs w:val="24"/>
+        <w:rFonts w:asciiTheme="minorHAnsi" w:eastAsiaTheme="minorEastAsia" w:hAnsiTheme="minorHAnsi" w:cstheme="minorBidi"/>
+        <w:sz w:val="22"/>
+        <w:szCs w:val="22"/>
         <w:lang w:val="es-ES" w:eastAsia="en-US" w:bidi="ar-SA"/>
-        <w14:ligatures w14:val="standardContextual"/>
       </w:rPr>
     </w:rPrDefault>
     <w:pPrDefault>
       <w:pPr>
-        <w:spacing w:after="160" w:line="278" w:lineRule="auto"/>
+        <w:spacing w:after="160" w:line="259" w:lineRule="auto"/>
       </w:pPr>
     </w:pPrDefault>
   </w:docDefaults>
@@ -1653,7 +3241,7 @@
     <w:lsdException w:name="Closing" w:semiHidden="1" w:unhideWhenUsed="1"/>
     <w:lsdException w:name="Signature" w:semiHidden="1" w:unhideWhenUsed="1"/>
     <w:lsdException w:name="Default Paragraph Font" w:semiHidden="1" w:uiPriority="1" w:unhideWhenUsed="1"/>
-    <w:lsdException w:name="Body Text" w:semiHidden="1" w:uiPriority="1" w:unhideWhenUsed="1" w:qFormat="1"/>
+    <w:lsdException w:name="Body Text" w:semiHidden="1" w:uiPriority="1" w:unhideWhenUsed="1"/>
     <w:lsdException w:name="Body Text Indent" w:semiHidden="1" w:unhideWhenUsed="1"/>
     <w:lsdException w:name="List Continue" w:semiHidden="1" w:unhideWhenUsed="1"/>
     <w:lsdException w:name="List Continue 2" w:semiHidden="1" w:unhideWhenUsed="1"/>
@@ -1967,20 +3555,7 @@
   <w:style w:type="paragraph" w:default="1" w:styleId="Normal">
     <w:name w:val="Normal"/>
     <w:qFormat/>
-    <w:rsid w:val="00B409B5"/>
-    <w:pPr>
-      <w:widowControl w:val="0"/>
-      <w:autoSpaceDE w:val="0"/>
-      <w:autoSpaceDN w:val="0"/>
-      <w:spacing w:after="0" w:line="240" w:lineRule="auto"/>
-    </w:pPr>
-    <w:rPr>
-      <w:rFonts w:ascii="Arial MT" w:eastAsia="Arial MT" w:hAnsi="Arial MT" w:cs="Arial MT"/>
-      <w:kern w:val="0"/>
-      <w:sz w:val="22"/>
-      <w:szCs w:val="22"/>
-      <w14:ligatures w14:val="none"/>
-    </w:rPr>
+    <w:rsid w:val="00782010"/>
   </w:style>
   <w:style w:type="paragraph" w:styleId="Ttulo1">
     <w:name w:val="heading 1"/>
@@ -1989,18 +3564,27 @@
     <w:link w:val="Ttulo1Car"/>
     <w:uiPriority w:val="9"/>
     <w:qFormat/>
-    <w:rsid w:val="00851405"/>
+    <w:rsid w:val="00782010"/>
     <w:pPr>
       <w:keepNext/>
       <w:keepLines/>
-      <w:spacing w:before="360" w:after="80"/>
+      <w:numPr>
+        <w:numId w:val="42"/>
+      </w:numPr>
+      <w:pBdr>
+        <w:bottom w:val="single" w:sz="4" w:space="1" w:color="595959" w:themeColor="text1" w:themeTint="A6"/>
+      </w:pBdr>
+      <w:spacing w:before="360"/>
       <w:outlineLvl w:val="0"/>
     </w:pPr>
     <w:rPr>
       <w:rFonts w:asciiTheme="majorHAnsi" w:eastAsiaTheme="majorEastAsia" w:hAnsiTheme="majorHAnsi" w:cstheme="majorBidi"/>
-      <w:color w:val="0F4761" w:themeColor="accent1" w:themeShade="BF"/>
-      <w:sz w:val="40"/>
-      <w:szCs w:val="40"/>
+      <w:b/>
+      <w:bCs/>
+      <w:smallCaps/>
+      <w:color w:val="000000" w:themeColor="text1"/>
+      <w:sz w:val="36"/>
+      <w:szCs w:val="36"/>
     </w:rPr>
   </w:style>
   <w:style w:type="paragraph" w:styleId="Ttulo2">
@@ -2012,18 +3596,25 @@
     <w:semiHidden/>
     <w:unhideWhenUsed/>
     <w:qFormat/>
-    <w:rsid w:val="00851405"/>
+    <w:rsid w:val="00782010"/>
     <w:pPr>
       <w:keepNext/>
       <w:keepLines/>
-      <w:spacing w:before="160" w:after="80"/>
+      <w:numPr>
+        <w:ilvl w:val="1"/>
+        <w:numId w:val="42"/>
+      </w:numPr>
+      <w:spacing w:before="360" w:after="0"/>
       <w:outlineLvl w:val="1"/>
     </w:pPr>
     <w:rPr>
       <w:rFonts w:asciiTheme="majorHAnsi" w:eastAsiaTheme="majorEastAsia" w:hAnsiTheme="majorHAnsi" w:cstheme="majorBidi"/>
-      <w:color w:val="0F4761" w:themeColor="accent1" w:themeShade="BF"/>
-      <w:sz w:val="32"/>
-      <w:szCs w:val="32"/>
+      <w:b/>
+      <w:bCs/>
+      <w:smallCaps/>
+      <w:color w:val="000000" w:themeColor="text1"/>
+      <w:sz w:val="28"/>
+      <w:szCs w:val="28"/>
     </w:rPr>
   </w:style>
   <w:style w:type="paragraph" w:styleId="Ttulo3">
@@ -2032,21 +3623,24 @@
     <w:next w:val="Normal"/>
     <w:link w:val="Ttulo3Car"/>
     <w:uiPriority w:val="9"/>
-    <w:semiHidden/>
     <w:unhideWhenUsed/>
     <w:qFormat/>
-    <w:rsid w:val="00851405"/>
+    <w:rsid w:val="00782010"/>
     <w:pPr>
       <w:keepNext/>
       <w:keepLines/>
-      <w:spacing w:before="160" w:after="80"/>
+      <w:numPr>
+        <w:ilvl w:val="2"/>
+        <w:numId w:val="42"/>
+      </w:numPr>
+      <w:spacing w:before="200" w:after="0"/>
       <w:outlineLvl w:val="2"/>
     </w:pPr>
     <w:rPr>
-      <w:rFonts w:eastAsiaTheme="majorEastAsia" w:cstheme="majorBidi"/>
-      <w:color w:val="0F4761" w:themeColor="accent1" w:themeShade="BF"/>
-      <w:sz w:val="28"/>
-      <w:szCs w:val="28"/>
+      <w:rFonts w:asciiTheme="majorHAnsi" w:eastAsiaTheme="majorEastAsia" w:hAnsiTheme="majorHAnsi" w:cstheme="majorBidi"/>
+      <w:b/>
+      <w:bCs/>
+      <w:color w:val="000000" w:themeColor="text1"/>
     </w:rPr>
   </w:style>
   <w:style w:type="paragraph" w:styleId="Ttulo4">
@@ -2058,18 +3652,24 @@
     <w:semiHidden/>
     <w:unhideWhenUsed/>
     <w:qFormat/>
-    <w:rsid w:val="00851405"/>
+    <w:rsid w:val="00782010"/>
     <w:pPr>
       <w:keepNext/>
       <w:keepLines/>
-      <w:spacing w:before="80" w:after="40"/>
+      <w:numPr>
+        <w:ilvl w:val="3"/>
+        <w:numId w:val="42"/>
+      </w:numPr>
+      <w:spacing w:before="200" w:after="0"/>
       <w:outlineLvl w:val="3"/>
     </w:pPr>
     <w:rPr>
-      <w:rFonts w:eastAsiaTheme="majorEastAsia" w:cstheme="majorBidi"/>
+      <w:rFonts w:asciiTheme="majorHAnsi" w:eastAsiaTheme="majorEastAsia" w:hAnsiTheme="majorHAnsi" w:cstheme="majorBidi"/>
+      <w:b/>
+      <w:bCs/>
       <w:i/>
       <w:iCs/>
-      <w:color w:val="0F4761" w:themeColor="accent1" w:themeShade="BF"/>
+      <w:color w:val="000000" w:themeColor="text1"/>
     </w:rPr>
   </w:style>
   <w:style w:type="paragraph" w:styleId="Ttulo5">
@@ -2081,16 +3681,20 @@
     <w:semiHidden/>
     <w:unhideWhenUsed/>
     <w:qFormat/>
-    <w:rsid w:val="00851405"/>
+    <w:rsid w:val="00782010"/>
     <w:pPr>
       <w:keepNext/>
       <w:keepLines/>
-      <w:spacing w:before="80" w:after="40"/>
+      <w:numPr>
+        <w:ilvl w:val="4"/>
+        <w:numId w:val="42"/>
+      </w:numPr>
+      <w:spacing w:before="200" w:after="0"/>
       <w:outlineLvl w:val="4"/>
     </w:pPr>
     <w:rPr>
-      <w:rFonts w:eastAsiaTheme="majorEastAsia" w:cstheme="majorBidi"/>
-      <w:color w:val="0F4761" w:themeColor="accent1" w:themeShade="BF"/>
+      <w:rFonts w:asciiTheme="majorHAnsi" w:eastAsiaTheme="majorEastAsia" w:hAnsiTheme="majorHAnsi" w:cstheme="majorBidi"/>
+      <w:color w:val="17365D" w:themeColor="text2" w:themeShade="BF"/>
     </w:rPr>
   </w:style>
   <w:style w:type="paragraph" w:styleId="Ttulo6">
@@ -2102,18 +3706,22 @@
     <w:semiHidden/>
     <w:unhideWhenUsed/>
     <w:qFormat/>
-    <w:rsid w:val="00851405"/>
+    <w:rsid w:val="00782010"/>
     <w:pPr>
       <w:keepNext/>
       <w:keepLines/>
-      <w:spacing w:before="40"/>
+      <w:numPr>
+        <w:ilvl w:val="5"/>
+        <w:numId w:val="42"/>
+      </w:numPr>
+      <w:spacing w:before="200" w:after="0"/>
       <w:outlineLvl w:val="5"/>
     </w:pPr>
     <w:rPr>
-      <w:rFonts w:eastAsiaTheme="majorEastAsia" w:cstheme="majorBidi"/>
+      <w:rFonts w:asciiTheme="majorHAnsi" w:eastAsiaTheme="majorEastAsia" w:hAnsiTheme="majorHAnsi" w:cstheme="majorBidi"/>
       <w:i/>
       <w:iCs/>
-      <w:color w:val="595959" w:themeColor="text1" w:themeTint="A6"/>
+      <w:color w:val="17365D" w:themeColor="text2" w:themeShade="BF"/>
     </w:rPr>
   </w:style>
   <w:style w:type="paragraph" w:styleId="Ttulo7">
@@ -2125,16 +3733,22 @@
     <w:semiHidden/>
     <w:unhideWhenUsed/>
     <w:qFormat/>
-    <w:rsid w:val="00851405"/>
+    <w:rsid w:val="00782010"/>
     <w:pPr>
       <w:keepNext/>
       <w:keepLines/>
-      <w:spacing w:before="40"/>
+      <w:numPr>
+        <w:ilvl w:val="6"/>
+        <w:numId w:val="42"/>
+      </w:numPr>
+      <w:spacing w:before="200" w:after="0"/>
       <w:outlineLvl w:val="6"/>
     </w:pPr>
     <w:rPr>
-      <w:rFonts w:eastAsiaTheme="majorEastAsia" w:cstheme="majorBidi"/>
-      <w:color w:val="595959" w:themeColor="text1" w:themeTint="A6"/>
+      <w:rFonts w:asciiTheme="majorHAnsi" w:eastAsiaTheme="majorEastAsia" w:hAnsiTheme="majorHAnsi" w:cstheme="majorBidi"/>
+      <w:i/>
+      <w:iCs/>
+      <w:color w:val="404040" w:themeColor="text1" w:themeTint="BF"/>
     </w:rPr>
   </w:style>
   <w:style w:type="paragraph" w:styleId="Ttulo8">
@@ -2146,17 +3760,22 @@
     <w:semiHidden/>
     <w:unhideWhenUsed/>
     <w:qFormat/>
-    <w:rsid w:val="00851405"/>
+    <w:rsid w:val="00782010"/>
     <w:pPr>
       <w:keepNext/>
       <w:keepLines/>
+      <w:numPr>
+        <w:ilvl w:val="7"/>
+        <w:numId w:val="42"/>
+      </w:numPr>
+      <w:spacing w:before="200" w:after="0"/>
       <w:outlineLvl w:val="7"/>
     </w:pPr>
     <w:rPr>
-      <w:rFonts w:eastAsiaTheme="majorEastAsia" w:cstheme="majorBidi"/>
-      <w:i/>
-      <w:iCs/>
-      <w:color w:val="272727" w:themeColor="text1" w:themeTint="D8"/>
+      <w:rFonts w:asciiTheme="majorHAnsi" w:eastAsiaTheme="majorEastAsia" w:hAnsiTheme="majorHAnsi" w:cstheme="majorBidi"/>
+      <w:color w:val="404040" w:themeColor="text1" w:themeTint="BF"/>
+      <w:sz w:val="20"/>
+      <w:szCs w:val="20"/>
     </w:rPr>
   </w:style>
   <w:style w:type="paragraph" w:styleId="Ttulo9">
@@ -2168,20 +3787,30 @@
     <w:semiHidden/>
     <w:unhideWhenUsed/>
     <w:qFormat/>
-    <w:rsid w:val="00851405"/>
+    <w:rsid w:val="00782010"/>
     <w:pPr>
       <w:keepNext/>
       <w:keepLines/>
+      <w:numPr>
+        <w:ilvl w:val="8"/>
+        <w:numId w:val="42"/>
+      </w:numPr>
+      <w:spacing w:before="200" w:after="0"/>
       <w:outlineLvl w:val="8"/>
     </w:pPr>
     <w:rPr>
-      <w:rFonts w:eastAsiaTheme="majorEastAsia" w:cstheme="majorBidi"/>
-      <w:color w:val="272727" w:themeColor="text1" w:themeTint="D8"/>
+      <w:rFonts w:asciiTheme="majorHAnsi" w:eastAsiaTheme="majorEastAsia" w:hAnsiTheme="majorHAnsi" w:cstheme="majorBidi"/>
+      <w:i/>
+      <w:iCs/>
+      <w:color w:val="404040" w:themeColor="text1" w:themeTint="BF"/>
+      <w:sz w:val="20"/>
+      <w:szCs w:val="20"/>
     </w:rPr>
   </w:style>
   <w:style w:type="character" w:default="1" w:styleId="Fuentedeprrafopredeter">
     <w:name w:val="Default Paragraph Font"/>
     <w:uiPriority w:val="1"/>
+    <w:semiHidden/>
     <w:unhideWhenUsed/>
   </w:style>
   <w:style w:type="table" w:default="1" w:styleId="Tablanormal">
@@ -2210,12 +3839,15 @@
     <w:basedOn w:val="Fuentedeprrafopredeter"/>
     <w:link w:val="Ttulo1"/>
     <w:uiPriority w:val="9"/>
-    <w:rsid w:val="00851405"/>
+    <w:rsid w:val="00782010"/>
     <w:rPr>
       <w:rFonts w:asciiTheme="majorHAnsi" w:eastAsiaTheme="majorEastAsia" w:hAnsiTheme="majorHAnsi" w:cstheme="majorBidi"/>
-      <w:color w:val="0F4761" w:themeColor="accent1" w:themeShade="BF"/>
-      <w:sz w:val="40"/>
-      <w:szCs w:val="40"/>
+      <w:b/>
+      <w:bCs/>
+      <w:smallCaps/>
+      <w:color w:val="000000" w:themeColor="text1"/>
+      <w:sz w:val="36"/>
+      <w:szCs w:val="36"/>
     </w:rPr>
   </w:style>
   <w:style w:type="character" w:customStyle="1" w:styleId="Ttulo2Car">
@@ -2224,12 +3856,15 @@
     <w:link w:val="Ttulo2"/>
     <w:uiPriority w:val="9"/>
     <w:semiHidden/>
-    <w:rsid w:val="00851405"/>
+    <w:rsid w:val="00782010"/>
     <w:rPr>
       <w:rFonts w:asciiTheme="majorHAnsi" w:eastAsiaTheme="majorEastAsia" w:hAnsiTheme="majorHAnsi" w:cstheme="majorBidi"/>
-      <w:color w:val="0F4761" w:themeColor="accent1" w:themeShade="BF"/>
-      <w:sz w:val="32"/>
-      <w:szCs w:val="32"/>
+      <w:b/>
+      <w:bCs/>
+      <w:smallCaps/>
+      <w:color w:val="000000" w:themeColor="text1"/>
+      <w:sz w:val="28"/>
+      <w:szCs w:val="28"/>
     </w:rPr>
   </w:style>
   <w:style w:type="character" w:customStyle="1" w:styleId="Ttulo3Car">
@@ -2237,13 +3872,12 @@
     <w:basedOn w:val="Fuentedeprrafopredeter"/>
     <w:link w:val="Ttulo3"/>
     <w:uiPriority w:val="9"/>
-    <w:semiHidden/>
-    <w:rsid w:val="00851405"/>
+    <w:rsid w:val="00782010"/>
     <w:rPr>
-      <w:rFonts w:eastAsiaTheme="majorEastAsia" w:cstheme="majorBidi"/>
-      <w:color w:val="0F4761" w:themeColor="accent1" w:themeShade="BF"/>
-      <w:sz w:val="28"/>
-      <w:szCs w:val="28"/>
+      <w:rFonts w:asciiTheme="majorHAnsi" w:eastAsiaTheme="majorEastAsia" w:hAnsiTheme="majorHAnsi" w:cstheme="majorBidi"/>
+      <w:b/>
+      <w:bCs/>
+      <w:color w:val="000000" w:themeColor="text1"/>
     </w:rPr>
   </w:style>
   <w:style w:type="character" w:customStyle="1" w:styleId="Ttulo4Car">
@@ -2252,12 +3886,14 @@
     <w:link w:val="Ttulo4"/>
     <w:uiPriority w:val="9"/>
     <w:semiHidden/>
-    <w:rsid w:val="00851405"/>
+    <w:rsid w:val="00782010"/>
     <w:rPr>
-      <w:rFonts w:eastAsiaTheme="majorEastAsia" w:cstheme="majorBidi"/>
+      <w:rFonts w:asciiTheme="majorHAnsi" w:eastAsiaTheme="majorEastAsia" w:hAnsiTheme="majorHAnsi" w:cstheme="majorBidi"/>
+      <w:b/>
+      <w:bCs/>
       <w:i/>
       <w:iCs/>
-      <w:color w:val="0F4761" w:themeColor="accent1" w:themeShade="BF"/>
+      <w:color w:val="000000" w:themeColor="text1"/>
     </w:rPr>
   </w:style>
   <w:style w:type="character" w:customStyle="1" w:styleId="Ttulo5Car">
@@ -2266,10 +3902,10 @@
     <w:link w:val="Ttulo5"/>
     <w:uiPriority w:val="9"/>
     <w:semiHidden/>
-    <w:rsid w:val="00851405"/>
+    <w:rsid w:val="00782010"/>
     <w:rPr>
-      <w:rFonts w:eastAsiaTheme="majorEastAsia" w:cstheme="majorBidi"/>
-      <w:color w:val="0F4761" w:themeColor="accent1" w:themeShade="BF"/>
+      <w:rFonts w:asciiTheme="majorHAnsi" w:eastAsiaTheme="majorEastAsia" w:hAnsiTheme="majorHAnsi" w:cstheme="majorBidi"/>
+      <w:color w:val="17365D" w:themeColor="text2" w:themeShade="BF"/>
     </w:rPr>
   </w:style>
   <w:style w:type="character" w:customStyle="1" w:styleId="Ttulo6Car">
@@ -2278,12 +3914,12 @@
     <w:link w:val="Ttulo6"/>
     <w:uiPriority w:val="9"/>
     <w:semiHidden/>
-    <w:rsid w:val="00851405"/>
+    <w:rsid w:val="00782010"/>
     <w:rPr>
-      <w:rFonts w:eastAsiaTheme="majorEastAsia" w:cstheme="majorBidi"/>
+      <w:rFonts w:asciiTheme="majorHAnsi" w:eastAsiaTheme="majorEastAsia" w:hAnsiTheme="majorHAnsi" w:cstheme="majorBidi"/>
       <w:i/>
       <w:iCs/>
-      <w:color w:val="595959" w:themeColor="text1" w:themeTint="A6"/>
+      <w:color w:val="17365D" w:themeColor="text2" w:themeShade="BF"/>
     </w:rPr>
   </w:style>
   <w:style w:type="character" w:customStyle="1" w:styleId="Ttulo7Car">
@@ -2292,10 +3928,12 @@
     <w:link w:val="Ttulo7"/>
     <w:uiPriority w:val="9"/>
     <w:semiHidden/>
-    <w:rsid w:val="00851405"/>
+    <w:rsid w:val="00782010"/>
     <w:rPr>
-      <w:rFonts w:eastAsiaTheme="majorEastAsia" w:cstheme="majorBidi"/>
-      <w:color w:val="595959" w:themeColor="text1" w:themeTint="A6"/>
+      <w:rFonts w:asciiTheme="majorHAnsi" w:eastAsiaTheme="majorEastAsia" w:hAnsiTheme="majorHAnsi" w:cstheme="majorBidi"/>
+      <w:i/>
+      <w:iCs/>
+      <w:color w:val="404040" w:themeColor="text1" w:themeTint="BF"/>
     </w:rPr>
   </w:style>
   <w:style w:type="character" w:customStyle="1" w:styleId="Ttulo8Car">
@@ -2304,12 +3942,12 @@
     <w:link w:val="Ttulo8"/>
     <w:uiPriority w:val="9"/>
     <w:semiHidden/>
-    <w:rsid w:val="00851405"/>
+    <w:rsid w:val="00782010"/>
     <w:rPr>
-      <w:rFonts w:eastAsiaTheme="majorEastAsia" w:cstheme="majorBidi"/>
-      <w:i/>
-      <w:iCs/>
-      <w:color w:val="272727" w:themeColor="text1" w:themeTint="D8"/>
+      <w:rFonts w:asciiTheme="majorHAnsi" w:eastAsiaTheme="majorEastAsia" w:hAnsiTheme="majorHAnsi" w:cstheme="majorBidi"/>
+      <w:color w:val="404040" w:themeColor="text1" w:themeTint="BF"/>
+      <w:sz w:val="20"/>
+      <w:szCs w:val="20"/>
     </w:rPr>
   </w:style>
   <w:style w:type="character" w:customStyle="1" w:styleId="Ttulo9Car">
@@ -2318,10 +3956,14 @@
     <w:link w:val="Ttulo9"/>
     <w:uiPriority w:val="9"/>
     <w:semiHidden/>
-    <w:rsid w:val="00851405"/>
+    <w:rsid w:val="00782010"/>
     <w:rPr>
-      <w:rFonts w:eastAsiaTheme="majorEastAsia" w:cstheme="majorBidi"/>
-      <w:color w:val="272727" w:themeColor="text1" w:themeTint="D8"/>
+      <w:rFonts w:asciiTheme="majorHAnsi" w:eastAsiaTheme="majorEastAsia" w:hAnsiTheme="majorHAnsi" w:cstheme="majorBidi"/>
+      <w:i/>
+      <w:iCs/>
+      <w:color w:val="404040" w:themeColor="text1" w:themeTint="BF"/>
+      <w:sz w:val="20"/>
+      <w:szCs w:val="20"/>
     </w:rPr>
   </w:style>
   <w:style w:type="paragraph" w:styleId="Ttulo">
@@ -2331,15 +3973,14 @@
     <w:link w:val="TtuloCar"/>
     <w:uiPriority w:val="10"/>
     <w:qFormat/>
-    <w:rsid w:val="00851405"/>
+    <w:rsid w:val="00782010"/>
     <w:pPr>
-      <w:spacing w:after="80"/>
+      <w:spacing w:after="0" w:line="240" w:lineRule="auto"/>
       <w:contextualSpacing/>
     </w:pPr>
     <w:rPr>
       <w:rFonts w:asciiTheme="majorHAnsi" w:eastAsiaTheme="majorEastAsia" w:hAnsiTheme="majorHAnsi" w:cstheme="majorBidi"/>
-      <w:spacing w:val="-10"/>
-      <w:kern w:val="28"/>
+      <w:color w:val="000000" w:themeColor="text1"/>
       <w:sz w:val="56"/>
       <w:szCs w:val="56"/>
     </w:rPr>
@@ -2349,11 +3990,10 @@
     <w:basedOn w:val="Fuentedeprrafopredeter"/>
     <w:link w:val="Ttulo"/>
     <w:uiPriority w:val="10"/>
-    <w:rsid w:val="00851405"/>
+    <w:rsid w:val="00782010"/>
     <w:rPr>
       <w:rFonts w:asciiTheme="majorHAnsi" w:eastAsiaTheme="majorEastAsia" w:hAnsiTheme="majorHAnsi" w:cstheme="majorBidi"/>
-      <w:spacing w:val="-10"/>
-      <w:kern w:val="28"/>
+      <w:color w:val="000000" w:themeColor="text1"/>
       <w:sz w:val="56"/>
       <w:szCs w:val="56"/>
     </w:rPr>
@@ -2365,18 +4005,15 @@
     <w:link w:val="SubttuloCar"/>
     <w:uiPriority w:val="11"/>
     <w:qFormat/>
-    <w:rsid w:val="00851405"/>
+    <w:rsid w:val="00782010"/>
     <w:pPr>
       <w:numPr>
         <w:ilvl w:val="1"/>
       </w:numPr>
     </w:pPr>
     <w:rPr>
-      <w:rFonts w:eastAsiaTheme="majorEastAsia" w:cstheme="majorBidi"/>
-      <w:color w:val="595959" w:themeColor="text1" w:themeTint="A6"/>
-      <w:spacing w:val="15"/>
-      <w:sz w:val="28"/>
-      <w:szCs w:val="28"/>
+      <w:color w:val="5A5A5A" w:themeColor="text1" w:themeTint="A5"/>
+      <w:spacing w:val="10"/>
     </w:rPr>
   </w:style>
   <w:style w:type="character" w:customStyle="1" w:styleId="SubttuloCar">
@@ -2384,13 +4021,10 @@
     <w:basedOn w:val="Fuentedeprrafopredeter"/>
     <w:link w:val="Subttulo"/>
     <w:uiPriority w:val="11"/>
-    <w:rsid w:val="00851405"/>
+    <w:rsid w:val="00782010"/>
     <w:rPr>
-      <w:rFonts w:eastAsiaTheme="majorEastAsia" w:cstheme="majorBidi"/>
-      <w:color w:val="595959" w:themeColor="text1" w:themeTint="A6"/>
-      <w:spacing w:val="15"/>
-      <w:sz w:val="28"/>
-      <w:szCs w:val="28"/>
+      <w:color w:val="5A5A5A" w:themeColor="text1" w:themeTint="A5"/>
+      <w:spacing w:val="10"/>
     </w:rPr>
   </w:style>
   <w:style w:type="paragraph" w:styleId="Cita">
@@ -2400,15 +4034,15 @@
     <w:link w:val="CitaCar"/>
     <w:uiPriority w:val="29"/>
     <w:qFormat/>
-    <w:rsid w:val="00851405"/>
+    <w:rsid w:val="00782010"/>
     <w:pPr>
       <w:spacing w:before="160"/>
-      <w:jc w:val="center"/>
+      <w:ind w:left="720" w:right="720"/>
     </w:pPr>
     <w:rPr>
       <w:i/>
       <w:iCs/>
-      <w:color w:val="404040" w:themeColor="text1" w:themeTint="BF"/>
+      <w:color w:val="000000" w:themeColor="text1"/>
     </w:rPr>
   </w:style>
   <w:style w:type="character" w:customStyle="1" w:styleId="CitaCar">
@@ -2416,11 +4050,11 @@
     <w:basedOn w:val="Fuentedeprrafopredeter"/>
     <w:link w:val="Cita"/>
     <w:uiPriority w:val="29"/>
-    <w:rsid w:val="00851405"/>
+    <w:rsid w:val="00782010"/>
     <w:rPr>
       <w:i/>
       <w:iCs/>
-      <w:color w:val="404040" w:themeColor="text1" w:themeTint="BF"/>
+      <w:color w:val="000000" w:themeColor="text1"/>
     </w:rPr>
   </w:style>
   <w:style w:type="paragraph" w:styleId="Prrafodelista">
@@ -2439,11 +4073,13 @@
     <w:basedOn w:val="Fuentedeprrafopredeter"/>
     <w:uiPriority w:val="21"/>
     <w:qFormat/>
-    <w:rsid w:val="00851405"/>
+    <w:rsid w:val="00782010"/>
     <w:rPr>
+      <w:b/>
+      <w:bCs/>
       <w:i/>
       <w:iCs/>
-      <w:color w:val="0F4761" w:themeColor="accent1" w:themeShade="BF"/>
+      <w:caps/>
     </w:rPr>
   </w:style>
   <w:style w:type="paragraph" w:styleId="Citadestacada">
@@ -2453,20 +4089,19 @@
     <w:link w:val="CitadestacadaCar"/>
     <w:uiPriority w:val="30"/>
     <w:qFormat/>
-    <w:rsid w:val="00851405"/>
+    <w:rsid w:val="00782010"/>
     <w:pPr>
       <w:pBdr>
-        <w:top w:val="single" w:sz="4" w:space="10" w:color="0F4761" w:themeColor="accent1" w:themeShade="BF"/>
-        <w:bottom w:val="single" w:sz="4" w:space="10" w:color="0F4761" w:themeColor="accent1" w:themeShade="BF"/>
+        <w:top w:val="single" w:sz="24" w:space="1" w:color="F2F2F2" w:themeColor="background1" w:themeShade="F2"/>
+        <w:bottom w:val="single" w:sz="24" w:space="1" w:color="F2F2F2" w:themeColor="background1" w:themeShade="F2"/>
       </w:pBdr>
-      <w:spacing w:before="360" w:after="360"/>
-      <w:ind w:left="864" w:right="864"/>
+      <w:shd w:val="clear" w:color="auto" w:fill="F2F2F2" w:themeFill="background1" w:themeFillShade="F2"/>
+      <w:spacing w:before="240" w:after="240"/>
+      <w:ind w:left="936" w:right="936"/>
       <w:jc w:val="center"/>
     </w:pPr>
     <w:rPr>
-      <w:i/>
-      <w:iCs/>
-      <w:color w:val="0F4761" w:themeColor="accent1" w:themeShade="BF"/>
+      <w:color w:val="000000" w:themeColor="text1"/>
     </w:rPr>
   </w:style>
   <w:style w:type="character" w:customStyle="1" w:styleId="CitadestacadaCar">
@@ -2474,11 +4109,10 @@
     <w:basedOn w:val="Fuentedeprrafopredeter"/>
     <w:link w:val="Citadestacada"/>
     <w:uiPriority w:val="30"/>
-    <w:rsid w:val="00851405"/>
+    <w:rsid w:val="00782010"/>
     <w:rPr>
-      <w:i/>
-      <w:iCs/>
-      <w:color w:val="0F4761" w:themeColor="accent1" w:themeShade="BF"/>
+      <w:color w:val="000000" w:themeColor="text1"/>
+      <w:shd w:val="clear" w:color="auto" w:fill="F2F2F2" w:themeFill="background1" w:themeFillShade="F2"/>
     </w:rPr>
   </w:style>
   <w:style w:type="character" w:styleId="Referenciaintensa">
@@ -2486,13 +4120,12 @@
     <w:basedOn w:val="Fuentedeprrafopredeter"/>
     <w:uiPriority w:val="32"/>
     <w:qFormat/>
-    <w:rsid w:val="00851405"/>
+    <w:rsid w:val="00782010"/>
     <w:rPr>
       <w:b/>
       <w:bCs/>
       <w:smallCaps/>
-      <w:color w:val="0F4761" w:themeColor="accent1" w:themeShade="BF"/>
-      <w:spacing w:val="5"/>
+      <w:u w:val="single"/>
     </w:rPr>
   </w:style>
   <w:style w:type="paragraph" w:styleId="Encabezado">
@@ -2542,7 +4175,6 @@
     <w:basedOn w:val="Normal"/>
     <w:link w:val="TextoindependienteCar"/>
     <w:uiPriority w:val="1"/>
-    <w:qFormat/>
     <w:rsid w:val="004B11C9"/>
     <w:rPr>
       <w:sz w:val="24"/>
@@ -2561,11 +4193,114 @@
       <w14:ligatures w14:val="none"/>
     </w:rPr>
   </w:style>
+  <w:style w:type="paragraph" w:styleId="Descripcin">
+    <w:name w:val="caption"/>
+    <w:basedOn w:val="Normal"/>
+    <w:next w:val="Normal"/>
+    <w:uiPriority w:val="35"/>
+    <w:semiHidden/>
+    <w:unhideWhenUsed/>
+    <w:qFormat/>
+    <w:rsid w:val="00782010"/>
+    <w:pPr>
+      <w:spacing w:after="200" w:line="240" w:lineRule="auto"/>
+    </w:pPr>
+    <w:rPr>
+      <w:i/>
+      <w:iCs/>
+      <w:color w:val="1F497D" w:themeColor="text2"/>
+      <w:sz w:val="18"/>
+      <w:szCs w:val="18"/>
+    </w:rPr>
+  </w:style>
+  <w:style w:type="character" w:styleId="Textoennegrita">
+    <w:name w:val="Strong"/>
+    <w:basedOn w:val="Fuentedeprrafopredeter"/>
+    <w:uiPriority w:val="22"/>
+    <w:qFormat/>
+    <w:rsid w:val="00782010"/>
+    <w:rPr>
+      <w:b/>
+      <w:bCs/>
+      <w:color w:val="000000" w:themeColor="text1"/>
+    </w:rPr>
+  </w:style>
+  <w:style w:type="character" w:styleId="nfasis">
+    <w:name w:val="Emphasis"/>
+    <w:basedOn w:val="Fuentedeprrafopredeter"/>
+    <w:uiPriority w:val="20"/>
+    <w:qFormat/>
+    <w:rsid w:val="00782010"/>
+    <w:rPr>
+      <w:i/>
+      <w:iCs/>
+      <w:color w:val="auto"/>
+    </w:rPr>
+  </w:style>
+  <w:style w:type="paragraph" w:styleId="Sinespaciado">
+    <w:name w:val="No Spacing"/>
+    <w:uiPriority w:val="1"/>
+    <w:qFormat/>
+    <w:rsid w:val="00782010"/>
+    <w:pPr>
+      <w:spacing w:after="0" w:line="240" w:lineRule="auto"/>
+    </w:pPr>
+  </w:style>
+  <w:style w:type="character" w:styleId="nfasissutil">
+    <w:name w:val="Subtle Emphasis"/>
+    <w:basedOn w:val="Fuentedeprrafopredeter"/>
+    <w:uiPriority w:val="19"/>
+    <w:qFormat/>
+    <w:rsid w:val="00782010"/>
+    <w:rPr>
+      <w:i/>
+      <w:iCs/>
+      <w:color w:val="404040" w:themeColor="text1" w:themeTint="BF"/>
+    </w:rPr>
+  </w:style>
+  <w:style w:type="character" w:styleId="Referenciasutil">
+    <w:name w:val="Subtle Reference"/>
+    <w:basedOn w:val="Fuentedeprrafopredeter"/>
+    <w:uiPriority w:val="31"/>
+    <w:qFormat/>
+    <w:rsid w:val="00782010"/>
+    <w:rPr>
+      <w:smallCaps/>
+      <w:color w:val="404040" w:themeColor="text1" w:themeTint="BF"/>
+      <w:u w:val="single" w:color="7F7F7F" w:themeColor="text1" w:themeTint="80"/>
+    </w:rPr>
+  </w:style>
+  <w:style w:type="character" w:styleId="Ttulodellibro">
+    <w:name w:val="Book Title"/>
+    <w:basedOn w:val="Fuentedeprrafopredeter"/>
+    <w:uiPriority w:val="33"/>
+    <w:qFormat/>
+    <w:rsid w:val="00782010"/>
+    <w:rPr>
+      <w:b w:val="0"/>
+      <w:bCs w:val="0"/>
+      <w:smallCaps/>
+      <w:spacing w:val="5"/>
+    </w:rPr>
+  </w:style>
+  <w:style w:type="paragraph" w:styleId="TtuloTDC">
+    <w:name w:val="TOC Heading"/>
+    <w:basedOn w:val="Ttulo1"/>
+    <w:next w:val="Normal"/>
+    <w:uiPriority w:val="39"/>
+    <w:semiHidden/>
+    <w:unhideWhenUsed/>
+    <w:qFormat/>
+    <w:rsid w:val="00782010"/>
+    <w:pPr>
+      <w:outlineLvl w:val="9"/>
+    </w:pPr>
+  </w:style>
 </w:styles>
 </file>
 
 <file path=word/theme/theme1.xml><?xml version="1.0" encoding="utf-8"?>
-<a:theme xmlns:a="http://schemas.openxmlformats.org/drawingml/2006/main" name="Tema de Office">
+<a:theme xmlns:a="http://schemas.openxmlformats.org/drawingml/2006/main" name="Tema1">
   <a:themeElements>
     <a:clrScheme name="Office">
       <a:dk1>
@@ -2575,44 +4310,44 @@
         <a:sysClr val="window" lastClr="FFFFFF"/>
       </a:lt1>
       <a:dk2>
-        <a:srgbClr val="0E2841"/>
+        <a:srgbClr val="1F497D"/>
       </a:dk2>
       <a:lt2>
-        <a:srgbClr val="E8E8E8"/>
+        <a:srgbClr val="EEECE1"/>
       </a:lt2>
       <a:accent1>
-        <a:srgbClr val="156082"/>
+        <a:srgbClr val="4F81BD"/>
       </a:accent1>
       <a:accent2>
-        <a:srgbClr val="E97132"/>
+        <a:srgbClr val="C0504D"/>
       </a:accent2>
       <a:accent3>
-        <a:srgbClr val="196B24"/>
+        <a:srgbClr val="9BBB59"/>
       </a:accent3>
       <a:accent4>
-        <a:srgbClr val="0F9ED5"/>
+        <a:srgbClr val="8064A2"/>
       </a:accent4>
       <a:accent5>
-        <a:srgbClr val="A02B93"/>
+        <a:srgbClr val="4BACC6"/>
       </a:accent5>
       <a:accent6>
-        <a:srgbClr val="4EA72E"/>
+        <a:srgbClr val="F79646"/>
       </a:accent6>
       <a:hlink>
-        <a:srgbClr val="467886"/>
+        <a:srgbClr val="0000FF"/>
       </a:hlink>
       <a:folHlink>
-        <a:srgbClr val="96607D"/>
+        <a:srgbClr val="800080"/>
       </a:folHlink>
     </a:clrScheme>
     <a:fontScheme name="Office">
       <a:majorFont>
-        <a:latin typeface="Aptos Display" panose="02110004020202020204"/>
+        <a:latin typeface="Cambria"/>
         <a:ea typeface=""/>
         <a:cs typeface=""/>
-        <a:font script="Jpan" typeface="游ゴシック Light"/>
+        <a:font script="Jpan" typeface="ＭＳ ゴシック"/>
         <a:font script="Hang" typeface="맑은 고딕"/>
-        <a:font script="Hans" typeface="等线 Light"/>
+        <a:font script="Hans" typeface="宋体"/>
         <a:font script="Hant" typeface="新細明體"/>
         <a:font script="Arab" typeface="Times New Roman"/>
         <a:font script="Hebr" typeface="Times New Roman"/>
@@ -2639,32 +4374,14 @@
         <a:font script="Mong" typeface="Mongolian Baiti"/>
         <a:font script="Viet" typeface="Times New Roman"/>
         <a:font script="Uigh" typeface="Microsoft Uighur"/>
-        <a:font script="Geor" typeface="Sylfaen"/>
-        <a:font script="Armn" typeface="Arial"/>
-        <a:font script="Bugi" typeface="Leelawadee UI"/>
-        <a:font script="Bopo" typeface="Microsoft JhengHei"/>
-        <a:font script="Java" typeface="Javanese Text"/>
-        <a:font script="Lisu" typeface="Segoe UI"/>
-        <a:font script="Mymr" typeface="Myanmar Text"/>
-        <a:font script="Nkoo" typeface="Ebrima"/>
-        <a:font script="Olck" typeface="Nirmala UI"/>
-        <a:font script="Osma" typeface="Ebrima"/>
-        <a:font script="Phag" typeface="Phagspa"/>
-        <a:font script="Syrn" typeface="Estrangelo Edessa"/>
-        <a:font script="Syrj" typeface="Estrangelo Edessa"/>
-        <a:font script="Syre" typeface="Estrangelo Edessa"/>
-        <a:font script="Sora" typeface="Nirmala UI"/>
-        <a:font script="Tale" typeface="Microsoft Tai Le"/>
-        <a:font script="Talu" typeface="Microsoft New Tai Lue"/>
-        <a:font script="Tfng" typeface="Ebrima"/>
       </a:majorFont>
       <a:minorFont>
-        <a:latin typeface="Aptos" panose="02110004020202020204"/>
+        <a:latin typeface="Calibri"/>
         <a:ea typeface=""/>
         <a:cs typeface=""/>
-        <a:font script="Jpan" typeface="游明朝"/>
+        <a:font script="Jpan" typeface="ＭＳ 明朝"/>
         <a:font script="Hang" typeface="맑은 고딕"/>
-        <a:font script="Hans" typeface="等线"/>
+        <a:font script="Hans" typeface="宋体"/>
         <a:font script="Hant" typeface="新細明體"/>
         <a:font script="Arab" typeface="Arial"/>
         <a:font script="Hebr" typeface="Arial"/>
@@ -2691,24 +4408,6 @@
         <a:font script="Mong" typeface="Mongolian Baiti"/>
         <a:font script="Viet" typeface="Arial"/>
         <a:font script="Uigh" typeface="Microsoft Uighur"/>
-        <a:font script="Geor" typeface="Sylfaen"/>
-        <a:font script="Armn" typeface="Arial"/>
-        <a:font script="Bugi" typeface="Leelawadee UI"/>
-        <a:font script="Bopo" typeface="Microsoft JhengHei"/>
-        <a:font script="Java" typeface="Javanese Text"/>
-        <a:font script="Lisu" typeface="Segoe UI"/>
-        <a:font script="Mymr" typeface="Myanmar Text"/>
-        <a:font script="Nkoo" typeface="Ebrima"/>
-        <a:font script="Olck" typeface="Nirmala UI"/>
-        <a:font script="Osma" typeface="Ebrima"/>
-        <a:font script="Phag" typeface="Phagspa"/>
-        <a:font script="Syrn" typeface="Estrangelo Edessa"/>
-        <a:font script="Syrj" typeface="Estrangelo Edessa"/>
-        <a:font script="Syre" typeface="Estrangelo Edessa"/>
-        <a:font script="Sora" typeface="Nirmala UI"/>
-        <a:font script="Tale" typeface="Microsoft Tai Le"/>
-        <a:font script="Talu" typeface="Microsoft New Tai Lue"/>
-        <a:font script="Tfng" typeface="Ebrima"/>
       </a:minorFont>
     </a:fontScheme>
     <a:fmtScheme name="Office">
@@ -2720,142 +4419,166 @@
           <a:gsLst>
             <a:gs pos="0">
               <a:schemeClr val="phClr">
-                <a:lumMod val="110000"/>
-                <a:satMod val="105000"/>
-                <a:tint val="67000"/>
+                <a:tint val="50000"/>
+                <a:satMod val="300000"/>
               </a:schemeClr>
             </a:gs>
-            <a:gs pos="50000">
+            <a:gs pos="35000">
               <a:schemeClr val="phClr">
-                <a:lumMod val="105000"/>
-                <a:satMod val="103000"/>
-                <a:tint val="73000"/>
+                <a:tint val="37000"/>
+                <a:satMod val="300000"/>
               </a:schemeClr>
             </a:gs>
             <a:gs pos="100000">
               <a:schemeClr val="phClr">
-                <a:lumMod val="105000"/>
-                <a:satMod val="109000"/>
-                <a:tint val="81000"/>
+                <a:tint val="15000"/>
+                <a:satMod val="350000"/>
               </a:schemeClr>
             </a:gs>
           </a:gsLst>
-          <a:lin ang="5400000" scaled="0"/>
+          <a:lin ang="16200000" scaled="1"/>
         </a:gradFill>
         <a:gradFill rotWithShape="1">
           <a:gsLst>
             <a:gs pos="0">
               <a:schemeClr val="phClr">
-                <a:satMod val="103000"/>
-                <a:lumMod val="102000"/>
-                <a:tint val="94000"/>
+                <a:shade val="51000"/>
+                <a:satMod val="130000"/>
               </a:schemeClr>
             </a:gs>
-            <a:gs pos="50000">
+            <a:gs pos="80000">
               <a:schemeClr val="phClr">
-                <a:satMod val="110000"/>
-                <a:lumMod val="100000"/>
-                <a:shade val="100000"/>
+                <a:shade val="93000"/>
+                <a:satMod val="130000"/>
               </a:schemeClr>
             </a:gs>
             <a:gs pos="100000">
               <a:schemeClr val="phClr">
-                <a:lumMod val="99000"/>
-                <a:satMod val="120000"/>
-                <a:shade val="78000"/>
+                <a:shade val="94000"/>
+                <a:satMod val="135000"/>
               </a:schemeClr>
             </a:gs>
           </a:gsLst>
-          <a:lin ang="5400000" scaled="0"/>
+          <a:lin ang="16200000" scaled="0"/>
         </a:gradFill>
       </a:fillStyleLst>
       <a:lnStyleLst>
-        <a:ln w="6350" cap="flat" cmpd="sng" algn="ctr">
+        <a:ln w="9525" cap="flat" cmpd="sng" algn="ctr">
+          <a:solidFill>
+            <a:schemeClr val="phClr">
+              <a:shade val="95000"/>
+              <a:satMod val="105000"/>
+            </a:schemeClr>
+          </a:solidFill>
+          <a:prstDash val="solid"/>
+        </a:ln>
+        <a:ln w="25400" cap="flat" cmpd="sng" algn="ctr">
           <a:solidFill>
             <a:schemeClr val="phClr"/>
           </a:solidFill>
           <a:prstDash val="solid"/>
-          <a:miter lim="800000"/>
         </a:ln>
-        <a:ln w="12700" cap="flat" cmpd="sng" algn="ctr">
+        <a:ln w="38100" cap="flat" cmpd="sng" algn="ctr">
           <a:solidFill>
             <a:schemeClr val="phClr"/>
           </a:solidFill>
           <a:prstDash val="solid"/>
-          <a:miter lim="800000"/>
-        </a:ln>
-        <a:ln w="19050" cap="flat" cmpd="sng" algn="ctr">
-          <a:solidFill>
-            <a:schemeClr val="phClr"/>
-          </a:solidFill>
-          <a:prstDash val="solid"/>
-          <a:miter lim="800000"/>
         </a:ln>
       </a:lnStyleLst>
       <a:effectStyleLst>
         <a:effectStyle>
-          <a:effectLst/>
-        </a:effectStyle>
-        <a:effectStyle>
-          <a:effectLst/>
+          <a:effectLst>
+            <a:outerShdw blurRad="40000" dist="20000" dir="5400000" rotWithShape="0">
+              <a:srgbClr val="000000">
+                <a:alpha val="38000"/>
+              </a:srgbClr>
+            </a:outerShdw>
+          </a:effectLst>
         </a:effectStyle>
         <a:effectStyle>
           <a:effectLst>
-            <a:outerShdw blurRad="57150" dist="19050" dir="5400000" algn="ctr" rotWithShape="0">
+            <a:outerShdw blurRad="40000" dist="23000" dir="5400000" rotWithShape="0">
               <a:srgbClr val="000000">
-                <a:alpha val="63000"/>
+                <a:alpha val="35000"/>
               </a:srgbClr>
             </a:outerShdw>
           </a:effectLst>
+        </a:effectStyle>
+        <a:effectStyle>
+          <a:effectLst>
+            <a:outerShdw blurRad="40000" dist="23000" dir="5400000" rotWithShape="0">
+              <a:srgbClr val="000000">
+                <a:alpha val="35000"/>
+              </a:srgbClr>
+            </a:outerShdw>
+          </a:effectLst>
+          <a:scene3d>
+            <a:camera prst="orthographicFront">
+              <a:rot lat="0" lon="0" rev="0"/>
+            </a:camera>
+            <a:lightRig rig="threePt" dir="t">
+              <a:rot lat="0" lon="0" rev="1200000"/>
+            </a:lightRig>
+          </a:scene3d>
+          <a:sp3d>
+            <a:bevelT w="63500" h="25400"/>
+          </a:sp3d>
         </a:effectStyle>
       </a:effectStyleLst>
       <a:bgFillStyleLst>
         <a:solidFill>
           <a:schemeClr val="phClr"/>
         </a:solidFill>
-        <a:solidFill>
-          <a:schemeClr val="phClr">
-            <a:tint val="95000"/>
-            <a:satMod val="170000"/>
-          </a:schemeClr>
-        </a:solidFill>
         <a:gradFill rotWithShape="1">
           <a:gsLst>
             <a:gs pos="0">
               <a:schemeClr val="phClr">
-                <a:tint val="93000"/>
-                <a:satMod val="150000"/>
-                <a:shade val="98000"/>
-                <a:lumMod val="102000"/>
+                <a:tint val="40000"/>
+                <a:satMod val="350000"/>
               </a:schemeClr>
             </a:gs>
-            <a:gs pos="50000">
+            <a:gs pos="40000">
               <a:schemeClr val="phClr">
-                <a:tint val="98000"/>
-                <a:satMod val="130000"/>
-                <a:shade val="90000"/>
-                <a:lumMod val="103000"/>
+                <a:tint val="45000"/>
+                <a:shade val="99000"/>
+                <a:satMod val="350000"/>
               </a:schemeClr>
             </a:gs>
             <a:gs pos="100000">
               <a:schemeClr val="phClr">
-                <a:shade val="63000"/>
-                <a:satMod val="120000"/>
+                <a:shade val="20000"/>
+                <a:satMod val="255000"/>
               </a:schemeClr>
             </a:gs>
           </a:gsLst>
-          <a:lin ang="5400000" scaled="0"/>
+          <a:path path="circle">
+            <a:fillToRect l="50000" t="-80000" r="50000" b="180000"/>
+          </a:path>
+        </a:gradFill>
+        <a:gradFill rotWithShape="1">
+          <a:gsLst>
+            <a:gs pos="0">
+              <a:schemeClr val="phClr">
+                <a:tint val="80000"/>
+                <a:satMod val="300000"/>
+              </a:schemeClr>
+            </a:gs>
+            <a:gs pos="100000">
+              <a:schemeClr val="phClr">
+                <a:shade val="30000"/>
+                <a:satMod val="200000"/>
+              </a:schemeClr>
+            </a:gs>
+          </a:gsLst>
+          <a:path path="circle">
+            <a:fillToRect l="50000" t="50000" r="50000" b="50000"/>
+          </a:path>
         </a:gradFill>
       </a:bgFillStyleLst>
     </a:fmtScheme>
   </a:themeElements>
   <a:objectDefaults/>
   <a:extraClrSchemeLst/>
-  <a:extLst>
-    <a:ext uri="{05A4C25C-085E-4340-85A3-A5531E510DB2}">
-      <thm15:themeFamily xmlns:thm15="http://schemas.microsoft.com/office/thememl/2012/main" name="Office Theme" id="{2E142A2C-CD16-42D6-873A-C26D2A0506FA}" vid="{1BDDFF52-6CD6-40A5-AB3C-68EB2F1E4D0A}"/>
-    </a:ext>
-  </a:extLst>
 </a:theme>
 </file>
 

</xml_diff>

<commit_message>
alcance y objetivos de la memoria
</commit_message>
<xml_diff>
--- a/Memoria/Memoria.docx
+++ b/Memoria/Memoria.docx
@@ -1188,6 +1188,9 @@
       </w:r>
     </w:p>
     <w:p>
+      <w:pPr>
+        <w:ind w:left="360"/>
+      </w:pPr>
       <w:r>
         <w:t xml:space="preserve">Esta memoria presenta de forma detallada el trabajo realizado para el desarrollo del proyecto fin de grado, el cual ha permitido aplicar gran parte del conocimiento adquirido durante cuatro años de aprendizaje en la Universidad. El proyecto desarrollado consiste en un videojuego de carreras en tres dimensiones con generación procedural de circuitos e inteligencia artificial, construido sobre el motor Unity y el </w:t>
       </w:r>
@@ -1209,6 +1212,9 @@
       </w:r>
     </w:p>
     <w:p>
+      <w:pPr>
+        <w:ind w:left="360"/>
+      </w:pPr>
       <w:r>
         <w:t xml:space="preserve">El núcleo del proyecto es un agente autónomo capaz de aprender a conducir un vehículo a lo largo de circuitos generados de forma aleatoria, sin intervención humana durante el entrenamiento. Para ello, se ha diseñado e implementado un sistema completo que abarca desde la generación dinámica de los circuitos hasta el entrenamiento del agente mediante técnicas de aprendizaje por refuerzo profundo, pasando por la física del vehículo, la gestión de </w:t>
       </w:r>
@@ -1222,6 +1228,9 @@
       </w:r>
     </w:p>
     <w:p>
+      <w:pPr>
+        <w:ind w:left="360"/>
+      </w:pPr>
       <w:r>
         <w:t>Para facilitar la comprensión de este documento, se ha decidido dividirlo en una serie de capítulos que siguen la estructura definida en la normativa de trabajos fin de grado de la universidad. Estos capítulos, excluyendo el presente, serían los siguientes:</w:t>
       </w:r>
@@ -1233,6 +1242,7 @@
           <w:ilvl w:val="0"/>
           <w:numId w:val="51"/>
         </w:numPr>
+        <w:ind w:left="1080"/>
       </w:pPr>
       <w:r>
         <w:t>Objetivos y alcance: En este capítulo se expondrá el motivo por el cual se ha elegido desarrollar este proyecto, así como los objetivos concretos que se pretenden alcanzar con su realización. Se delimitará también el alcance del trabajo, detallando qué funcionalidades y sistemas forman parte del proyecto y cuáles quedan fuera de él.</w:t>
@@ -1245,6 +1255,7 @@
           <w:ilvl w:val="0"/>
           <w:numId w:val="51"/>
         </w:numPr>
+        <w:ind w:left="1080"/>
       </w:pPr>
       <w:r>
         <w:t>Estado del arte: En este capítulo se ofrecerá una visión general del contexto en el que se enmarca el proyecto, analizando los antecedentes más relevantes en el campo de la inteligencia artificial aplicada a los videojuegos y la generación procedural de contenido. Se estudiarán trabajos académicos y títulos comerciales que han servido de referencia e inspiración, evaluando el estado actual de estas tecnologías y las oportunidades que justifican el enfoque adoptado en este trabajo.</w:t>
@@ -1257,6 +1268,7 @@
           <w:ilvl w:val="0"/>
           <w:numId w:val="51"/>
         </w:numPr>
+        <w:ind w:left="1080"/>
       </w:pPr>
       <w:r>
         <w:t>Planificación y presupuesto: A la hora de desarrollar cualquier proyecto informático es importante contar con una planificación de las tareas a realizar para garantizar su correcta finalización. En este apartado se detallarán todas las tareas llevadas a cabo durante el desarrollo, indicando su duración y fechas de inicio y fin mediante un diagrama de Gantt. Asimismo, se incluirá una estimación del presupuesto necesario para la realización del proyecto, desglosando los costes asociados a los recursos humanos, las herramientas utilizadas y otros gastos derivados del desarrollo.</w:t>
@@ -1269,6 +1281,7 @@
           <w:ilvl w:val="0"/>
           <w:numId w:val="51"/>
         </w:numPr>
+        <w:ind w:left="1080"/>
       </w:pPr>
       <w:r>
         <w:t xml:space="preserve">Memoria técnica: Este capítulo recogerá toda la información técnica generada durante el transcurso del proyecto. Se explicarán los requisitos funcionales y no funcionales que el sistema debe cumplir para considerarse exitoso, las herramientas y tecnologías utilizadas, y la terminología específica empleada. Para finalizar, se describirá en detalle el diseño e implementación del videojuego, incluyendo el generador procedural de circuitos, el sistema de </w:t>
@@ -1289,9 +1302,14 @@
           <w:ilvl w:val="0"/>
           <w:numId w:val="51"/>
         </w:numPr>
-      </w:pPr>
-      <w:r>
-        <w:t>Resultados: En este capítulo se presentarán y analizarán los resultados obtenidos durante el entrenamiento del agente y las pruebas realizadas sobre el sistema. Se evaluará el comportamiento del agente en distintos circuitos, su capacidad de generalización y el rendimiento global del videojuego desarrollado.</w:t>
+        <w:ind w:left="1080"/>
+      </w:pPr>
+      <w:r>
+        <w:t xml:space="preserve">Resultados: En este capítulo se presentarán y analizarán los resultados obtenidos durante el entrenamiento del agente y las pruebas realizadas sobre el sistema. Se </w:t>
+      </w:r>
+      <w:r>
+        <w:lastRenderedPageBreak/>
+        <w:t>evaluará el comportamiento del agente en distintos circuitos, su capacidad de generalización y el rendimiento global del videojuego desarrollado.</w:t>
       </w:r>
     </w:p>
     <w:p>
@@ -1301,9 +1319,9 @@
           <w:ilvl w:val="0"/>
           <w:numId w:val="51"/>
         </w:numPr>
-      </w:pPr>
-      <w:r>
-        <w:lastRenderedPageBreak/>
+        <w:ind w:left="1080"/>
+      </w:pPr>
+      <w:r>
         <w:t>Valoración ética: Todo proyecto o trabajo informático tiene una serie de implicaciones derivadas de su desarrollo y publicación. Por ello, es imprescindible evaluar dichas implicaciones desde un punto de vista no solo legal, sino también ético, prestando especial atención al uso de inteligencia artificial y a las posibles repercusiones del producto desarrollado.</w:t>
       </w:r>
     </w:p>
@@ -1314,6 +1332,7 @@
           <w:ilvl w:val="0"/>
           <w:numId w:val="51"/>
         </w:numPr>
+        <w:ind w:left="1080"/>
       </w:pPr>
       <w:r>
         <w:t>Conclusiones y trabajo futuro: En este último capítulo se expondrán las conclusiones obtenidas una vez concluido el desarrollo del proyecto, valorando en qué medida se han alcanzado los objetivos planteados inicialmente. Adicionalmente, se incluirá un apartado dedicado a las posibles líneas de trabajo futuro, describiendo mejoras y funcionalidades que podrían incorporarse en versiones posteriores del sistema.</w:t>
@@ -1326,6 +1345,7 @@
           <w:ilvl w:val="0"/>
           <w:numId w:val="51"/>
         </w:numPr>
+        <w:ind w:left="1080"/>
       </w:pPr>
       <w:r>
         <w:t>Bibliografía: Este apartado recogerá todas las fuentes de información consultadas a lo largo del trabajo fin de grado, ya sean referencias académicas, documentación técnica o recursos web utilizados tanto para el desarrollo del proyecto como para la elaboración de esta memoria.</w:t>
@@ -1372,32 +1392,632 @@
       <w:pPr>
         <w:ind w:left="360"/>
       </w:pPr>
-    </w:p>
-    <w:p/>
-    <w:p/>
-    <w:p/>
-    <w:p/>
-    <w:p/>
-    <w:p/>
-    <w:p/>
-    <w:p/>
-    <w:p/>
-    <w:p/>
-    <w:p/>
-    <w:p/>
-    <w:p/>
-    <w:p/>
-    <w:p/>
-    <w:p/>
-    <w:p/>
-    <w:p/>
-    <w:p/>
-    <w:p/>
-    <w:p/>
-    <w:p/>
-    <w:p/>
-    <w:p/>
-    <w:p/>
+      <w:r>
+        <w:t>El presente capítulo define los objetivos que se pretenden alcanzar con el desarrollo de este proyecto, así como los límites que se han establecido para garantizar su viabilidad dentro del tiempo y los recursos disponibles. Dado el carácter académico del trabajo, ha sido necesario establecer con claridad qué sistemas y funcionalidades forman parte del producto final y cuáles quedan fuera de él, priorizando en todo momento la solidez técnica y la coherencia del conjunto sobre la amplitud de características.</w:t>
+      </w:r>
+    </w:p>
+    <w:p>
+      <w:pPr>
+        <w:pStyle w:val="Prrafodelista"/>
+        <w:keepNext/>
+        <w:keepLines/>
+        <w:numPr>
+          <w:ilvl w:val="0"/>
+          <w:numId w:val="42"/>
+        </w:numPr>
+        <w:pBdr>
+          <w:bottom w:val="single" w:sz="4" w:space="1" w:color="595959" w:themeColor="text1" w:themeTint="A6"/>
+        </w:pBdr>
+        <w:spacing w:before="360"/>
+        <w:contextualSpacing w:val="0"/>
+        <w:outlineLvl w:val="0"/>
+        <w:rPr>
+          <w:rFonts w:asciiTheme="majorHAnsi" w:eastAsiaTheme="majorEastAsia" w:hAnsiTheme="majorHAnsi" w:cstheme="majorBidi"/>
+          <w:b/>
+          <w:bCs/>
+          <w:smallCaps/>
+          <w:vanish/>
+          <w:color w:val="000000" w:themeColor="text1"/>
+          <w:sz w:val="36"/>
+          <w:szCs w:val="36"/>
+        </w:rPr>
+      </w:pPr>
+    </w:p>
+    <w:p>
+      <w:pPr>
+        <w:pStyle w:val="Prrafodelista"/>
+        <w:keepNext/>
+        <w:keepLines/>
+        <w:numPr>
+          <w:ilvl w:val="0"/>
+          <w:numId w:val="42"/>
+        </w:numPr>
+        <w:pBdr>
+          <w:bottom w:val="single" w:sz="4" w:space="1" w:color="595959" w:themeColor="text1" w:themeTint="A6"/>
+        </w:pBdr>
+        <w:spacing w:before="360"/>
+        <w:contextualSpacing w:val="0"/>
+        <w:outlineLvl w:val="0"/>
+        <w:rPr>
+          <w:rFonts w:asciiTheme="majorHAnsi" w:eastAsiaTheme="majorEastAsia" w:hAnsiTheme="majorHAnsi" w:cstheme="majorBidi"/>
+          <w:b/>
+          <w:bCs/>
+          <w:smallCaps/>
+          <w:vanish/>
+          <w:color w:val="000000" w:themeColor="text1"/>
+          <w:sz w:val="36"/>
+          <w:szCs w:val="36"/>
+        </w:rPr>
+      </w:pPr>
+    </w:p>
+    <w:p>
+      <w:pPr>
+        <w:pStyle w:val="Ttulo2"/>
+        <w:ind w:left="993" w:hanging="567"/>
+        <w:jc w:val="both"/>
+        <w:rPr>
+          <w:rFonts w:asciiTheme="minorHAnsi" w:hAnsiTheme="minorHAnsi" w:cstheme="minorHAnsi"/>
+        </w:rPr>
+      </w:pPr>
+      <w:r>
+        <w:rPr>
+          <w:rFonts w:asciiTheme="minorHAnsi" w:hAnsiTheme="minorHAnsi" w:cstheme="minorHAnsi"/>
+        </w:rPr>
+        <w:t xml:space="preserve">Objetivos </w:t>
+      </w:r>
+    </w:p>
+    <w:p>
+      <w:pPr>
+        <w:ind w:left="426"/>
+      </w:pPr>
+      <w:r>
+        <w:t xml:space="preserve">El objetivo principal de este proyecto es diseñar y desarrollar un videojuego de carreras tridimensional en el que un agente inteligente aprenda de forma autónoma a conducir un vehículo a lo largo de circuitos generados de manera procedural, sin intervención humana durante el proceso de entrenamiento. Para ello, se ha aplicado aprendizaje por refuerzo profundo mediante el </w:t>
+      </w:r>
+      <w:proofErr w:type="spellStart"/>
+      <w:r>
+        <w:t>framework</w:t>
+      </w:r>
+      <w:proofErr w:type="spellEnd"/>
+      <w:r>
+        <w:t xml:space="preserve"> ML-</w:t>
+      </w:r>
+      <w:proofErr w:type="spellStart"/>
+      <w:r>
+        <w:t>Agents</w:t>
+      </w:r>
+      <w:proofErr w:type="spellEnd"/>
+      <w:r>
+        <w:t xml:space="preserve"> de Unity Technologies, integrando este sistema con una simulación física realista del vehículo y un generador dinámico de circuitos.</w:t>
+      </w:r>
+    </w:p>
+    <w:p>
+      <w:pPr>
+        <w:ind w:left="426"/>
+      </w:pPr>
+      <w:r>
+        <w:t xml:space="preserve">A </w:t>
+      </w:r>
+      <w:r>
+        <w:t>continuación,</w:t>
+      </w:r>
+      <w:r>
+        <w:t xml:space="preserve"> se detallan los objetivos específicos que se han definido a partir del objetivo principal, y que servirán como métricas para evaluar el éxito del proyecto:</w:t>
+      </w:r>
+    </w:p>
+    <w:p>
+      <w:pPr>
+        <w:numPr>
+          <w:ilvl w:val="0"/>
+          <w:numId w:val="59"/>
+        </w:numPr>
+      </w:pPr>
+      <w:r>
+        <w:rPr>
+          <w:b/>
+          <w:bCs/>
+        </w:rPr>
+        <w:t>Objetivo 1.</w:t>
+      </w:r>
+      <w:r>
+        <w:t xml:space="preserve"> Implementar un generador procedural de circuitos capaz de producir trazados cerrados, variados y sin solapamientos.</w:t>
+      </w:r>
+    </w:p>
+    <w:p>
+      <w:pPr>
+        <w:numPr>
+          <w:ilvl w:val="0"/>
+          <w:numId w:val="59"/>
+        </w:numPr>
+      </w:pPr>
+      <w:r>
+        <w:rPr>
+          <w:b/>
+          <w:bCs/>
+        </w:rPr>
+        <w:t>Objetivo 2.</w:t>
+      </w:r>
+      <w:r>
+        <w:t xml:space="preserve"> Desarrollar un sistema de guardado y carga de circuitos, que permita persistir los circuitos generados y reutilizarlos en sesiones de entrenamiento posteriores.</w:t>
+      </w:r>
+    </w:p>
+    <w:p>
+      <w:pPr>
+        <w:numPr>
+          <w:ilvl w:val="0"/>
+          <w:numId w:val="59"/>
+        </w:numPr>
+      </w:pPr>
+      <w:r>
+        <w:rPr>
+          <w:b/>
+          <w:bCs/>
+        </w:rPr>
+        <w:t>Objetivo 3.</w:t>
+      </w:r>
+      <w:r>
+        <w:t xml:space="preserve"> Implementar la física del vehículo, incluyendo tracción trasera, frenado, dirección y comportamiento de derrape, ofreciendo una conducción realista dentro del entorno de simulación.</w:t>
+      </w:r>
+    </w:p>
+    <w:p>
+      <w:pPr>
+        <w:numPr>
+          <w:ilvl w:val="0"/>
+          <w:numId w:val="59"/>
+        </w:numPr>
+      </w:pPr>
+      <w:r>
+        <w:rPr>
+          <w:b/>
+          <w:bCs/>
+        </w:rPr>
+        <w:t>Objetivo 4.</w:t>
+      </w:r>
+      <w:r>
+        <w:t xml:space="preserve"> Diseñar e implementar un sistema de </w:t>
+      </w:r>
+      <w:proofErr w:type="spellStart"/>
+      <w:r>
+        <w:t>checkpoints</w:t>
+      </w:r>
+      <w:proofErr w:type="spellEnd"/>
+      <w:r>
+        <w:t xml:space="preserve"> ordenados que permita al agente conocer su posición relativa dentro del circuito y que sirva como base para el cálculo de recompensas durante el entrenamiento.</w:t>
+      </w:r>
+    </w:p>
+    <w:p>
+      <w:pPr>
+        <w:numPr>
+          <w:ilvl w:val="0"/>
+          <w:numId w:val="59"/>
+        </w:numPr>
+      </w:pPr>
+      <w:r>
+        <w:rPr>
+          <w:b/>
+          <w:bCs/>
+        </w:rPr>
+        <w:t>Objetivo 5.</w:t>
+      </w:r>
+      <w:r>
+        <w:t xml:space="preserve"> Desarrollar un agente de aprendizaje por refuerzo que, a partir de observaciones del entorno como distancia al siguiente </w:t>
+      </w:r>
+      <w:proofErr w:type="spellStart"/>
+      <w:r>
+        <w:t>checkpoint</w:t>
+      </w:r>
+      <w:proofErr w:type="spellEnd"/>
+      <w:r>
+        <w:t xml:space="preserve">, velocidad, ángulo de orientación y </w:t>
+      </w:r>
+      <w:proofErr w:type="spellStart"/>
+      <w:r>
+        <w:t>raycasts</w:t>
+      </w:r>
+      <w:proofErr w:type="spellEnd"/>
+      <w:r>
+        <w:t xml:space="preserve"> de detección de obstáculos, aprenda a completar vueltas de forma autónoma.</w:t>
+      </w:r>
+    </w:p>
+    <w:p>
+      <w:pPr>
+        <w:numPr>
+          <w:ilvl w:val="0"/>
+          <w:numId w:val="59"/>
+        </w:numPr>
+      </w:pPr>
+      <w:r>
+        <w:rPr>
+          <w:b/>
+          <w:bCs/>
+        </w:rPr>
+        <w:t>Objetivo 6.</w:t>
+      </w:r>
+      <w:r>
+        <w:t xml:space="preserve"> Diseñar una función de recompensa que incentive el progreso del agente hacia los </w:t>
+      </w:r>
+      <w:proofErr w:type="spellStart"/>
+      <w:r>
+        <w:t>checkpoints</w:t>
+      </w:r>
+      <w:proofErr w:type="spellEnd"/>
+      <w:r>
+        <w:t>, penalice el deslizamiento lateral, el tiempo invertido y la salida de la pista, y recompense la finalización de vueltas y carreras completas.</w:t>
+      </w:r>
+    </w:p>
+    <w:p>
+      <w:pPr>
+        <w:numPr>
+          <w:ilvl w:val="0"/>
+          <w:numId w:val="59"/>
+        </w:numPr>
+      </w:pPr>
+      <w:r>
+        <w:rPr>
+          <w:b/>
+          <w:bCs/>
+        </w:rPr>
+        <w:t>Objetivo 7.</w:t>
+      </w:r>
+      <w:r>
+        <w:t xml:space="preserve"> Implementar un gestor de entrenamiento que permita rotar automáticamente entre distintos circuitos guardados durante las sesiones de entrenamiento, con el objetivo de mejorar la capacidad de generalización del agente.</w:t>
+      </w:r>
+    </w:p>
+    <w:p>
+      <w:pPr>
+        <w:numPr>
+          <w:ilvl w:val="0"/>
+          <w:numId w:val="59"/>
+        </w:numPr>
+      </w:pPr>
+      <w:r>
+        <w:rPr>
+          <w:b/>
+          <w:bCs/>
+        </w:rPr>
+        <w:t>Objetivo 8.</w:t>
+      </w:r>
+      <w:r>
+        <w:t xml:space="preserve"> Desarrollar una interfaz de usuario funcional que incluya menú principal, menú de pausa, opciones de configuración de pantalla y audio, y un HUD de carrera que muestre el progreso de vueltas en tiempo real.</w:t>
+      </w:r>
+    </w:p>
+    <w:p>
+      <w:pPr>
+        <w:numPr>
+          <w:ilvl w:val="0"/>
+          <w:numId w:val="59"/>
+        </w:numPr>
+      </w:pPr>
+      <w:r>
+        <w:rPr>
+          <w:b/>
+          <w:bCs/>
+        </w:rPr>
+        <w:lastRenderedPageBreak/>
+        <w:t>Objetivo 9.</w:t>
+      </w:r>
+      <w:r>
+        <w:t xml:space="preserve"> Integrar los distintos modos de juego, incluyendo un modo de entrenamiento autónomo y un modo de juego donde el usuario pueda controlar el vehículo manualmente mediante teclado.</w:t>
+      </w:r>
+    </w:p>
+    <w:p>
+      <w:pPr>
+        <w:pStyle w:val="Ttulo2"/>
+        <w:ind w:left="993" w:hanging="567"/>
+        <w:jc w:val="both"/>
+        <w:rPr>
+          <w:rFonts w:asciiTheme="minorHAnsi" w:hAnsiTheme="minorHAnsi" w:cstheme="minorHAnsi"/>
+        </w:rPr>
+      </w:pPr>
+      <w:r>
+        <w:rPr>
+          <w:rFonts w:asciiTheme="minorHAnsi" w:hAnsiTheme="minorHAnsi" w:cstheme="minorHAnsi"/>
+        </w:rPr>
+        <w:t>alcance</w:t>
+      </w:r>
+    </w:p>
+    <w:p>
+      <w:pPr>
+        <w:ind w:left="426"/>
+      </w:pPr>
+      <w:r>
+        <w:t xml:space="preserve">Dado el carácter académico de este trabajo de fin de grado, el proyecto se ha desarrollado con recursos y tiempo limitados, lo que ha requerido establecer con claridad los límites funcionales y técnicos del producto final. A </w:t>
+      </w:r>
+      <w:r>
+        <w:t>continuación,</w:t>
+      </w:r>
+      <w:r>
+        <w:t xml:space="preserve"> se detallan los aspectos que han quedado dentro y fuera del alcance del proyecto.</w:t>
+      </w:r>
+    </w:p>
+    <w:p>
+      <w:pPr>
+        <w:ind w:left="426"/>
+      </w:pPr>
+      <w:r>
+        <w:rPr>
+          <w:i/>
+          <w:iCs/>
+        </w:rPr>
+        <w:t>Aspectos incluidos en el alcance:</w:t>
+      </w:r>
+    </w:p>
+    <w:p>
+      <w:pPr>
+        <w:numPr>
+          <w:ilvl w:val="0"/>
+          <w:numId w:val="60"/>
+        </w:numPr>
+      </w:pPr>
+      <w:r>
+        <w:t xml:space="preserve">Generación procedural de circuitos cerrados en tres dimensiones, con control de variedad, detección de solapamientos mediante </w:t>
+      </w:r>
+      <w:proofErr w:type="spellStart"/>
+      <w:r>
+        <w:t>grid</w:t>
+      </w:r>
+      <w:proofErr w:type="spellEnd"/>
+      <w:r>
+        <w:t xml:space="preserve"> espacial y </w:t>
+      </w:r>
+      <w:proofErr w:type="spellStart"/>
+      <w:r>
+        <w:t>backtracking</w:t>
+      </w:r>
+      <w:proofErr w:type="spellEnd"/>
+      <w:r>
+        <w:t xml:space="preserve"> automático.</w:t>
+      </w:r>
+    </w:p>
+    <w:p>
+      <w:pPr>
+        <w:numPr>
+          <w:ilvl w:val="0"/>
+          <w:numId w:val="60"/>
+        </w:numPr>
+      </w:pPr>
+      <w:r>
+        <w:t>Sistema de guardado y carga de circuitos en formato JSON, tanto para su uso manual como para la rotación automática durante el entrenamiento.</w:t>
+      </w:r>
+    </w:p>
+    <w:p>
+      <w:pPr>
+        <w:numPr>
+          <w:ilvl w:val="0"/>
+          <w:numId w:val="60"/>
+        </w:numPr>
+      </w:pPr>
+      <w:r>
+        <w:t xml:space="preserve">Simulación física del vehículo con </w:t>
+      </w:r>
+      <w:proofErr w:type="spellStart"/>
+      <w:r>
+        <w:t>WheelColliders</w:t>
+      </w:r>
+      <w:proofErr w:type="spellEnd"/>
+      <w:r>
+        <w:t>, incluyendo tracción trasera, dirección, frenado y recuperación de tracción tras derrape.</w:t>
+      </w:r>
+    </w:p>
+    <w:p>
+      <w:pPr>
+        <w:numPr>
+          <w:ilvl w:val="0"/>
+          <w:numId w:val="60"/>
+        </w:numPr>
+      </w:pPr>
+      <w:r>
+        <w:t xml:space="preserve">Sistema de </w:t>
+      </w:r>
+      <w:proofErr w:type="spellStart"/>
+      <w:r>
+        <w:t>checkpoints</w:t>
+      </w:r>
+      <w:proofErr w:type="spellEnd"/>
+      <w:r>
+        <w:t xml:space="preserve"> ordenados con gestión de vueltas y lógica de carrera configurable por número de vueltas o distancia total.</w:t>
+      </w:r>
+    </w:p>
+    <w:p>
+      <w:pPr>
+        <w:numPr>
+          <w:ilvl w:val="0"/>
+          <w:numId w:val="60"/>
+        </w:numPr>
+      </w:pPr>
+      <w:r>
+        <w:t>Agente de aprendizaje por refuerzo entrenado con ML-</w:t>
+      </w:r>
+      <w:proofErr w:type="spellStart"/>
+      <w:r>
+        <w:t>Agents</w:t>
+      </w:r>
+      <w:proofErr w:type="spellEnd"/>
+      <w:r>
+        <w:t xml:space="preserve">, con observaciones vectoriales y </w:t>
+      </w:r>
+      <w:proofErr w:type="spellStart"/>
+      <w:r>
+        <w:t>raycasts</w:t>
+      </w:r>
+      <w:proofErr w:type="spellEnd"/>
+      <w:r>
+        <w:t xml:space="preserve">, y función de recompensa basada en progreso hacia </w:t>
+      </w:r>
+      <w:proofErr w:type="spellStart"/>
+      <w:r>
+        <w:t>checkpoints</w:t>
+      </w:r>
+      <w:proofErr w:type="spellEnd"/>
+      <w:r>
+        <w:t>.</w:t>
+      </w:r>
+    </w:p>
+    <w:p>
+      <w:pPr>
+        <w:numPr>
+          <w:ilvl w:val="0"/>
+          <w:numId w:val="60"/>
+        </w:numPr>
+      </w:pPr>
+      <w:r>
+        <w:t>Gestor de entrenamiento con rotación automática de circuitos entre episodios.</w:t>
+      </w:r>
+    </w:p>
+    <w:p>
+      <w:pPr>
+        <w:numPr>
+          <w:ilvl w:val="0"/>
+          <w:numId w:val="60"/>
+        </w:numPr>
+      </w:pPr>
+      <w:r>
+        <w:t>Interfaz de usuario con menú principal, submenú de modos de juego, menú de pausa, panel de opciones y HUD de vueltas.</w:t>
+      </w:r>
+    </w:p>
+    <w:p>
+      <w:pPr>
+        <w:numPr>
+          <w:ilvl w:val="0"/>
+          <w:numId w:val="60"/>
+        </w:numPr>
+      </w:pPr>
+      <w:r>
+        <w:t>Modo de control manual del vehículo mediante teclado para pruebas y juego libre.</w:t>
+      </w:r>
+    </w:p>
+    <w:p>
+      <w:pPr>
+        <w:ind w:left="426"/>
+      </w:pPr>
+      <w:r>
+        <w:rPr>
+          <w:i/>
+          <w:iCs/>
+        </w:rPr>
+        <w:t>Aspectos fuera del alcance:</w:t>
+      </w:r>
+    </w:p>
+    <w:p>
+      <w:pPr>
+        <w:numPr>
+          <w:ilvl w:val="0"/>
+          <w:numId w:val="61"/>
+        </w:numPr>
+      </w:pPr>
+      <w:r>
+        <w:t>No se implementará un modo multijugador. La naturaleza del proyecto, centrado en el entrenamiento de un agente autónomo, no requiere ni se beneficia de esta funcionalidad, y su implementación supondría costes de infraestructura de servidor que exceden el presupuesto académico del trabajo.</w:t>
+      </w:r>
+    </w:p>
+    <w:p>
+      <w:pPr>
+        <w:numPr>
+          <w:ilvl w:val="0"/>
+          <w:numId w:val="61"/>
+        </w:numPr>
+      </w:pPr>
+      <w:r>
+        <w:t>No se desarrollará un sistema de ranking ni de comparación de rendimiento entre agentes. El foco del proyecto es el aprendizaje del agente individual, no la competición entre múltiples instancias.</w:t>
+      </w:r>
+    </w:p>
+    <w:p>
+      <w:pPr>
+        <w:numPr>
+          <w:ilvl w:val="0"/>
+          <w:numId w:val="61"/>
+        </w:numPr>
+      </w:pPr>
+      <w:r>
+        <w:t xml:space="preserve">No se realizará el lanzamiento comercial del producto. Aunque el videojuego alcanza un nivel de completitud suficiente, la publicación en plataformas de distribución como </w:t>
+      </w:r>
+      <w:proofErr w:type="spellStart"/>
+      <w:r>
+        <w:t>Steam</w:t>
+      </w:r>
+      <w:proofErr w:type="spellEnd"/>
+      <w:r>
+        <w:t xml:space="preserve"> implica costes económicos y trámites que quedan fuera del alcance de este trabajo.</w:t>
+      </w:r>
+    </w:p>
+    <w:p>
+      <w:pPr>
+        <w:numPr>
+          <w:ilvl w:val="0"/>
+          <w:numId w:val="61"/>
+        </w:numPr>
+      </w:pPr>
+      <w:r>
+        <w:t xml:space="preserve">No se crearán modelos tridimensionales, texturas, música ni efectos de sonido de forma manual. Al tratarse de un proyecto de ingeniería informática, estos elementos se obtendrán </w:t>
+      </w:r>
+      <w:r>
+        <w:lastRenderedPageBreak/>
+        <w:t xml:space="preserve">de recursos externos gratuitos o de los propios </w:t>
+      </w:r>
+      <w:proofErr w:type="spellStart"/>
+      <w:r>
+        <w:t>assets</w:t>
+      </w:r>
+      <w:proofErr w:type="spellEnd"/>
+      <w:r>
+        <w:t xml:space="preserve"> del motor Unity, centrando el esfuerzo en los sistemas de software.</w:t>
+      </w:r>
+    </w:p>
+    <w:p>
+      <w:pPr>
+        <w:numPr>
+          <w:ilvl w:val="0"/>
+          <w:numId w:val="61"/>
+        </w:numPr>
+      </w:pPr>
+      <w:r>
+        <w:t xml:space="preserve">No se implementará un sistema de guardado de progreso del agente entre sesiones de juego orientado al usuario final. El guardado de modelos entrenados queda gestionado por el propio </w:t>
+      </w:r>
+      <w:proofErr w:type="spellStart"/>
+      <w:r>
+        <w:t>framework</w:t>
+      </w:r>
+      <w:proofErr w:type="spellEnd"/>
+      <w:r>
+        <w:t xml:space="preserve"> ML-</w:t>
+      </w:r>
+      <w:proofErr w:type="spellStart"/>
+      <w:r>
+        <w:t>Agents</w:t>
+      </w:r>
+      <w:proofErr w:type="spellEnd"/>
+      <w:r>
+        <w:t xml:space="preserve"> y queda fuera de la interfaz del videojuego.</w:t>
+      </w:r>
+    </w:p>
+    <w:p>
+      <w:pPr>
+        <w:numPr>
+          <w:ilvl w:val="0"/>
+          <w:numId w:val="61"/>
+        </w:numPr>
+      </w:pPr>
+      <w:r>
+        <w:t>No se abordará el entrenamiento distribuido ni el uso de infraestructura en la nube para acelerar el proceso de aprendizaje. Todo el entrenamiento se realizará en local.</w:t>
+      </w:r>
+    </w:p>
+    <w:p>
+      <w:pPr>
+        <w:numPr>
+          <w:ilvl w:val="0"/>
+          <w:numId w:val="61"/>
+        </w:numPr>
+      </w:pPr>
+      <w:r>
+        <w:t>No se ha implementado un sistema de decoración procedural del circuito. Si bien el generador es capaz de construir trazados cerrados y funcionales, la colocación automática de elementos decorativos como vallas, árboles, edificios u otros objetos ambientales a lo largo del circuito no ha llegado a desarrollarse. Esta funcionalidad queda identificada como una línea de trabajo futuro.</w:t>
+      </w:r>
+    </w:p>
+    <w:p>
+      <w:pPr>
+        <w:ind w:left="426"/>
+      </w:pPr>
+      <w:r>
+        <w:t>Estas limitaciones no comprometen el cumplimiento del objetivo principal del proyecto. En todo momento se ha priorizado la coherencia técnica del sistema, la viabilidad dentro de los márgenes académicos establecidos y la solidez del resultado obtenido frente a la amplitud de funcionalidades.</w:t>
+      </w:r>
+    </w:p>
     <w:p>
       <w:r>
         <w:br w:type="page"/>
@@ -1408,7 +2028,7 @@
         <w:pStyle w:val="Ttulo1"/>
         <w:numPr>
           <w:ilvl w:val="0"/>
-          <w:numId w:val="55"/>
+          <w:numId w:val="2"/>
         </w:numPr>
         <w:jc w:val="right"/>
         <w:rPr>
@@ -1466,7 +2086,7 @@
         <w:pStyle w:val="Ttulo1"/>
         <w:numPr>
           <w:ilvl w:val="0"/>
-          <w:numId w:val="55"/>
+          <w:numId w:val="2"/>
         </w:numPr>
         <w:jc w:val="right"/>
         <w:rPr>
@@ -1524,7 +2144,7 @@
         <w:pStyle w:val="Ttulo1"/>
         <w:numPr>
           <w:ilvl w:val="0"/>
-          <w:numId w:val="55"/>
+          <w:numId w:val="2"/>
         </w:numPr>
         <w:jc w:val="right"/>
         <w:rPr>
@@ -1582,7 +2202,7 @@
         <w:pStyle w:val="Ttulo1"/>
         <w:numPr>
           <w:ilvl w:val="0"/>
-          <w:numId w:val="55"/>
+          <w:numId w:val="2"/>
         </w:numPr>
         <w:jc w:val="right"/>
         <w:rPr>
@@ -1640,7 +2260,7 @@
         <w:pStyle w:val="Ttulo1"/>
         <w:numPr>
           <w:ilvl w:val="0"/>
-          <w:numId w:val="55"/>
+          <w:numId w:val="2"/>
         </w:numPr>
         <w:jc w:val="right"/>
         <w:rPr>
@@ -1697,7 +2317,7 @@
         <w:pStyle w:val="Ttulo1"/>
         <w:numPr>
           <w:ilvl w:val="0"/>
-          <w:numId w:val="55"/>
+          <w:numId w:val="2"/>
         </w:numPr>
         <w:jc w:val="right"/>
         <w:rPr>
@@ -1755,7 +2375,7 @@
         <w:pStyle w:val="Ttulo1"/>
         <w:numPr>
           <w:ilvl w:val="0"/>
-          <w:numId w:val="55"/>
+          <w:numId w:val="2"/>
         </w:numPr>
         <w:jc w:val="right"/>
         <w:rPr>
@@ -1955,6 +2575,155 @@
 <file path=word/numbering.xml><?xml version="1.0" encoding="utf-8"?>
 <w:numbering xmlns:wpc="http://schemas.microsoft.com/office/word/2010/wordprocessingCanvas" xmlns:cx="http://schemas.microsoft.com/office/drawing/2014/chartex" xmlns:cx1="http://schemas.microsoft.com/office/drawing/2015/9/8/chartex" xmlns:cx2="http://schemas.microsoft.com/office/drawing/2015/10/21/chartex" xmlns:cx3="http://schemas.microsoft.com/office/drawing/2016/5/9/chartex" xmlns:cx4="http://schemas.microsoft.com/office/drawing/2016/5/10/chartex" xmlns:cx5="http://schemas.microsoft.com/office/drawing/2016/5/11/chartex" xmlns:cx6="http://schemas.microsoft.com/office/drawing/2016/5/12/chartex" xmlns:cx7="http://schemas.microsoft.com/office/drawing/2016/5/13/chartex" xmlns:cx8="http://schemas.microsoft.com/office/drawing/2016/5/14/chartex" xmlns:mc="http://schemas.openxmlformats.org/markup-compatibility/2006" xmlns:aink="http://schemas.microsoft.com/office/drawing/2016/ink" xmlns:am3d="http://schemas.microsoft.com/office/drawing/2017/model3d" xmlns:o="urn:schemas-microsoft-com:office:office" xmlns:oel="http://schemas.microsoft.com/office/2019/extlst" xmlns:r="http://schemas.openxmlformats.org/officeDocument/2006/relationships" xmlns:m="http://schemas.openxmlformats.org/officeDocument/2006/math" xmlns:v="urn:schemas-microsoft-com:vml" xmlns:wp14="http://schemas.microsoft.com/office/word/2010/wordprocessingDrawing" xmlns:wp="http://schemas.openxmlformats.org/drawingml/2006/wordprocessingDrawing" xmlns:w10="urn:schemas-microsoft-com:office:word" xmlns:w="http://schemas.openxmlformats.org/wordprocessingml/2006/main" xmlns:w14="http://schemas.microsoft.com/office/word/2010/wordml" xmlns:w15="http://schemas.microsoft.com/office/word/2012/wordml" xmlns:w16cex="http://schemas.microsoft.com/office/word/2018/wordml/cex" xmlns:w16cid="http://schemas.microsoft.com/office/word/2016/wordml/cid" xmlns:w16="http://schemas.microsoft.com/office/word/2018/wordml" xmlns:w16du="http://schemas.microsoft.com/office/word/2023/wordml/word16du" xmlns:w16sdtdh="http://schemas.microsoft.com/office/word/2020/wordml/sdtdatahash" xmlns:w16se="http://schemas.microsoft.com/office/word/2015/wordml/symex" xmlns:wpg="http://schemas.microsoft.com/office/word/2010/wordprocessingGroup" xmlns:wpi="http://schemas.microsoft.com/office/word/2010/wordprocessingInk" xmlns:wne="http://schemas.microsoft.com/office/word/2006/wordml" xmlns:wps="http://schemas.microsoft.com/office/word/2010/wordprocessingShape" mc:Ignorable="w14 w15 w16se w16cid w16 w16cex w16sdtdh w16du wp14">
   <w:abstractNum w:abstractNumId="0" w15:restartNumberingAfterBreak="0">
+    <w:nsid w:val="087F2EB0"/>
+    <w:multiLevelType w:val="multilevel"/>
+    <w:tmpl w:val="AECECA98"/>
+    <w:lvl w:ilvl="0">
+      <w:start w:val="1"/>
+      <w:numFmt w:val="bullet"/>
+      <w:lvlText w:val=""/>
+      <w:lvlJc w:val="left"/>
+      <w:pPr>
+        <w:tabs>
+          <w:tab w:val="num" w:pos="720"/>
+        </w:tabs>
+        <w:ind w:left="720" w:hanging="360"/>
+      </w:pPr>
+      <w:rPr>
+        <w:rFonts w:ascii="Symbol" w:hAnsi="Symbol" w:hint="default"/>
+        <w:sz w:val="20"/>
+      </w:rPr>
+    </w:lvl>
+    <w:lvl w:ilvl="1" w:tentative="1">
+      <w:start w:val="1"/>
+      <w:numFmt w:val="bullet"/>
+      <w:lvlText w:val="o"/>
+      <w:lvlJc w:val="left"/>
+      <w:pPr>
+        <w:tabs>
+          <w:tab w:val="num" w:pos="1440"/>
+        </w:tabs>
+        <w:ind w:left="1440" w:hanging="360"/>
+      </w:pPr>
+      <w:rPr>
+        <w:rFonts w:ascii="Courier New" w:hAnsi="Courier New" w:hint="default"/>
+        <w:sz w:val="20"/>
+      </w:rPr>
+    </w:lvl>
+    <w:lvl w:ilvl="2" w:tentative="1">
+      <w:start w:val="1"/>
+      <w:numFmt w:val="bullet"/>
+      <w:lvlText w:val=""/>
+      <w:lvlJc w:val="left"/>
+      <w:pPr>
+        <w:tabs>
+          <w:tab w:val="num" w:pos="2160"/>
+        </w:tabs>
+        <w:ind w:left="2160" w:hanging="360"/>
+      </w:pPr>
+      <w:rPr>
+        <w:rFonts w:ascii="Wingdings" w:hAnsi="Wingdings" w:hint="default"/>
+        <w:sz w:val="20"/>
+      </w:rPr>
+    </w:lvl>
+    <w:lvl w:ilvl="3" w:tentative="1">
+      <w:start w:val="1"/>
+      <w:numFmt w:val="bullet"/>
+      <w:lvlText w:val=""/>
+      <w:lvlJc w:val="left"/>
+      <w:pPr>
+        <w:tabs>
+          <w:tab w:val="num" w:pos="2880"/>
+        </w:tabs>
+        <w:ind w:left="2880" w:hanging="360"/>
+      </w:pPr>
+      <w:rPr>
+        <w:rFonts w:ascii="Wingdings" w:hAnsi="Wingdings" w:hint="default"/>
+        <w:sz w:val="20"/>
+      </w:rPr>
+    </w:lvl>
+    <w:lvl w:ilvl="4" w:tentative="1">
+      <w:start w:val="1"/>
+      <w:numFmt w:val="bullet"/>
+      <w:lvlText w:val=""/>
+      <w:lvlJc w:val="left"/>
+      <w:pPr>
+        <w:tabs>
+          <w:tab w:val="num" w:pos="3600"/>
+        </w:tabs>
+        <w:ind w:left="3600" w:hanging="360"/>
+      </w:pPr>
+      <w:rPr>
+        <w:rFonts w:ascii="Wingdings" w:hAnsi="Wingdings" w:hint="default"/>
+        <w:sz w:val="20"/>
+      </w:rPr>
+    </w:lvl>
+    <w:lvl w:ilvl="5" w:tentative="1">
+      <w:start w:val="1"/>
+      <w:numFmt w:val="bullet"/>
+      <w:lvlText w:val=""/>
+      <w:lvlJc w:val="left"/>
+      <w:pPr>
+        <w:tabs>
+          <w:tab w:val="num" w:pos="4320"/>
+        </w:tabs>
+        <w:ind w:left="4320" w:hanging="360"/>
+      </w:pPr>
+      <w:rPr>
+        <w:rFonts w:ascii="Wingdings" w:hAnsi="Wingdings" w:hint="default"/>
+        <w:sz w:val="20"/>
+      </w:rPr>
+    </w:lvl>
+    <w:lvl w:ilvl="6" w:tentative="1">
+      <w:start w:val="1"/>
+      <w:numFmt w:val="bullet"/>
+      <w:lvlText w:val=""/>
+      <w:lvlJc w:val="left"/>
+      <w:pPr>
+        <w:tabs>
+          <w:tab w:val="num" w:pos="5040"/>
+        </w:tabs>
+        <w:ind w:left="5040" w:hanging="360"/>
+      </w:pPr>
+      <w:rPr>
+        <w:rFonts w:ascii="Wingdings" w:hAnsi="Wingdings" w:hint="default"/>
+        <w:sz w:val="20"/>
+      </w:rPr>
+    </w:lvl>
+    <w:lvl w:ilvl="7" w:tentative="1">
+      <w:start w:val="1"/>
+      <w:numFmt w:val="bullet"/>
+      <w:lvlText w:val=""/>
+      <w:lvlJc w:val="left"/>
+      <w:pPr>
+        <w:tabs>
+          <w:tab w:val="num" w:pos="5760"/>
+        </w:tabs>
+        <w:ind w:left="5760" w:hanging="360"/>
+      </w:pPr>
+      <w:rPr>
+        <w:rFonts w:ascii="Wingdings" w:hAnsi="Wingdings" w:hint="default"/>
+        <w:sz w:val="20"/>
+      </w:rPr>
+    </w:lvl>
+    <w:lvl w:ilvl="8" w:tentative="1">
+      <w:start w:val="1"/>
+      <w:numFmt w:val="bullet"/>
+      <w:lvlText w:val=""/>
+      <w:lvlJc w:val="left"/>
+      <w:pPr>
+        <w:tabs>
+          <w:tab w:val="num" w:pos="6480"/>
+        </w:tabs>
+        <w:ind w:left="6480" w:hanging="360"/>
+      </w:pPr>
+      <w:rPr>
+        <w:rFonts w:ascii="Wingdings" w:hAnsi="Wingdings" w:hint="default"/>
+        <w:sz w:val="20"/>
+      </w:rPr>
+    </w:lvl>
+  </w:abstractNum>
+  <w:abstractNum w:abstractNumId="1" w15:restartNumberingAfterBreak="0">
     <w:nsid w:val="0D4429D3"/>
     <w:multiLevelType w:val="multilevel"/>
     <w:tmpl w:val="9E801392"/>
@@ -2072,7 +2841,7 @@
       </w:rPr>
     </w:lvl>
   </w:abstractNum>
-  <w:abstractNum w:abstractNumId="1" w15:restartNumberingAfterBreak="0">
+  <w:abstractNum w:abstractNumId="2" w15:restartNumberingAfterBreak="0">
     <w:nsid w:val="1482775B"/>
     <w:multiLevelType w:val="multilevel"/>
     <w:tmpl w:val="0EBA3C40"/>
@@ -2167,7 +2936,7 @@
       </w:pPr>
     </w:lvl>
   </w:abstractNum>
-  <w:abstractNum w:abstractNumId="2" w15:restartNumberingAfterBreak="0">
+  <w:abstractNum w:abstractNumId="3" w15:restartNumberingAfterBreak="0">
     <w:nsid w:val="1B1F3AE9"/>
     <w:multiLevelType w:val="hybridMultilevel"/>
     <w:tmpl w:val="D10E9598"/>
@@ -2256,7 +3025,156 @@
       </w:pPr>
     </w:lvl>
   </w:abstractNum>
-  <w:abstractNum w:abstractNumId="3" w15:restartNumberingAfterBreak="0">
+  <w:abstractNum w:abstractNumId="4" w15:restartNumberingAfterBreak="0">
+    <w:nsid w:val="31F8360F"/>
+    <w:multiLevelType w:val="multilevel"/>
+    <w:tmpl w:val="375AF8EA"/>
+    <w:lvl w:ilvl="0">
+      <w:start w:val="1"/>
+      <w:numFmt w:val="bullet"/>
+      <w:lvlText w:val=""/>
+      <w:lvlJc w:val="left"/>
+      <w:pPr>
+        <w:tabs>
+          <w:tab w:val="num" w:pos="720"/>
+        </w:tabs>
+        <w:ind w:left="720" w:hanging="360"/>
+      </w:pPr>
+      <w:rPr>
+        <w:rFonts w:ascii="Symbol" w:hAnsi="Symbol" w:hint="default"/>
+        <w:sz w:val="20"/>
+      </w:rPr>
+    </w:lvl>
+    <w:lvl w:ilvl="1" w:tentative="1">
+      <w:start w:val="1"/>
+      <w:numFmt w:val="bullet"/>
+      <w:lvlText w:val="o"/>
+      <w:lvlJc w:val="left"/>
+      <w:pPr>
+        <w:tabs>
+          <w:tab w:val="num" w:pos="1440"/>
+        </w:tabs>
+        <w:ind w:left="1440" w:hanging="360"/>
+      </w:pPr>
+      <w:rPr>
+        <w:rFonts w:ascii="Courier New" w:hAnsi="Courier New" w:hint="default"/>
+        <w:sz w:val="20"/>
+      </w:rPr>
+    </w:lvl>
+    <w:lvl w:ilvl="2" w:tentative="1">
+      <w:start w:val="1"/>
+      <w:numFmt w:val="bullet"/>
+      <w:lvlText w:val=""/>
+      <w:lvlJc w:val="left"/>
+      <w:pPr>
+        <w:tabs>
+          <w:tab w:val="num" w:pos="2160"/>
+        </w:tabs>
+        <w:ind w:left="2160" w:hanging="360"/>
+      </w:pPr>
+      <w:rPr>
+        <w:rFonts w:ascii="Wingdings" w:hAnsi="Wingdings" w:hint="default"/>
+        <w:sz w:val="20"/>
+      </w:rPr>
+    </w:lvl>
+    <w:lvl w:ilvl="3" w:tentative="1">
+      <w:start w:val="1"/>
+      <w:numFmt w:val="bullet"/>
+      <w:lvlText w:val=""/>
+      <w:lvlJc w:val="left"/>
+      <w:pPr>
+        <w:tabs>
+          <w:tab w:val="num" w:pos="2880"/>
+        </w:tabs>
+        <w:ind w:left="2880" w:hanging="360"/>
+      </w:pPr>
+      <w:rPr>
+        <w:rFonts w:ascii="Wingdings" w:hAnsi="Wingdings" w:hint="default"/>
+        <w:sz w:val="20"/>
+      </w:rPr>
+    </w:lvl>
+    <w:lvl w:ilvl="4" w:tentative="1">
+      <w:start w:val="1"/>
+      <w:numFmt w:val="bullet"/>
+      <w:lvlText w:val=""/>
+      <w:lvlJc w:val="left"/>
+      <w:pPr>
+        <w:tabs>
+          <w:tab w:val="num" w:pos="3600"/>
+        </w:tabs>
+        <w:ind w:left="3600" w:hanging="360"/>
+      </w:pPr>
+      <w:rPr>
+        <w:rFonts w:ascii="Wingdings" w:hAnsi="Wingdings" w:hint="default"/>
+        <w:sz w:val="20"/>
+      </w:rPr>
+    </w:lvl>
+    <w:lvl w:ilvl="5" w:tentative="1">
+      <w:start w:val="1"/>
+      <w:numFmt w:val="bullet"/>
+      <w:lvlText w:val=""/>
+      <w:lvlJc w:val="left"/>
+      <w:pPr>
+        <w:tabs>
+          <w:tab w:val="num" w:pos="4320"/>
+        </w:tabs>
+        <w:ind w:left="4320" w:hanging="360"/>
+      </w:pPr>
+      <w:rPr>
+        <w:rFonts w:ascii="Wingdings" w:hAnsi="Wingdings" w:hint="default"/>
+        <w:sz w:val="20"/>
+      </w:rPr>
+    </w:lvl>
+    <w:lvl w:ilvl="6" w:tentative="1">
+      <w:start w:val="1"/>
+      <w:numFmt w:val="bullet"/>
+      <w:lvlText w:val=""/>
+      <w:lvlJc w:val="left"/>
+      <w:pPr>
+        <w:tabs>
+          <w:tab w:val="num" w:pos="5040"/>
+        </w:tabs>
+        <w:ind w:left="5040" w:hanging="360"/>
+      </w:pPr>
+      <w:rPr>
+        <w:rFonts w:ascii="Wingdings" w:hAnsi="Wingdings" w:hint="default"/>
+        <w:sz w:val="20"/>
+      </w:rPr>
+    </w:lvl>
+    <w:lvl w:ilvl="7" w:tentative="1">
+      <w:start w:val="1"/>
+      <w:numFmt w:val="bullet"/>
+      <w:lvlText w:val=""/>
+      <w:lvlJc w:val="left"/>
+      <w:pPr>
+        <w:tabs>
+          <w:tab w:val="num" w:pos="5760"/>
+        </w:tabs>
+        <w:ind w:left="5760" w:hanging="360"/>
+      </w:pPr>
+      <w:rPr>
+        <w:rFonts w:ascii="Wingdings" w:hAnsi="Wingdings" w:hint="default"/>
+        <w:sz w:val="20"/>
+      </w:rPr>
+    </w:lvl>
+    <w:lvl w:ilvl="8" w:tentative="1">
+      <w:start w:val="1"/>
+      <w:numFmt w:val="bullet"/>
+      <w:lvlText w:val=""/>
+      <w:lvlJc w:val="left"/>
+      <w:pPr>
+        <w:tabs>
+          <w:tab w:val="num" w:pos="6480"/>
+        </w:tabs>
+        <w:ind w:left="6480" w:hanging="360"/>
+      </w:pPr>
+      <w:rPr>
+        <w:rFonts w:ascii="Wingdings" w:hAnsi="Wingdings" w:hint="default"/>
+        <w:sz w:val="20"/>
+      </w:rPr>
+    </w:lvl>
+  </w:abstractNum>
+  <w:abstractNum w:abstractNumId="5" w15:restartNumberingAfterBreak="0">
     <w:nsid w:val="35814743"/>
     <w:multiLevelType w:val="multilevel"/>
     <w:tmpl w:val="0C0A001F"/>
@@ -2342,7 +3260,7 @@
       </w:pPr>
     </w:lvl>
   </w:abstractNum>
-  <w:abstractNum w:abstractNumId="4" w15:restartNumberingAfterBreak="0">
+  <w:abstractNum w:abstractNumId="6" w15:restartNumberingAfterBreak="0">
     <w:nsid w:val="36A34642"/>
     <w:multiLevelType w:val="hybridMultilevel"/>
     <w:tmpl w:val="48600288"/>
@@ -2428,7 +3346,7 @@
       </w:pPr>
     </w:lvl>
   </w:abstractNum>
-  <w:abstractNum w:abstractNumId="5" w15:restartNumberingAfterBreak="0">
+  <w:abstractNum w:abstractNumId="7" w15:restartNumberingAfterBreak="0">
     <w:nsid w:val="455E60FF"/>
     <w:multiLevelType w:val="hybridMultilevel"/>
     <w:tmpl w:val="5E648752"/>
@@ -2517,11 +3435,160 @@
       </w:pPr>
     </w:lvl>
   </w:abstractNum>
-  <w:abstractNum w:abstractNumId="6" w15:restartNumberingAfterBreak="0">
+  <w:abstractNum w:abstractNumId="8" w15:restartNumberingAfterBreak="0">
+    <w:nsid w:val="4745673C"/>
+    <w:multiLevelType w:val="multilevel"/>
+    <w:tmpl w:val="832CB3FE"/>
+    <w:lvl w:ilvl="0">
+      <w:start w:val="1"/>
+      <w:numFmt w:val="bullet"/>
+      <w:lvlText w:val=""/>
+      <w:lvlJc w:val="left"/>
+      <w:pPr>
+        <w:tabs>
+          <w:tab w:val="num" w:pos="720"/>
+        </w:tabs>
+        <w:ind w:left="720" w:hanging="360"/>
+      </w:pPr>
+      <w:rPr>
+        <w:rFonts w:ascii="Symbol" w:hAnsi="Symbol" w:hint="default"/>
+        <w:sz w:val="20"/>
+      </w:rPr>
+    </w:lvl>
+    <w:lvl w:ilvl="1" w:tentative="1">
+      <w:start w:val="1"/>
+      <w:numFmt w:val="bullet"/>
+      <w:lvlText w:val="o"/>
+      <w:lvlJc w:val="left"/>
+      <w:pPr>
+        <w:tabs>
+          <w:tab w:val="num" w:pos="1440"/>
+        </w:tabs>
+        <w:ind w:left="1440" w:hanging="360"/>
+      </w:pPr>
+      <w:rPr>
+        <w:rFonts w:ascii="Courier New" w:hAnsi="Courier New" w:hint="default"/>
+        <w:sz w:val="20"/>
+      </w:rPr>
+    </w:lvl>
+    <w:lvl w:ilvl="2" w:tentative="1">
+      <w:start w:val="1"/>
+      <w:numFmt w:val="bullet"/>
+      <w:lvlText w:val=""/>
+      <w:lvlJc w:val="left"/>
+      <w:pPr>
+        <w:tabs>
+          <w:tab w:val="num" w:pos="2160"/>
+        </w:tabs>
+        <w:ind w:left="2160" w:hanging="360"/>
+      </w:pPr>
+      <w:rPr>
+        <w:rFonts w:ascii="Wingdings" w:hAnsi="Wingdings" w:hint="default"/>
+        <w:sz w:val="20"/>
+      </w:rPr>
+    </w:lvl>
+    <w:lvl w:ilvl="3" w:tentative="1">
+      <w:start w:val="1"/>
+      <w:numFmt w:val="bullet"/>
+      <w:lvlText w:val=""/>
+      <w:lvlJc w:val="left"/>
+      <w:pPr>
+        <w:tabs>
+          <w:tab w:val="num" w:pos="2880"/>
+        </w:tabs>
+        <w:ind w:left="2880" w:hanging="360"/>
+      </w:pPr>
+      <w:rPr>
+        <w:rFonts w:ascii="Wingdings" w:hAnsi="Wingdings" w:hint="default"/>
+        <w:sz w:val="20"/>
+      </w:rPr>
+    </w:lvl>
+    <w:lvl w:ilvl="4" w:tentative="1">
+      <w:start w:val="1"/>
+      <w:numFmt w:val="bullet"/>
+      <w:lvlText w:val=""/>
+      <w:lvlJc w:val="left"/>
+      <w:pPr>
+        <w:tabs>
+          <w:tab w:val="num" w:pos="3600"/>
+        </w:tabs>
+        <w:ind w:left="3600" w:hanging="360"/>
+      </w:pPr>
+      <w:rPr>
+        <w:rFonts w:ascii="Wingdings" w:hAnsi="Wingdings" w:hint="default"/>
+        <w:sz w:val="20"/>
+      </w:rPr>
+    </w:lvl>
+    <w:lvl w:ilvl="5" w:tentative="1">
+      <w:start w:val="1"/>
+      <w:numFmt w:val="bullet"/>
+      <w:lvlText w:val=""/>
+      <w:lvlJc w:val="left"/>
+      <w:pPr>
+        <w:tabs>
+          <w:tab w:val="num" w:pos="4320"/>
+        </w:tabs>
+        <w:ind w:left="4320" w:hanging="360"/>
+      </w:pPr>
+      <w:rPr>
+        <w:rFonts w:ascii="Wingdings" w:hAnsi="Wingdings" w:hint="default"/>
+        <w:sz w:val="20"/>
+      </w:rPr>
+    </w:lvl>
+    <w:lvl w:ilvl="6" w:tentative="1">
+      <w:start w:val="1"/>
+      <w:numFmt w:val="bullet"/>
+      <w:lvlText w:val=""/>
+      <w:lvlJc w:val="left"/>
+      <w:pPr>
+        <w:tabs>
+          <w:tab w:val="num" w:pos="5040"/>
+        </w:tabs>
+        <w:ind w:left="5040" w:hanging="360"/>
+      </w:pPr>
+      <w:rPr>
+        <w:rFonts w:ascii="Wingdings" w:hAnsi="Wingdings" w:hint="default"/>
+        <w:sz w:val="20"/>
+      </w:rPr>
+    </w:lvl>
+    <w:lvl w:ilvl="7" w:tentative="1">
+      <w:start w:val="1"/>
+      <w:numFmt w:val="bullet"/>
+      <w:lvlText w:val=""/>
+      <w:lvlJc w:val="left"/>
+      <w:pPr>
+        <w:tabs>
+          <w:tab w:val="num" w:pos="5760"/>
+        </w:tabs>
+        <w:ind w:left="5760" w:hanging="360"/>
+      </w:pPr>
+      <w:rPr>
+        <w:rFonts w:ascii="Wingdings" w:hAnsi="Wingdings" w:hint="default"/>
+        <w:sz w:val="20"/>
+      </w:rPr>
+    </w:lvl>
+    <w:lvl w:ilvl="8" w:tentative="1">
+      <w:start w:val="1"/>
+      <w:numFmt w:val="bullet"/>
+      <w:lvlText w:val=""/>
+      <w:lvlJc w:val="left"/>
+      <w:pPr>
+        <w:tabs>
+          <w:tab w:val="num" w:pos="6480"/>
+        </w:tabs>
+        <w:ind w:left="6480" w:hanging="360"/>
+      </w:pPr>
+      <w:rPr>
+        <w:rFonts w:ascii="Wingdings" w:hAnsi="Wingdings" w:hint="default"/>
+        <w:sz w:val="20"/>
+      </w:rPr>
+    </w:lvl>
+  </w:abstractNum>
+  <w:abstractNum w:abstractNumId="9" w15:restartNumberingAfterBreak="0">
     <w:nsid w:val="5E2A3319"/>
     <w:multiLevelType w:val="hybridMultilevel"/>
-    <w:tmpl w:val="7E20F3A4"/>
-    <w:lvl w:ilvl="0" w:tplc="0C0A000F">
+    <w:tmpl w:val="27DEB948"/>
+    <w:lvl w:ilvl="0" w:tplc="A30C8758">
       <w:start w:val="1"/>
       <w:numFmt w:val="decimal"/>
       <w:lvlText w:val="%1."/>
@@ -2606,7 +3673,7 @@
       </w:pPr>
     </w:lvl>
   </w:abstractNum>
-  <w:abstractNum w:abstractNumId="7" w15:restartNumberingAfterBreak="0">
+  <w:abstractNum w:abstractNumId="10" w15:restartNumberingAfterBreak="0">
     <w:nsid w:val="65246E26"/>
     <w:multiLevelType w:val="hybridMultilevel"/>
     <w:tmpl w:val="F3E4FD30"/>
@@ -2719,7 +3786,7 @@
       </w:rPr>
     </w:lvl>
   </w:abstractNum>
-  <w:abstractNum w:abstractNumId="8" w15:restartNumberingAfterBreak="0">
+  <w:abstractNum w:abstractNumId="11" w15:restartNumberingAfterBreak="0">
     <w:nsid w:val="6C3E4EDE"/>
     <w:multiLevelType w:val="multilevel"/>
     <w:tmpl w:val="0C0A001F"/>
@@ -2805,7 +3872,7 @@
       </w:pPr>
     </w:lvl>
   </w:abstractNum>
-  <w:abstractNum w:abstractNumId="9" w15:restartNumberingAfterBreak="0">
+  <w:abstractNum w:abstractNumId="12" w15:restartNumberingAfterBreak="0">
     <w:nsid w:val="73A13C94"/>
     <w:multiLevelType w:val="multilevel"/>
     <w:tmpl w:val="0C0A001F"/>
@@ -2891,7 +3958,7 @@
       </w:pPr>
     </w:lvl>
   </w:abstractNum>
-  <w:abstractNum w:abstractNumId="10" w15:restartNumberingAfterBreak="0">
+  <w:abstractNum w:abstractNumId="13" w15:restartNumberingAfterBreak="0">
     <w:nsid w:val="7DF8610F"/>
     <w:multiLevelType w:val="hybridMultilevel"/>
     <w:tmpl w:val="87C41088"/>
@@ -2981,178 +4048,187 @@
     </w:lvl>
   </w:abstractNum>
   <w:num w:numId="1" w16cid:durableId="2034067891">
+    <w:abstractNumId w:val="6"/>
+  </w:num>
+  <w:num w:numId="2" w16cid:durableId="858394404">
+    <w:abstractNumId w:val="1"/>
+  </w:num>
+  <w:num w:numId="3" w16cid:durableId="2143302085">
+    <w:abstractNumId w:val="2"/>
+  </w:num>
+  <w:num w:numId="4" w16cid:durableId="328797445">
+    <w:abstractNumId w:val="2"/>
+  </w:num>
+  <w:num w:numId="5" w16cid:durableId="937130264">
+    <w:abstractNumId w:val="2"/>
+  </w:num>
+  <w:num w:numId="6" w16cid:durableId="1637222232">
+    <w:abstractNumId w:val="2"/>
+  </w:num>
+  <w:num w:numId="7" w16cid:durableId="1852185790">
+    <w:abstractNumId w:val="2"/>
+  </w:num>
+  <w:num w:numId="8" w16cid:durableId="1591701034">
+    <w:abstractNumId w:val="2"/>
+  </w:num>
+  <w:num w:numId="9" w16cid:durableId="457725252">
+    <w:abstractNumId w:val="2"/>
+  </w:num>
+  <w:num w:numId="10" w16cid:durableId="1301227990">
+    <w:abstractNumId w:val="2"/>
+  </w:num>
+  <w:num w:numId="11" w16cid:durableId="644045631">
+    <w:abstractNumId w:val="2"/>
+  </w:num>
+  <w:num w:numId="12" w16cid:durableId="1269432323">
+    <w:abstractNumId w:val="2"/>
+  </w:num>
+  <w:num w:numId="13" w16cid:durableId="220822917">
+    <w:abstractNumId w:val="2"/>
+  </w:num>
+  <w:num w:numId="14" w16cid:durableId="1184049671">
+    <w:abstractNumId w:val="2"/>
+  </w:num>
+  <w:num w:numId="15" w16cid:durableId="1686859818">
+    <w:abstractNumId w:val="2"/>
+  </w:num>
+  <w:num w:numId="16" w16cid:durableId="1239636193">
+    <w:abstractNumId w:val="2"/>
+  </w:num>
+  <w:num w:numId="17" w16cid:durableId="1152873571">
+    <w:abstractNumId w:val="2"/>
+  </w:num>
+  <w:num w:numId="18" w16cid:durableId="377894900">
+    <w:abstractNumId w:val="2"/>
+  </w:num>
+  <w:num w:numId="19" w16cid:durableId="939145795">
+    <w:abstractNumId w:val="2"/>
+  </w:num>
+  <w:num w:numId="20" w16cid:durableId="1872379092">
+    <w:abstractNumId w:val="2"/>
+  </w:num>
+  <w:num w:numId="21" w16cid:durableId="1992517146">
+    <w:abstractNumId w:val="2"/>
+  </w:num>
+  <w:num w:numId="22" w16cid:durableId="1004436757">
+    <w:abstractNumId w:val="2"/>
+  </w:num>
+  <w:num w:numId="23" w16cid:durableId="606427502">
+    <w:abstractNumId w:val="2"/>
+  </w:num>
+  <w:num w:numId="24" w16cid:durableId="1063530813">
+    <w:abstractNumId w:val="2"/>
+  </w:num>
+  <w:num w:numId="25" w16cid:durableId="1017465530">
+    <w:abstractNumId w:val="2"/>
+  </w:num>
+  <w:num w:numId="26" w16cid:durableId="1836647609">
+    <w:abstractNumId w:val="2"/>
+  </w:num>
+  <w:num w:numId="27" w16cid:durableId="676275574">
+    <w:abstractNumId w:val="2"/>
+  </w:num>
+  <w:num w:numId="28" w16cid:durableId="1388644420">
+    <w:abstractNumId w:val="2"/>
+  </w:num>
+  <w:num w:numId="29" w16cid:durableId="1468666964">
+    <w:abstractNumId w:val="2"/>
+  </w:num>
+  <w:num w:numId="30" w16cid:durableId="430515839">
+    <w:abstractNumId w:val="2"/>
+  </w:num>
+  <w:num w:numId="31" w16cid:durableId="1098604387">
+    <w:abstractNumId w:val="2"/>
+  </w:num>
+  <w:num w:numId="32" w16cid:durableId="541598745">
+    <w:abstractNumId w:val="2"/>
+  </w:num>
+  <w:num w:numId="33" w16cid:durableId="874734616">
+    <w:abstractNumId w:val="2"/>
+  </w:num>
+  <w:num w:numId="34" w16cid:durableId="1169561325">
+    <w:abstractNumId w:val="2"/>
+  </w:num>
+  <w:num w:numId="35" w16cid:durableId="1464343843">
+    <w:abstractNumId w:val="2"/>
+  </w:num>
+  <w:num w:numId="36" w16cid:durableId="1703438837">
+    <w:abstractNumId w:val="2"/>
+  </w:num>
+  <w:num w:numId="37" w16cid:durableId="284773268">
+    <w:abstractNumId w:val="2"/>
+  </w:num>
+  <w:num w:numId="38" w16cid:durableId="1216504695">
+    <w:abstractNumId w:val="2"/>
+  </w:num>
+  <w:num w:numId="39" w16cid:durableId="302665675">
+    <w:abstractNumId w:val="2"/>
+  </w:num>
+  <w:num w:numId="40" w16cid:durableId="1155995593">
+    <w:abstractNumId w:val="2"/>
+  </w:num>
+  <w:num w:numId="41" w16cid:durableId="1653024233">
+    <w:abstractNumId w:val="2"/>
+  </w:num>
+  <w:num w:numId="42" w16cid:durableId="809714061">
+    <w:abstractNumId w:val="2"/>
+  </w:num>
+  <w:num w:numId="43" w16cid:durableId="1730569668">
+    <w:abstractNumId w:val="2"/>
+  </w:num>
+  <w:num w:numId="44" w16cid:durableId="777868264">
+    <w:abstractNumId w:val="2"/>
+  </w:num>
+  <w:num w:numId="45" w16cid:durableId="1174029237">
+    <w:abstractNumId w:val="2"/>
+  </w:num>
+  <w:num w:numId="46" w16cid:durableId="314379998">
+    <w:abstractNumId w:val="2"/>
+  </w:num>
+  <w:num w:numId="47" w16cid:durableId="1686789047">
+    <w:abstractNumId w:val="2"/>
+  </w:num>
+  <w:num w:numId="48" w16cid:durableId="967053150">
+    <w:abstractNumId w:val="2"/>
+  </w:num>
+  <w:num w:numId="49" w16cid:durableId="1592664610">
+    <w:abstractNumId w:val="2"/>
+  </w:num>
+  <w:num w:numId="50" w16cid:durableId="1715084563">
+    <w:abstractNumId w:val="2"/>
+  </w:num>
+  <w:num w:numId="51" w16cid:durableId="483468886">
+    <w:abstractNumId w:val="10"/>
+  </w:num>
+  <w:num w:numId="52" w16cid:durableId="1842312576">
+    <w:abstractNumId w:val="12"/>
+  </w:num>
+  <w:num w:numId="53" w16cid:durableId="1965307783">
+    <w:abstractNumId w:val="11"/>
+  </w:num>
+  <w:num w:numId="54" w16cid:durableId="1224367675">
+    <w:abstractNumId w:val="5"/>
+  </w:num>
+  <w:num w:numId="55" w16cid:durableId="1249845438">
+    <w:abstractNumId w:val="9"/>
+  </w:num>
+  <w:num w:numId="56" w16cid:durableId="294992634">
+    <w:abstractNumId w:val="13"/>
+  </w:num>
+  <w:num w:numId="57" w16cid:durableId="456988854">
+    <w:abstractNumId w:val="7"/>
+  </w:num>
+  <w:num w:numId="58" w16cid:durableId="280889026">
+    <w:abstractNumId w:val="3"/>
+  </w:num>
+  <w:num w:numId="59" w16cid:durableId="1898322868">
     <w:abstractNumId w:val="4"/>
   </w:num>
-  <w:num w:numId="2" w16cid:durableId="858394404">
+  <w:num w:numId="60" w16cid:durableId="1477337626">
     <w:abstractNumId w:val="0"/>
   </w:num>
-  <w:num w:numId="3" w16cid:durableId="2143302085">
-    <w:abstractNumId w:val="1"/>
-  </w:num>
-  <w:num w:numId="4" w16cid:durableId="328797445">
-    <w:abstractNumId w:val="1"/>
-  </w:num>
-  <w:num w:numId="5" w16cid:durableId="937130264">
-    <w:abstractNumId w:val="1"/>
-  </w:num>
-  <w:num w:numId="6" w16cid:durableId="1637222232">
-    <w:abstractNumId w:val="1"/>
-  </w:num>
-  <w:num w:numId="7" w16cid:durableId="1852185790">
-    <w:abstractNumId w:val="1"/>
-  </w:num>
-  <w:num w:numId="8" w16cid:durableId="1591701034">
-    <w:abstractNumId w:val="1"/>
-  </w:num>
-  <w:num w:numId="9" w16cid:durableId="457725252">
-    <w:abstractNumId w:val="1"/>
-  </w:num>
-  <w:num w:numId="10" w16cid:durableId="1301227990">
-    <w:abstractNumId w:val="1"/>
-  </w:num>
-  <w:num w:numId="11" w16cid:durableId="644045631">
-    <w:abstractNumId w:val="1"/>
-  </w:num>
-  <w:num w:numId="12" w16cid:durableId="1269432323">
-    <w:abstractNumId w:val="1"/>
-  </w:num>
-  <w:num w:numId="13" w16cid:durableId="220822917">
-    <w:abstractNumId w:val="1"/>
-  </w:num>
-  <w:num w:numId="14" w16cid:durableId="1184049671">
-    <w:abstractNumId w:val="1"/>
-  </w:num>
-  <w:num w:numId="15" w16cid:durableId="1686859818">
-    <w:abstractNumId w:val="1"/>
-  </w:num>
-  <w:num w:numId="16" w16cid:durableId="1239636193">
-    <w:abstractNumId w:val="1"/>
-  </w:num>
-  <w:num w:numId="17" w16cid:durableId="1152873571">
-    <w:abstractNumId w:val="1"/>
-  </w:num>
-  <w:num w:numId="18" w16cid:durableId="377894900">
-    <w:abstractNumId w:val="1"/>
-  </w:num>
-  <w:num w:numId="19" w16cid:durableId="939145795">
-    <w:abstractNumId w:val="1"/>
-  </w:num>
-  <w:num w:numId="20" w16cid:durableId="1872379092">
-    <w:abstractNumId w:val="1"/>
-  </w:num>
-  <w:num w:numId="21" w16cid:durableId="1992517146">
-    <w:abstractNumId w:val="1"/>
-  </w:num>
-  <w:num w:numId="22" w16cid:durableId="1004436757">
-    <w:abstractNumId w:val="1"/>
-  </w:num>
-  <w:num w:numId="23" w16cid:durableId="606427502">
-    <w:abstractNumId w:val="1"/>
-  </w:num>
-  <w:num w:numId="24" w16cid:durableId="1063530813">
-    <w:abstractNumId w:val="1"/>
-  </w:num>
-  <w:num w:numId="25" w16cid:durableId="1017465530">
-    <w:abstractNumId w:val="1"/>
-  </w:num>
-  <w:num w:numId="26" w16cid:durableId="1836647609">
-    <w:abstractNumId w:val="1"/>
-  </w:num>
-  <w:num w:numId="27" w16cid:durableId="676275574">
-    <w:abstractNumId w:val="1"/>
-  </w:num>
-  <w:num w:numId="28" w16cid:durableId="1388644420">
-    <w:abstractNumId w:val="1"/>
-  </w:num>
-  <w:num w:numId="29" w16cid:durableId="1468666964">
-    <w:abstractNumId w:val="1"/>
-  </w:num>
-  <w:num w:numId="30" w16cid:durableId="430515839">
-    <w:abstractNumId w:val="1"/>
-  </w:num>
-  <w:num w:numId="31" w16cid:durableId="1098604387">
-    <w:abstractNumId w:val="1"/>
-  </w:num>
-  <w:num w:numId="32" w16cid:durableId="541598745">
-    <w:abstractNumId w:val="1"/>
-  </w:num>
-  <w:num w:numId="33" w16cid:durableId="874734616">
-    <w:abstractNumId w:val="1"/>
-  </w:num>
-  <w:num w:numId="34" w16cid:durableId="1169561325">
-    <w:abstractNumId w:val="1"/>
-  </w:num>
-  <w:num w:numId="35" w16cid:durableId="1464343843">
-    <w:abstractNumId w:val="1"/>
-  </w:num>
-  <w:num w:numId="36" w16cid:durableId="1703438837">
-    <w:abstractNumId w:val="1"/>
-  </w:num>
-  <w:num w:numId="37" w16cid:durableId="284773268">
-    <w:abstractNumId w:val="1"/>
-  </w:num>
-  <w:num w:numId="38" w16cid:durableId="1216504695">
-    <w:abstractNumId w:val="1"/>
-  </w:num>
-  <w:num w:numId="39" w16cid:durableId="302665675">
-    <w:abstractNumId w:val="1"/>
-  </w:num>
-  <w:num w:numId="40" w16cid:durableId="1155995593">
-    <w:abstractNumId w:val="1"/>
-  </w:num>
-  <w:num w:numId="41" w16cid:durableId="1653024233">
-    <w:abstractNumId w:val="1"/>
-  </w:num>
-  <w:num w:numId="42" w16cid:durableId="809714061">
-    <w:abstractNumId w:val="1"/>
-  </w:num>
-  <w:num w:numId="43" w16cid:durableId="1730569668">
-    <w:abstractNumId w:val="1"/>
-  </w:num>
-  <w:num w:numId="44" w16cid:durableId="777868264">
-    <w:abstractNumId w:val="1"/>
-  </w:num>
-  <w:num w:numId="45" w16cid:durableId="1174029237">
-    <w:abstractNumId w:val="1"/>
-  </w:num>
-  <w:num w:numId="46" w16cid:durableId="314379998">
-    <w:abstractNumId w:val="1"/>
-  </w:num>
-  <w:num w:numId="47" w16cid:durableId="1686789047">
-    <w:abstractNumId w:val="1"/>
-  </w:num>
-  <w:num w:numId="48" w16cid:durableId="967053150">
-    <w:abstractNumId w:val="1"/>
-  </w:num>
-  <w:num w:numId="49" w16cid:durableId="1592664610">
-    <w:abstractNumId w:val="1"/>
-  </w:num>
-  <w:num w:numId="50" w16cid:durableId="1715084563">
-    <w:abstractNumId w:val="1"/>
-  </w:num>
-  <w:num w:numId="51" w16cid:durableId="483468886">
-    <w:abstractNumId w:val="7"/>
-  </w:num>
-  <w:num w:numId="52" w16cid:durableId="1842312576">
-    <w:abstractNumId w:val="9"/>
-  </w:num>
-  <w:num w:numId="53" w16cid:durableId="1965307783">
+  <w:num w:numId="61" w16cid:durableId="1602641407">
     <w:abstractNumId w:val="8"/>
-  </w:num>
-  <w:num w:numId="54" w16cid:durableId="1224367675">
-    <w:abstractNumId w:val="3"/>
-  </w:num>
-  <w:num w:numId="55" w16cid:durableId="1249845438">
-    <w:abstractNumId w:val="6"/>
-  </w:num>
-  <w:num w:numId="56" w16cid:durableId="294992634">
-    <w:abstractNumId w:val="10"/>
-  </w:num>
-  <w:num w:numId="57" w16cid:durableId="456988854">
-    <w:abstractNumId w:val="5"/>
-  </w:num>
-  <w:num w:numId="58" w16cid:durableId="280889026">
-    <w:abstractNumId w:val="2"/>
   </w:num>
 </w:numbering>
 </file>
@@ -3593,7 +4669,6 @@
     <w:next w:val="Normal"/>
     <w:link w:val="Ttulo2Car"/>
     <w:uiPriority w:val="9"/>
-    <w:semiHidden/>
     <w:unhideWhenUsed/>
     <w:qFormat/>
     <w:rsid w:val="00782010"/>
@@ -3810,7 +4885,6 @@
   <w:style w:type="character" w:default="1" w:styleId="Fuentedeprrafopredeter">
     <w:name w:val="Default Paragraph Font"/>
     <w:uiPriority w:val="1"/>
-    <w:semiHidden/>
     <w:unhideWhenUsed/>
   </w:style>
   <w:style w:type="table" w:default="1" w:styleId="Tablanormal">
@@ -3855,7 +4929,6 @@
     <w:basedOn w:val="Fuentedeprrafopredeter"/>
     <w:link w:val="Ttulo2"/>
     <w:uiPriority w:val="9"/>
-    <w:semiHidden/>
     <w:rsid w:val="00782010"/>
     <w:rPr>
       <w:rFonts w:asciiTheme="majorHAnsi" w:eastAsiaTheme="majorEastAsia" w:hAnsiTheme="majorHAnsi" w:cstheme="majorBidi"/>

</xml_diff>